<commit_message>
Change COMAP icon from medal to trophy
</commit_message>
<xml_diff>
--- a/file/CV_CN_all.docx
+++ b/file/CV_CN_all.docx
@@ -103,6 +103,20 @@
       </w:pPr>
       <w:r>
         <w:rPr>
+          <w:rFonts w:hint="eastAsia" w:ascii="Times New Roman" w:hAnsi="Times New Roman" w:eastAsia="楷体" w:cs="Times New Roman"/>
+          <w:b/>
+          <w:bCs/>
+          <w:color w:val="auto"/>
+          <w:spacing w:val="-3"/>
+          <w:kern w:val="4"/>
+          <w:sz w:val="21"/>
+          <w:szCs w:val="21"/>
+          <w:lang w:val="en-US" w:eastAsia="zh-CN" w:bidi="ar-SA"/>
+        </w:rPr>
+        <w:t>Phone:</w:t>
+      </w:r>
+      <w:r>
+        <w:rPr>
           <w:rFonts w:hint="eastAsia" w:eastAsia="华文中宋" w:cs="华文中宋" w:asciiTheme="minorAscii" w:hAnsiTheme="minorAscii"/>
           <w:b/>
           <w:bCs/>
@@ -110,7 +124,7 @@
           <w:szCs w:val="21"/>
           <w:lang w:val="en-US" w:eastAsia="zh-CN"/>
         </w:rPr>
-        <w:t>Phone: 133-3379-7128</w:t>
+        <w:t xml:space="preserve"> 133-3379-7128</w:t>
       </w:r>
       <w:r>
         <w:rPr>
@@ -130,7 +144,32 @@
           <w:szCs w:val="21"/>
           <w:lang w:val="en-US" w:eastAsia="zh-CN"/>
         </w:rPr>
-        <w:t xml:space="preserve"> Email: </w:t>
+        <w:t xml:space="preserve"> </w:t>
+      </w:r>
+      <w:r>
+        <w:rPr>
+          <w:rFonts w:hint="default" w:ascii="Times New Roman" w:hAnsi="Times New Roman" w:eastAsia="楷体" w:cs="Times New Roman"/>
+          <w:b/>
+          <w:bCs/>
+          <w:color w:val="auto"/>
+          <w:spacing w:val="-3"/>
+          <w:kern w:val="4"/>
+          <w:sz w:val="21"/>
+          <w:szCs w:val="21"/>
+          <w:lang w:val="en-US" w:eastAsia="zh-CN" w:bidi="ar-SA"/>
+        </w:rPr>
+        <w:t>Email:</w:t>
+      </w:r>
+      <w:r>
+        <w:rPr>
+          <w:rFonts w:hint="default" w:eastAsia="华文中宋" w:cs="华文中宋" w:asciiTheme="minorAscii" w:hAnsiTheme="minorAscii"/>
+          <w:b/>
+          <w:bCs/>
+          <w:sz w:val="21"/>
+          <w:szCs w:val="21"/>
+          <w:lang w:val="en-US" w:eastAsia="zh-CN"/>
+        </w:rPr>
+        <w:t xml:space="preserve"> </w:t>
       </w:r>
       <w:r>
         <w:rPr>
@@ -199,68 +238,80 @@
       </w:r>
       <w:r>
         <w:rPr>
-          <w:rFonts w:hint="eastAsia" w:eastAsia="华文中宋" w:cs="华文中宋" w:asciiTheme="minorAscii" w:hAnsiTheme="minorAscii"/>
-          <w:b/>
-          <w:bCs/>
-          <w:sz w:val="21"/>
-          <w:szCs w:val="21"/>
-          <w:lang w:val="en-US" w:eastAsia="zh-CN"/>
+          <w:rFonts w:hint="eastAsia" w:ascii="Times New Roman" w:hAnsi="Times New Roman" w:eastAsia="楷体" w:cs="Times New Roman"/>
+          <w:b/>
+          <w:bCs/>
+          <w:color w:val="auto"/>
+          <w:spacing w:val="-3"/>
+          <w:kern w:val="4"/>
+          <w:sz w:val="21"/>
+          <w:szCs w:val="21"/>
+          <w:lang w:val="en-US" w:eastAsia="zh-CN" w:bidi="ar-SA"/>
         </w:rPr>
         <w:t xml:space="preserve">website: </w:t>
       </w:r>
       <w:r>
         <w:rPr>
-          <w:rFonts w:hint="eastAsia" w:eastAsia="华文中宋" w:cs="华文中宋" w:asciiTheme="minorAscii" w:hAnsiTheme="minorAscii"/>
-          <w:b w:val="0"/>
-          <w:bCs w:val="0"/>
-          <w:sz w:val="21"/>
-          <w:szCs w:val="21"/>
-          <w:lang w:val="en-US" w:eastAsia="zh-CN"/>
+          <w:rStyle w:val="12"/>
+          <w:rFonts w:hint="eastAsia" w:ascii="Times New Roman" w:hAnsi="Times New Roman" w:eastAsia="楷体" w:cs="Times New Roman"/>
+          <w:b w:val="0"/>
+          <w:bCs w:val="0"/>
+          <w:w w:val="105"/>
+          <w:sz w:val="21"/>
+          <w:szCs w:val="21"/>
+          <w:lang w:val="en-US" w:eastAsia="zh-CN" w:bidi="ar-SA"/>
         </w:rPr>
         <w:fldChar w:fldCharType="begin"/>
       </w:r>
       <w:r>
         <w:rPr>
-          <w:rFonts w:hint="eastAsia" w:eastAsia="华文中宋" w:cs="华文中宋" w:asciiTheme="minorAscii" w:hAnsiTheme="minorAscii"/>
-          <w:b w:val="0"/>
-          <w:bCs w:val="0"/>
-          <w:sz w:val="21"/>
-          <w:szCs w:val="21"/>
-          <w:lang w:val="en-US" w:eastAsia="zh-CN"/>
+          <w:rStyle w:val="12"/>
+          <w:rFonts w:hint="eastAsia" w:ascii="Times New Roman" w:hAnsi="Times New Roman" w:eastAsia="楷体" w:cs="Times New Roman"/>
+          <w:b w:val="0"/>
+          <w:bCs w:val="0"/>
+          <w:w w:val="105"/>
+          <w:sz w:val="21"/>
+          <w:szCs w:val="21"/>
+          <w:lang w:val="en-US" w:eastAsia="zh-CN" w:bidi="ar-SA"/>
         </w:rPr>
         <w:instrText xml:space="preserve"> HYPERLINK "https://tassel51.github.io" </w:instrText>
       </w:r>
       <w:r>
         <w:rPr>
-          <w:rFonts w:hint="eastAsia" w:eastAsia="华文中宋" w:cs="华文中宋" w:asciiTheme="minorAscii" w:hAnsiTheme="minorAscii"/>
-          <w:b w:val="0"/>
-          <w:bCs w:val="0"/>
-          <w:sz w:val="21"/>
-          <w:szCs w:val="21"/>
-          <w:lang w:val="en-US" w:eastAsia="zh-CN"/>
+          <w:rStyle w:val="12"/>
+          <w:rFonts w:hint="eastAsia" w:ascii="Times New Roman" w:hAnsi="Times New Roman" w:eastAsia="楷体" w:cs="Times New Roman"/>
+          <w:b w:val="0"/>
+          <w:bCs w:val="0"/>
+          <w:w w:val="105"/>
+          <w:sz w:val="21"/>
+          <w:szCs w:val="21"/>
+          <w:lang w:val="en-US" w:eastAsia="zh-CN" w:bidi="ar-SA"/>
         </w:rPr>
         <w:fldChar w:fldCharType="separate"/>
       </w:r>
       <w:r>
         <w:rPr>
           <w:rStyle w:val="10"/>
-          <w:rFonts w:hint="eastAsia" w:eastAsia="华文中宋" w:cs="华文中宋" w:asciiTheme="minorAscii" w:hAnsiTheme="minorAscii"/>
-          <w:b w:val="0"/>
-          <w:bCs w:val="0"/>
-          <w:sz w:val="21"/>
-          <w:szCs w:val="21"/>
-          <w:lang w:val="en-US" w:eastAsia="zh-CN"/>
+          <w:rFonts w:hint="eastAsia" w:ascii="Times New Roman" w:hAnsi="Times New Roman" w:eastAsia="楷体" w:cs="Times New Roman"/>
+          <w:b w:val="0"/>
+          <w:bCs w:val="0"/>
+          <w:w w:val="105"/>
+          <w:sz w:val="21"/>
+          <w:szCs w:val="21"/>
+          <w:lang w:val="en-US" w:eastAsia="zh-CN" w:bidi="ar-SA"/>
         </w:rPr>
         <w:t>https://tassel51.github.io</w:t>
       </w:r>
       <w:r>
         <w:rPr>
-          <w:rFonts w:hint="eastAsia" w:eastAsia="华文中宋" w:cs="华文中宋" w:asciiTheme="minorAscii" w:hAnsiTheme="minorAscii"/>
-          <w:b w:val="0"/>
-          <w:bCs w:val="0"/>
-          <w:sz w:val="21"/>
-          <w:szCs w:val="21"/>
-          <w:lang w:val="en-US" w:eastAsia="zh-CN"/>
+          <w:rStyle w:val="12"/>
+          <w:rFonts w:hint="eastAsia" w:ascii="Times New Roman" w:hAnsi="Times New Roman" w:eastAsia="楷体" w:cs="Times New Roman"/>
+          <w:b w:val="0"/>
+          <w:bCs w:val="0"/>
+          <w:w w:val="105"/>
+          <w:sz w:val="21"/>
+          <w:szCs w:val="21"/>
+          <w:lang w:val="en-US" w:eastAsia="zh-CN" w:bidi="ar-SA"/>
         </w:rPr>
         <w:fldChar w:fldCharType="end"/>
       </w:r>
@@ -284,6 +335,20 @@
       </w:pPr>
       <w:r>
         <w:rPr>
+          <w:rFonts w:hint="eastAsia" w:ascii="Times New Roman" w:hAnsi="Times New Roman" w:eastAsia="楷体" w:cs="Times New Roman"/>
+          <w:b w:val="0"/>
+          <w:bCs w:val="0"/>
+          <w:color w:val="auto"/>
+          <w:spacing w:val="-3"/>
+          <w:kern w:val="4"/>
+          <w:sz w:val="21"/>
+          <w:szCs w:val="21"/>
+          <w:lang w:val="en-US" w:eastAsia="zh-CN" w:bidi="ar-SA"/>
+        </w:rPr>
+        <w:t>21</w:t>
+      </w:r>
+      <w:r>
+        <w:rPr>
           <w:rFonts w:hint="eastAsia" w:ascii="Times New Roman" w:hAnsi="Times New Roman" w:eastAsia="楷体"/>
           <w:color w:val="auto"/>
           <w:w w:val="105"/>
@@ -291,7 +356,18 @@
           <w:szCs w:val="21"/>
           <w:lang w:eastAsia="zh-CN"/>
         </w:rPr>
-        <w:t>2</w:t>
+        <w:t>岁 |</w:t>
+      </w:r>
+      <w:r>
+        <w:rPr>
+          <w:rFonts w:ascii="Times New Roman" w:hAnsi="Times New Roman" w:eastAsia="楷体"/>
+          <w:color w:val="auto"/>
+          <w:w w:val="105"/>
+          <w:sz w:val="21"/>
+          <w:szCs w:val="21"/>
+          <w:lang w:eastAsia="zh-CN"/>
+        </w:rPr>
+        <w:t xml:space="preserve"> </w:t>
       </w:r>
       <w:r>
         <w:rPr>
@@ -300,9 +376,9 @@
           <w:w w:val="105"/>
           <w:sz w:val="21"/>
           <w:szCs w:val="21"/>
-          <w:lang w:val="en-US" w:eastAsia="zh-CN"/>
-        </w:rPr>
-        <w:t>0</w:t>
+          <w:lang w:eastAsia="zh-CN"/>
+        </w:rPr>
+        <w:t>中共</w:t>
       </w:r>
       <w:r>
         <w:rPr>
@@ -311,9 +387,20 @@
           <w:w w:val="105"/>
           <w:sz w:val="21"/>
           <w:szCs w:val="21"/>
+          <w:lang w:val="en-US" w:eastAsia="zh-CN"/>
+        </w:rPr>
+        <w:t>预备</w:t>
+      </w:r>
+      <w:r>
+        <w:rPr>
+          <w:rFonts w:hint="eastAsia" w:ascii="Times New Roman" w:hAnsi="Times New Roman" w:eastAsia="楷体"/>
+          <w:color w:val="auto"/>
+          <w:w w:val="105"/>
+          <w:sz w:val="21"/>
+          <w:szCs w:val="21"/>
           <w:lang w:eastAsia="zh-CN"/>
         </w:rPr>
-        <w:t>岁 |</w:t>
+        <w:t>党员 |</w:t>
       </w:r>
       <w:r>
         <w:rPr>
@@ -328,59 +415,43 @@
       </w:r>
       <w:r>
         <w:rPr>
+          <w:rFonts w:hint="eastAsia" w:ascii="Times New Roman" w:hAnsi="Times New Roman" w:eastAsia="楷体" w:cs="Times New Roman"/>
+          <w:b w:val="0"/>
+          <w:bCs w:val="0"/>
+          <w:color w:val="auto"/>
+          <w:spacing w:val="-3"/>
+          <w:kern w:val="4"/>
+          <w:sz w:val="21"/>
+          <w:szCs w:val="21"/>
+          <w:lang w:val="en-US" w:eastAsia="zh-CN" w:bidi="ar-SA"/>
+        </w:rPr>
+        <w:t>202</w:t>
+      </w:r>
+      <w:bookmarkStart w:id="0" w:name="OLE_LINK20"/>
+      <w:r>
+        <w:rPr>
+          <w:rFonts w:hint="eastAsia" w:ascii="Times New Roman" w:hAnsi="Times New Roman" w:eastAsia="楷体" w:cs="Times New Roman"/>
+          <w:b w:val="0"/>
+          <w:bCs w:val="0"/>
+          <w:color w:val="auto"/>
+          <w:spacing w:val="-3"/>
+          <w:kern w:val="4"/>
+          <w:sz w:val="21"/>
+          <w:szCs w:val="21"/>
+          <w:lang w:val="en-US" w:eastAsia="zh-CN" w:bidi="ar-SA"/>
+        </w:rPr>
+        <w:t>3</w:t>
+      </w:r>
+      <w:r>
+        <w:rPr>
           <w:rFonts w:hint="eastAsia" w:ascii="Times New Roman" w:hAnsi="Times New Roman" w:eastAsia="楷体"/>
           <w:color w:val="auto"/>
           <w:w w:val="105"/>
           <w:sz w:val="21"/>
           <w:szCs w:val="21"/>
-          <w:lang w:eastAsia="zh-CN"/>
-        </w:rPr>
-        <w:t>中共</w:t>
-      </w:r>
-      <w:r>
-        <w:rPr>
-          <w:rFonts w:hint="eastAsia" w:ascii="Times New Roman" w:hAnsi="Times New Roman" w:eastAsia="楷体"/>
-          <w:color w:val="auto"/>
-          <w:w w:val="105"/>
-          <w:sz w:val="21"/>
-          <w:szCs w:val="21"/>
-          <w:lang w:val="en-US" w:eastAsia="zh-CN"/>
-        </w:rPr>
-        <w:t>预备</w:t>
-      </w:r>
-      <w:r>
-        <w:rPr>
-          <w:rFonts w:hint="eastAsia" w:ascii="Times New Roman" w:hAnsi="Times New Roman" w:eastAsia="楷体"/>
-          <w:color w:val="auto"/>
-          <w:w w:val="105"/>
-          <w:sz w:val="21"/>
-          <w:szCs w:val="21"/>
-          <w:lang w:eastAsia="zh-CN"/>
-        </w:rPr>
-        <w:t>党员 |</w:t>
-      </w:r>
-      <w:r>
-        <w:rPr>
-          <w:rFonts w:ascii="Times New Roman" w:hAnsi="Times New Roman" w:eastAsia="楷体"/>
-          <w:color w:val="auto"/>
-          <w:w w:val="105"/>
-          <w:sz w:val="21"/>
-          <w:szCs w:val="21"/>
-          <w:lang w:eastAsia="zh-CN"/>
-        </w:rPr>
-        <w:t xml:space="preserve"> 202</w:t>
-      </w:r>
-      <w:bookmarkStart w:id="0" w:name="OLE_LINK20"/>
-      <w:r>
-        <w:rPr>
-          <w:rFonts w:hint="eastAsia" w:ascii="Times New Roman" w:hAnsi="Times New Roman" w:eastAsia="楷体"/>
-          <w:color w:val="auto"/>
-          <w:w w:val="105"/>
-          <w:sz w:val="21"/>
-          <w:szCs w:val="21"/>
-          <w:lang w:val="en-US" w:eastAsia="zh-CN"/>
-        </w:rPr>
-        <w:t>3级本科</w:t>
+          <w:lang w:val="en-US" w:eastAsia="zh-CN"/>
+        </w:rPr>
+        <w:t>级本科</w:t>
       </w:r>
       <w:r>
         <w:rPr>
@@ -697,7 +768,7 @@
       </w:pPr>
       <w:r>
         <w:rPr>
-          <w:rFonts w:hint="eastAsia" w:ascii="楷体" w:hAnsi="楷体" w:eastAsia="楷体" w:cs="楷体"/>
+          <w:rFonts w:hint="eastAsia" w:ascii="Times New Roman" w:hAnsi="Times New Roman" w:eastAsia="楷体" w:cs="Times New Roman"/>
           <w:b/>
           <w:bCs/>
           <w:color w:val="auto"/>
@@ -722,23 +793,27 @@
       </w:r>
       <w:r>
         <w:rPr>
+          <w:rFonts w:hint="eastAsia" w:ascii="Times New Roman" w:hAnsi="Times New Roman" w:eastAsia="楷体" w:cs="Times New Roman"/>
+          <w:b w:val="0"/>
+          <w:bCs w:val="0"/>
+          <w:color w:val="auto"/>
+          <w:spacing w:val="-3"/>
+          <w:kern w:val="4"/>
+          <w:sz w:val="21"/>
+          <w:szCs w:val="21"/>
+          <w:lang w:val="en-US" w:eastAsia="zh-CN" w:bidi="ar-SA"/>
+        </w:rPr>
+        <w:t xml:space="preserve">3.967 / 5 </w:t>
+      </w:r>
+      <w:r>
+        <w:rPr>
           <w:rFonts w:hint="eastAsia" w:ascii="Times New Roman" w:hAnsi="Times New Roman" w:eastAsia="楷体"/>
           <w:color w:val="auto"/>
           <w:sz w:val="21"/>
           <w:szCs w:val="21"/>
           <w:lang w:val="en-US" w:eastAsia="zh-CN"/>
         </w:rPr>
-        <w:t xml:space="preserve">3.94 </w:t>
-      </w:r>
-      <w:r>
-        <w:rPr>
-          <w:rFonts w:ascii="Times New Roman" w:hAnsi="Times New Roman" w:eastAsia="楷体"/>
-          <w:color w:val="auto"/>
-          <w:sz w:val="21"/>
-          <w:szCs w:val="21"/>
-          <w:lang w:eastAsia="zh-CN"/>
-        </w:rPr>
-        <w:t>/</w:t>
+        <w:tab/>
       </w:r>
       <w:r>
         <w:rPr>
@@ -748,17 +823,35 @@
           <w:szCs w:val="21"/>
           <w:lang w:val="en-US" w:eastAsia="zh-CN"/>
         </w:rPr>
-        <w:t xml:space="preserve"> </w:t>
-      </w:r>
-      <w:r>
-        <w:rPr>
-          <w:rFonts w:ascii="Times New Roman" w:hAnsi="Times New Roman" w:eastAsia="楷体"/>
-          <w:color w:val="auto"/>
-          <w:sz w:val="21"/>
-          <w:szCs w:val="21"/>
-          <w:lang w:eastAsia="zh-CN"/>
-        </w:rPr>
-        <w:t>5</w:t>
+        <w:t xml:space="preserve">              </w:t>
+      </w:r>
+      <w:r>
+        <w:rPr>
+          <w:rFonts w:hint="eastAsia" w:ascii="楷体" w:hAnsi="楷体" w:eastAsia="楷体" w:cs="楷体"/>
+          <w:b/>
+          <w:bCs/>
+          <w:color w:val="auto"/>
+          <w:spacing w:val="-3"/>
+          <w:kern w:val="4"/>
+          <w:sz w:val="21"/>
+          <w:szCs w:val="21"/>
+          <w:lang w:val="en-US" w:eastAsia="zh-CN" w:bidi="ar-SA"/>
+        </w:rPr>
+        <w:t>专业排名：</w:t>
+      </w:r>
+      <w:r>
+        <w:rPr>
+          <w:rFonts w:hint="eastAsia" w:ascii="Times New Roman" w:hAnsi="Times New Roman" w:eastAsia="楷体" w:cs="Times New Roman"/>
+          <w:b w:val="0"/>
+          <w:bCs w:val="0"/>
+          <w:color w:val="auto"/>
+          <w:spacing w:val="-3"/>
+          <w:kern w:val="4"/>
+          <w:sz w:val="21"/>
+          <w:szCs w:val="21"/>
+          <w:lang w:val="en-US" w:eastAsia="zh-CN" w:bidi="ar-SA"/>
+        </w:rPr>
+        <w:t>5 / 86  (5.81%)</w:t>
       </w:r>
       <w:r>
         <w:rPr>
@@ -768,7 +861,7 @@
           <w:szCs w:val="21"/>
           <w:lang w:val="en-US" w:eastAsia="zh-CN"/>
         </w:rPr>
-        <w:t xml:space="preserve"> </w:t>
+        <w:tab/>
       </w:r>
       <w:r>
         <w:rPr>
@@ -788,78 +881,49 @@
           <w:szCs w:val="21"/>
           <w:lang w:val="en-US" w:eastAsia="zh-CN"/>
         </w:rPr>
-        <w:t xml:space="preserve">              </w:t>
-      </w:r>
-      <w:r>
-        <w:rPr>
-          <w:rFonts w:hint="eastAsia" w:ascii="楷体" w:hAnsi="楷体" w:eastAsia="楷体" w:cs="楷体"/>
-          <w:b/>
-          <w:bCs/>
-          <w:color w:val="auto"/>
-          <w:spacing w:val="-3"/>
-          <w:kern w:val="4"/>
-          <w:sz w:val="21"/>
-          <w:szCs w:val="21"/>
-          <w:lang w:val="en-US" w:eastAsia="zh-CN" w:bidi="ar-SA"/>
-        </w:rPr>
-        <w:t>专业排名：</w:t>
-      </w:r>
-      <w:r>
-        <w:rPr>
-          <w:rFonts w:hint="eastAsia" w:ascii="Times New Roman" w:hAnsi="Times New Roman" w:eastAsia="楷体"/>
-          <w:color w:val="auto"/>
-          <w:sz w:val="21"/>
-          <w:szCs w:val="21"/>
-          <w:lang w:val="en-US" w:eastAsia="zh-CN"/>
-        </w:rPr>
-        <w:t>5 / 86  (5.81%)</w:t>
-      </w:r>
-      <w:r>
-        <w:rPr>
-          <w:rFonts w:hint="eastAsia" w:ascii="Times New Roman" w:hAnsi="Times New Roman" w:eastAsia="楷体"/>
-          <w:color w:val="auto"/>
-          <w:sz w:val="21"/>
-          <w:szCs w:val="21"/>
-          <w:lang w:val="en-US" w:eastAsia="zh-CN"/>
-        </w:rPr>
-        <w:tab/>
-      </w:r>
-      <w:r>
-        <w:rPr>
-          <w:rFonts w:hint="eastAsia" w:ascii="Times New Roman" w:hAnsi="Times New Roman" w:eastAsia="楷体"/>
-          <w:color w:val="auto"/>
-          <w:sz w:val="21"/>
-          <w:szCs w:val="21"/>
-          <w:lang w:val="en-US" w:eastAsia="zh-CN"/>
-        </w:rPr>
-        <w:tab/>
-        <w:t xml:space="preserve"> </w:t>
-      </w:r>
-      <w:bookmarkStart w:id="2" w:name="_GoBack"/>
-      <w:bookmarkEnd w:id="2"/>
-      <w:r>
-        <w:rPr>
-          <w:rFonts w:hint="eastAsia" w:ascii="Times New Roman" w:hAnsi="Times New Roman" w:eastAsia="楷体"/>
-          <w:color w:val="auto"/>
-          <w:sz w:val="21"/>
-          <w:szCs w:val="21"/>
-          <w:lang w:val="en-US" w:eastAsia="zh-CN"/>
-        </w:rPr>
-        <w:t xml:space="preserve">      </w:t>
-      </w:r>
-      <w:r>
-        <w:rPr>
-          <w:rFonts w:hint="eastAsia" w:ascii="楷体" w:hAnsi="楷体" w:eastAsia="楷体" w:cs="楷体"/>
-          <w:b/>
-          <w:bCs/>
-          <w:color w:val="auto"/>
-          <w:spacing w:val="-3"/>
-          <w:kern w:val="4"/>
-          <w:sz w:val="21"/>
-          <w:szCs w:val="21"/>
-          <w:lang w:val="en-US" w:eastAsia="zh-CN" w:bidi="ar-SA"/>
-        </w:rPr>
-        <w:t>CET-6：463</w:t>
+        <w:t xml:space="preserve">       </w:t>
+      </w:r>
+      <w:r>
+        <w:rPr>
+          <w:rFonts w:hint="eastAsia" w:ascii="Times New Roman" w:hAnsi="Times New Roman" w:eastAsia="楷体" w:cs="Times New Roman"/>
+          <w:b/>
+          <w:bCs/>
+          <w:color w:val="auto"/>
+          <w:spacing w:val="-3"/>
+          <w:kern w:val="4"/>
+          <w:sz w:val="21"/>
+          <w:szCs w:val="21"/>
+          <w:lang w:val="en-US" w:eastAsia="zh-CN" w:bidi="ar-SA"/>
+        </w:rPr>
+        <w:t>CET-6</w:t>
+      </w:r>
+      <w:r>
+        <w:rPr>
+          <w:rFonts w:hint="eastAsia" w:ascii="楷体" w:hAnsi="楷体" w:eastAsia="楷体" w:cs="楷体"/>
+          <w:b/>
+          <w:bCs/>
+          <w:color w:val="auto"/>
+          <w:spacing w:val="-3"/>
+          <w:kern w:val="4"/>
+          <w:sz w:val="21"/>
+          <w:szCs w:val="21"/>
+          <w:lang w:val="en-US" w:eastAsia="zh-CN" w:bidi="ar-SA"/>
+        </w:rPr>
+        <w:t>：</w:t>
+      </w:r>
+      <w:r>
+        <w:rPr>
+          <w:rFonts w:hint="eastAsia" w:ascii="Times New Roman" w:hAnsi="Times New Roman" w:eastAsia="楷体" w:cs="Times New Roman"/>
+          <w:b/>
+          <w:bCs/>
+          <w:color w:val="auto"/>
+          <w:spacing w:val="-3"/>
+          <w:kern w:val="4"/>
+          <w:sz w:val="21"/>
+          <w:szCs w:val="21"/>
+          <w:lang w:val="en-US" w:eastAsia="zh-CN" w:bidi="ar-SA"/>
+        </w:rPr>
+        <w:t>463</w:t>
       </w:r>
     </w:p>
     <w:p>
@@ -924,7 +988,215 @@
           <w:szCs w:val="21"/>
           <w:lang w:val="en-US" w:eastAsia="zh-CN" w:bidi="ar-SA"/>
         </w:rPr>
-        <w:t>线性代数(95)、概率论与数理统计(95)、电磁场与电磁波(95)、C语言程序设计基础(96)、微控制器原理接口技术(95)、计算机网络(94)、图论与排队论(98)、随机过程(95)、数据结构(91)等。</w:t>
+        <w:t>线性代数</w:t>
+      </w:r>
+      <w:r>
+        <w:rPr>
+          <w:rFonts w:hint="eastAsia" w:ascii="Times New Roman" w:hAnsi="Times New Roman" w:eastAsia="楷体" w:cs="Times New Roman"/>
+          <w:b w:val="0"/>
+          <w:bCs w:val="0"/>
+          <w:color w:val="auto"/>
+          <w:spacing w:val="-3"/>
+          <w:kern w:val="4"/>
+          <w:sz w:val="21"/>
+          <w:szCs w:val="21"/>
+          <w:lang w:val="en-US" w:eastAsia="zh-CN" w:bidi="ar-SA"/>
+        </w:rPr>
+        <w:t>(95)</w:t>
+      </w:r>
+      <w:r>
+        <w:rPr>
+          <w:rFonts w:hint="eastAsia" w:ascii="楷体" w:hAnsi="楷体" w:eastAsia="楷体" w:cs="楷体"/>
+          <w:color w:val="auto"/>
+          <w:spacing w:val="-3"/>
+          <w:kern w:val="4"/>
+          <w:sz w:val="21"/>
+          <w:szCs w:val="21"/>
+          <w:lang w:val="en-US" w:eastAsia="zh-CN" w:bidi="ar-SA"/>
+        </w:rPr>
+        <w:t>、概率论与数理统计(95)、电磁场与电磁波</w:t>
+      </w:r>
+      <w:r>
+        <w:rPr>
+          <w:rFonts w:hint="eastAsia" w:ascii="Times New Roman" w:hAnsi="Times New Roman" w:eastAsia="楷体" w:cs="Times New Roman"/>
+          <w:b w:val="0"/>
+          <w:bCs w:val="0"/>
+          <w:color w:val="auto"/>
+          <w:spacing w:val="-3"/>
+          <w:kern w:val="4"/>
+          <w:sz w:val="21"/>
+          <w:szCs w:val="21"/>
+          <w:lang w:val="en-US" w:eastAsia="zh-CN" w:bidi="ar-SA"/>
+        </w:rPr>
+        <w:t>(95)</w:t>
+      </w:r>
+      <w:r>
+        <w:rPr>
+          <w:rFonts w:hint="eastAsia" w:ascii="楷体" w:hAnsi="楷体" w:eastAsia="楷体" w:cs="楷体"/>
+          <w:color w:val="auto"/>
+          <w:spacing w:val="-3"/>
+          <w:kern w:val="4"/>
+          <w:sz w:val="21"/>
+          <w:szCs w:val="21"/>
+          <w:lang w:val="en-US" w:eastAsia="zh-CN" w:bidi="ar-SA"/>
+        </w:rPr>
+        <w:t>、C语言程序设计基础</w:t>
+      </w:r>
+      <w:r>
+        <w:rPr>
+          <w:rFonts w:hint="eastAsia" w:ascii="Times New Roman" w:hAnsi="Times New Roman" w:eastAsia="楷体" w:cs="Times New Roman"/>
+          <w:b w:val="0"/>
+          <w:bCs w:val="0"/>
+          <w:color w:val="auto"/>
+          <w:spacing w:val="-3"/>
+          <w:kern w:val="4"/>
+          <w:sz w:val="21"/>
+          <w:szCs w:val="21"/>
+          <w:lang w:val="en-US" w:eastAsia="zh-CN" w:bidi="ar-SA"/>
+        </w:rPr>
+        <w:t>(96)</w:t>
+      </w:r>
+      <w:r>
+        <w:rPr>
+          <w:rFonts w:hint="eastAsia" w:ascii="楷体" w:hAnsi="楷体" w:eastAsia="楷体" w:cs="楷体"/>
+          <w:color w:val="auto"/>
+          <w:spacing w:val="-3"/>
+          <w:kern w:val="4"/>
+          <w:sz w:val="21"/>
+          <w:szCs w:val="21"/>
+          <w:lang w:val="en-US" w:eastAsia="zh-CN" w:bidi="ar-SA"/>
+        </w:rPr>
+        <w:t>、微控制器原理接口技术</w:t>
+      </w:r>
+      <w:r>
+        <w:rPr>
+          <w:rFonts w:hint="eastAsia" w:ascii="Times New Roman" w:hAnsi="Times New Roman" w:eastAsia="楷体" w:cs="Times New Roman"/>
+          <w:b w:val="0"/>
+          <w:bCs w:val="0"/>
+          <w:color w:val="auto"/>
+          <w:spacing w:val="-3"/>
+          <w:kern w:val="4"/>
+          <w:sz w:val="21"/>
+          <w:szCs w:val="21"/>
+          <w:lang w:val="en-US" w:eastAsia="zh-CN" w:bidi="ar-SA"/>
+        </w:rPr>
+        <w:t>(95)</w:t>
+      </w:r>
+      <w:r>
+        <w:rPr>
+          <w:rFonts w:hint="eastAsia" w:ascii="楷体" w:hAnsi="楷体" w:eastAsia="楷体" w:cs="楷体"/>
+          <w:color w:val="auto"/>
+          <w:spacing w:val="-3"/>
+          <w:kern w:val="4"/>
+          <w:sz w:val="21"/>
+          <w:szCs w:val="21"/>
+          <w:lang w:val="en-US" w:eastAsia="zh-CN" w:bidi="ar-SA"/>
+        </w:rPr>
+        <w:t>、计算机网络</w:t>
+      </w:r>
+      <w:r>
+        <w:rPr>
+          <w:rFonts w:hint="eastAsia" w:ascii="Times New Roman" w:hAnsi="Times New Roman" w:eastAsia="楷体" w:cs="Times New Roman"/>
+          <w:b w:val="0"/>
+          <w:bCs w:val="0"/>
+          <w:color w:val="auto"/>
+          <w:spacing w:val="-3"/>
+          <w:kern w:val="4"/>
+          <w:sz w:val="21"/>
+          <w:szCs w:val="21"/>
+          <w:lang w:val="en-US" w:eastAsia="zh-CN" w:bidi="ar-SA"/>
+        </w:rPr>
+        <w:t>(94)</w:t>
+      </w:r>
+      <w:r>
+        <w:rPr>
+          <w:rFonts w:hint="eastAsia" w:ascii="楷体" w:hAnsi="楷体" w:eastAsia="楷体" w:cs="楷体"/>
+          <w:color w:val="auto"/>
+          <w:spacing w:val="-3"/>
+          <w:kern w:val="4"/>
+          <w:sz w:val="21"/>
+          <w:szCs w:val="21"/>
+          <w:lang w:val="en-US" w:eastAsia="zh-CN" w:bidi="ar-SA"/>
+        </w:rPr>
+        <w:t>、图论与排队论</w:t>
+      </w:r>
+      <w:r>
+        <w:rPr>
+          <w:rFonts w:hint="eastAsia" w:ascii="Times New Roman" w:hAnsi="Times New Roman" w:eastAsia="楷体" w:cs="Times New Roman"/>
+          <w:b w:val="0"/>
+          <w:bCs w:val="0"/>
+          <w:color w:val="auto"/>
+          <w:spacing w:val="-3"/>
+          <w:kern w:val="4"/>
+          <w:sz w:val="21"/>
+          <w:szCs w:val="21"/>
+          <w:lang w:val="en-US" w:eastAsia="zh-CN" w:bidi="ar-SA"/>
+        </w:rPr>
+        <w:t>(98)</w:t>
+      </w:r>
+      <w:r>
+        <w:rPr>
+          <w:rFonts w:hint="eastAsia" w:ascii="楷体" w:hAnsi="楷体" w:eastAsia="楷体" w:cs="楷体"/>
+          <w:color w:val="auto"/>
+          <w:spacing w:val="-3"/>
+          <w:kern w:val="4"/>
+          <w:sz w:val="21"/>
+          <w:szCs w:val="21"/>
+          <w:lang w:val="en-US" w:eastAsia="zh-CN" w:bidi="ar-SA"/>
+        </w:rPr>
+        <w:t>、随机过程</w:t>
+      </w:r>
+      <w:r>
+        <w:rPr>
+          <w:rFonts w:hint="eastAsia" w:ascii="Times New Roman" w:hAnsi="Times New Roman" w:eastAsia="楷体" w:cs="Times New Roman"/>
+          <w:b w:val="0"/>
+          <w:bCs w:val="0"/>
+          <w:color w:val="auto"/>
+          <w:spacing w:val="-3"/>
+          <w:kern w:val="4"/>
+          <w:sz w:val="21"/>
+          <w:szCs w:val="21"/>
+          <w:lang w:val="en-US" w:eastAsia="zh-CN" w:bidi="ar-SA"/>
+        </w:rPr>
+        <w:t>(95)</w:t>
+      </w:r>
+      <w:r>
+        <w:rPr>
+          <w:rFonts w:hint="eastAsia" w:ascii="楷体" w:hAnsi="楷体" w:eastAsia="楷体" w:cs="楷体"/>
+          <w:color w:val="auto"/>
+          <w:spacing w:val="-3"/>
+          <w:kern w:val="4"/>
+          <w:sz w:val="21"/>
+          <w:szCs w:val="21"/>
+          <w:lang w:val="en-US" w:eastAsia="zh-CN" w:bidi="ar-SA"/>
+        </w:rPr>
+        <w:t>、数据结构</w:t>
+      </w:r>
+      <w:r>
+        <w:rPr>
+          <w:rFonts w:hint="eastAsia" w:ascii="Times New Roman" w:hAnsi="Times New Roman" w:eastAsia="楷体" w:cs="Times New Roman"/>
+          <w:b w:val="0"/>
+          <w:bCs w:val="0"/>
+          <w:color w:val="auto"/>
+          <w:spacing w:val="-3"/>
+          <w:kern w:val="4"/>
+          <w:sz w:val="21"/>
+          <w:szCs w:val="21"/>
+          <w:lang w:val="en-US" w:eastAsia="zh-CN" w:bidi="ar-SA"/>
+        </w:rPr>
+        <w:t>(91)</w:t>
+      </w:r>
+      <w:r>
+        <w:rPr>
+          <w:rFonts w:hint="eastAsia" w:ascii="楷体" w:hAnsi="楷体" w:eastAsia="楷体" w:cs="楷体"/>
+          <w:color w:val="auto"/>
+          <w:spacing w:val="-3"/>
+          <w:kern w:val="4"/>
+          <w:sz w:val="21"/>
+          <w:szCs w:val="21"/>
+          <w:lang w:val="en-US" w:eastAsia="zh-CN" w:bidi="ar-SA"/>
+        </w:rPr>
+        <w:t>等。</w:t>
       </w:r>
     </w:p>
     <w:p>
@@ -1090,11 +1362,12 @@
       </w:pPr>
       <w:r>
         <w:rPr>
-          <w:rFonts w:hint="eastAsia" w:ascii="Times New Roman" w:hAnsi="Times New Roman" w:eastAsia="楷体"/>
-          <w:b/>
-          <w:bCs/>
-          <w:color w:val="auto"/>
-          <w:w w:val="105"/>
+          <w:rFonts w:hint="eastAsia" w:ascii="Times New Roman" w:hAnsi="Times New Roman" w:eastAsia="楷体" w:cs="Times New Roman"/>
+          <w:b/>
+          <w:bCs/>
+          <w:color w:val="auto"/>
+          <w:spacing w:val="-3"/>
+          <w:kern w:val="4"/>
           <w:sz w:val="21"/>
           <w:szCs w:val="21"/>
           <w:lang w:val="en-US" w:eastAsia="zh-CN"/>
@@ -1269,17 +1542,31 @@
       </w:r>
       <w:r>
         <w:rPr>
-          <w:rFonts w:hint="eastAsia" w:ascii="楷体" w:hAnsi="楷体" w:eastAsia="楷体" w:cs="楷体"/>
-          <w:b/>
-          <w:bCs/>
-          <w:color w:val="auto"/>
-          <w:spacing w:val="-3"/>
-          <w:kern w:val="4"/>
-          <w:sz w:val="21"/>
-          <w:szCs w:val="21"/>
-          <w:lang w:val="en-US" w:eastAsia="zh-CN"/>
-        </w:rPr>
-        <w:t>Torch、TensorRT 量化底层技术</w:t>
+          <w:rFonts w:hint="eastAsia" w:ascii="Times New Roman" w:hAnsi="Times New Roman" w:eastAsia="楷体" w:cs="Times New Roman"/>
+          <w:b/>
+          <w:bCs/>
+          <w:color w:val="auto"/>
+          <w:spacing w:val="-3"/>
+          <w:kern w:val="4"/>
+          <w:sz w:val="21"/>
+          <w:szCs w:val="21"/>
+          <w:lang w:val="en-US" w:eastAsia="zh-CN"/>
+        </w:rPr>
+        <w:t>Torch、TensorRT</w:t>
+      </w:r>
+      <w:r>
+        <w:rPr>
+          <w:rFonts w:hint="eastAsia" w:ascii="楷体" w:hAnsi="楷体" w:eastAsia="楷体" w:cs="楷体"/>
+          <w:b/>
+          <w:bCs/>
+          <w:color w:val="auto"/>
+          <w:spacing w:val="-3"/>
+          <w:kern w:val="4"/>
+          <w:sz w:val="21"/>
+          <w:szCs w:val="21"/>
+          <w:lang w:val="en-US" w:eastAsia="zh-CN"/>
+        </w:rPr>
+        <w:t xml:space="preserve"> 量化底层技术</w:t>
       </w:r>
       <w:r>
         <w:rPr>
@@ -1305,19 +1592,222 @@
           <w:szCs w:val="21"/>
           <w:lang w:val="en-US" w:eastAsia="zh-CN"/>
         </w:rPr>
-        <w:t>完整复现 DeepBurst 量化推理工程</w:t>
-      </w:r>
-      <w:r>
-        <w:rPr>
-          <w:rFonts w:hint="eastAsia" w:ascii="楷体" w:hAnsi="楷体" w:eastAsia="楷体" w:cs="楷体"/>
-          <w:color w:val="auto"/>
-          <w:spacing w:val="-3"/>
-          <w:kern w:val="4"/>
-          <w:sz w:val="21"/>
-          <w:szCs w:val="21"/>
-          <w:lang w:val="en-US" w:eastAsia="zh-CN"/>
-        </w:rPr>
-        <w:t>，深入研读 FakeQuant 节点、ONNX QDQ 数值映射逻辑，掌握 TRT FP16 与 INT8 两套 TRT 推理调优流程；基于 HuggingFace 复现 ResNet、MobileNet、ViT、Swin-Transformer 等主流视觉模型，完成</w:t>
+        <w:t xml:space="preserve">完整复现 </w:t>
+      </w:r>
+      <w:r>
+        <w:rPr>
+          <w:rFonts w:hint="eastAsia" w:ascii="Times New Roman" w:hAnsi="Times New Roman" w:eastAsia="楷体" w:cs="Times New Roman"/>
+          <w:b/>
+          <w:bCs/>
+          <w:color w:val="auto"/>
+          <w:spacing w:val="-3"/>
+          <w:kern w:val="4"/>
+          <w:sz w:val="21"/>
+          <w:szCs w:val="21"/>
+          <w:lang w:val="en-US" w:eastAsia="zh-CN"/>
+        </w:rPr>
+        <w:t>DeepBurst</w:t>
+      </w:r>
+      <w:r>
+        <w:rPr>
+          <w:rFonts w:hint="eastAsia" w:ascii="楷体" w:hAnsi="楷体" w:eastAsia="楷体" w:cs="楷体"/>
+          <w:b/>
+          <w:bCs/>
+          <w:color w:val="auto"/>
+          <w:spacing w:val="-3"/>
+          <w:kern w:val="4"/>
+          <w:sz w:val="21"/>
+          <w:szCs w:val="21"/>
+          <w:lang w:val="en-US" w:eastAsia="zh-CN"/>
+        </w:rPr>
+        <w:t xml:space="preserve"> 量化推理工程</w:t>
+      </w:r>
+      <w:r>
+        <w:rPr>
+          <w:rFonts w:hint="eastAsia" w:ascii="楷体" w:hAnsi="楷体" w:eastAsia="楷体" w:cs="楷体"/>
+          <w:color w:val="auto"/>
+          <w:spacing w:val="-3"/>
+          <w:kern w:val="4"/>
+          <w:sz w:val="21"/>
+          <w:szCs w:val="21"/>
+          <w:lang w:val="en-US" w:eastAsia="zh-CN"/>
+        </w:rPr>
+        <w:t xml:space="preserve">，深入研读 </w:t>
+      </w:r>
+      <w:r>
+        <w:rPr>
+          <w:rFonts w:hint="eastAsia" w:ascii="Times New Roman" w:hAnsi="Times New Roman" w:eastAsia="楷体" w:cs="Times New Roman"/>
+          <w:b w:val="0"/>
+          <w:bCs w:val="0"/>
+          <w:color w:val="auto"/>
+          <w:w w:val="105"/>
+          <w:sz w:val="21"/>
+          <w:szCs w:val="21"/>
+          <w:lang w:val="en-US" w:eastAsia="zh-CN" w:bidi="ar-SA"/>
+        </w:rPr>
+        <w:t>FakeQuant</w:t>
+      </w:r>
+      <w:r>
+        <w:rPr>
+          <w:rFonts w:hint="eastAsia" w:ascii="楷体" w:hAnsi="楷体" w:eastAsia="楷体" w:cs="楷体"/>
+          <w:color w:val="auto"/>
+          <w:spacing w:val="-3"/>
+          <w:kern w:val="4"/>
+          <w:sz w:val="21"/>
+          <w:szCs w:val="21"/>
+          <w:lang w:val="en-US" w:eastAsia="zh-CN"/>
+        </w:rPr>
+        <w:t xml:space="preserve"> 节点、</w:t>
+      </w:r>
+      <w:r>
+        <w:rPr>
+          <w:rFonts w:hint="eastAsia" w:ascii="Times New Roman" w:hAnsi="Times New Roman" w:eastAsia="楷体" w:cs="Times New Roman"/>
+          <w:b w:val="0"/>
+          <w:bCs w:val="0"/>
+          <w:color w:val="auto"/>
+          <w:w w:val="105"/>
+          <w:sz w:val="21"/>
+          <w:szCs w:val="21"/>
+          <w:lang w:val="en-US" w:eastAsia="zh-CN" w:bidi="ar-SA"/>
+        </w:rPr>
+        <w:t>ONNX QDQ</w:t>
+      </w:r>
+      <w:r>
+        <w:rPr>
+          <w:rFonts w:hint="eastAsia" w:ascii="楷体" w:hAnsi="楷体" w:eastAsia="楷体" w:cs="楷体"/>
+          <w:color w:val="auto"/>
+          <w:spacing w:val="-3"/>
+          <w:kern w:val="4"/>
+          <w:sz w:val="21"/>
+          <w:szCs w:val="21"/>
+          <w:lang w:val="en-US" w:eastAsia="zh-CN"/>
+        </w:rPr>
+        <w:t xml:space="preserve"> 数值映射逻辑，掌握 </w:t>
+      </w:r>
+      <w:r>
+        <w:rPr>
+          <w:rFonts w:hint="eastAsia" w:ascii="Times New Roman" w:hAnsi="Times New Roman" w:eastAsia="楷体" w:cs="Times New Roman"/>
+          <w:b w:val="0"/>
+          <w:bCs w:val="0"/>
+          <w:color w:val="auto"/>
+          <w:w w:val="105"/>
+          <w:sz w:val="21"/>
+          <w:szCs w:val="21"/>
+          <w:lang w:val="en-US" w:eastAsia="zh-CN" w:bidi="ar-SA"/>
+        </w:rPr>
+        <w:t>TRT FP16</w:t>
+      </w:r>
+      <w:r>
+        <w:rPr>
+          <w:rFonts w:hint="eastAsia" w:ascii="楷体" w:hAnsi="楷体" w:eastAsia="楷体" w:cs="楷体"/>
+          <w:color w:val="auto"/>
+          <w:spacing w:val="-3"/>
+          <w:kern w:val="4"/>
+          <w:sz w:val="21"/>
+          <w:szCs w:val="21"/>
+          <w:lang w:val="en-US" w:eastAsia="zh-CN"/>
+        </w:rPr>
+        <w:t xml:space="preserve"> 与 </w:t>
+      </w:r>
+      <w:r>
+        <w:rPr>
+          <w:rFonts w:hint="eastAsia" w:ascii="Times New Roman" w:hAnsi="Times New Roman" w:eastAsia="楷体" w:cs="Times New Roman"/>
+          <w:b w:val="0"/>
+          <w:bCs w:val="0"/>
+          <w:color w:val="auto"/>
+          <w:w w:val="105"/>
+          <w:sz w:val="21"/>
+          <w:szCs w:val="21"/>
+          <w:lang w:val="en-US" w:eastAsia="zh-CN" w:bidi="ar-SA"/>
+        </w:rPr>
+        <w:t>INT8</w:t>
+      </w:r>
+      <w:r>
+        <w:rPr>
+          <w:rFonts w:hint="eastAsia" w:ascii="楷体" w:hAnsi="楷体" w:eastAsia="楷体" w:cs="楷体"/>
+          <w:color w:val="auto"/>
+          <w:spacing w:val="-3"/>
+          <w:kern w:val="4"/>
+          <w:sz w:val="21"/>
+          <w:szCs w:val="21"/>
+          <w:lang w:val="en-US" w:eastAsia="zh-CN"/>
+        </w:rPr>
+        <w:t xml:space="preserve"> 两套 </w:t>
+      </w:r>
+      <w:r>
+        <w:rPr>
+          <w:rFonts w:hint="eastAsia" w:ascii="Times New Roman" w:hAnsi="Times New Roman" w:eastAsia="楷体" w:cs="Times New Roman"/>
+          <w:b w:val="0"/>
+          <w:bCs w:val="0"/>
+          <w:color w:val="auto"/>
+          <w:w w:val="105"/>
+          <w:sz w:val="21"/>
+          <w:szCs w:val="21"/>
+          <w:lang w:val="en-US" w:eastAsia="zh-CN" w:bidi="ar-SA"/>
+        </w:rPr>
+        <w:t>TRT</w:t>
+      </w:r>
+      <w:r>
+        <w:rPr>
+          <w:rFonts w:hint="eastAsia" w:ascii="楷体" w:hAnsi="楷体" w:eastAsia="楷体" w:cs="楷体"/>
+          <w:color w:val="auto"/>
+          <w:spacing w:val="-3"/>
+          <w:kern w:val="4"/>
+          <w:sz w:val="21"/>
+          <w:szCs w:val="21"/>
+          <w:lang w:val="en-US" w:eastAsia="zh-CN"/>
+        </w:rPr>
+        <w:t xml:space="preserve"> 推理调优流程；基于 </w:t>
+      </w:r>
+      <w:r>
+        <w:rPr>
+          <w:rFonts w:hint="eastAsia" w:ascii="Times New Roman" w:hAnsi="Times New Roman" w:eastAsia="楷体" w:cs="Times New Roman"/>
+          <w:b w:val="0"/>
+          <w:bCs w:val="0"/>
+          <w:color w:val="auto"/>
+          <w:w w:val="105"/>
+          <w:sz w:val="21"/>
+          <w:szCs w:val="21"/>
+          <w:lang w:val="en-US" w:eastAsia="zh-CN" w:bidi="ar-SA"/>
+        </w:rPr>
+        <w:t>HuggingFace</w:t>
+      </w:r>
+      <w:r>
+        <w:rPr>
+          <w:rFonts w:hint="eastAsia" w:ascii="楷体" w:hAnsi="楷体" w:eastAsia="楷体" w:cs="楷体"/>
+          <w:color w:val="auto"/>
+          <w:spacing w:val="-3"/>
+          <w:kern w:val="4"/>
+          <w:sz w:val="21"/>
+          <w:szCs w:val="21"/>
+          <w:lang w:val="en-US" w:eastAsia="zh-CN"/>
+        </w:rPr>
+        <w:t xml:space="preserve"> 复现 </w:t>
+      </w:r>
+      <w:r>
+        <w:rPr>
+          <w:rFonts w:hint="eastAsia" w:ascii="Times New Roman" w:hAnsi="Times New Roman" w:eastAsia="楷体" w:cs="Times New Roman"/>
+          <w:b w:val="0"/>
+          <w:bCs w:val="0"/>
+          <w:color w:val="auto"/>
+          <w:w w:val="105"/>
+          <w:sz w:val="21"/>
+          <w:szCs w:val="21"/>
+          <w:lang w:val="en-US" w:eastAsia="zh-CN" w:bidi="ar-SA"/>
+        </w:rPr>
+        <w:t>ResNet、MobileNet、ViT、Swin-Transformer</w:t>
+      </w:r>
+      <w:r>
+        <w:rPr>
+          <w:rFonts w:hint="eastAsia" w:ascii="楷体" w:hAnsi="楷体" w:eastAsia="楷体" w:cs="楷体"/>
+          <w:color w:val="auto"/>
+          <w:spacing w:val="-3"/>
+          <w:kern w:val="4"/>
+          <w:sz w:val="21"/>
+          <w:szCs w:val="21"/>
+          <w:lang w:val="en-US" w:eastAsia="zh-CN"/>
+        </w:rPr>
+        <w:t xml:space="preserve"> 等主流视觉模型，完成</w:t>
       </w:r>
       <w:r>
         <w:rPr>
@@ -1357,19 +1847,122 @@
           <w:szCs w:val="21"/>
           <w:lang w:val="en-US" w:eastAsia="zh-CN"/>
         </w:rPr>
-        <w:t>独立重构 Recon 项目推理方案</w:t>
-      </w:r>
-      <w:r>
-        <w:rPr>
-          <w:rFonts w:hint="eastAsia" w:ascii="楷体" w:hAnsi="楷体" w:eastAsia="楷体" w:cs="楷体"/>
-          <w:color w:val="auto"/>
-          <w:spacing w:val="-3"/>
-          <w:kern w:val="4"/>
-          <w:sz w:val="21"/>
-          <w:szCs w:val="21"/>
-          <w:lang w:val="en-US" w:eastAsia="zh-CN"/>
-        </w:rPr>
-        <w:t>，编写一键部署、量化、自动化评测完整脚本；同时，我也针对 ViT 与 Recon 模型开展多规格 TRT INT8 量化</w:t>
+        <w:t xml:space="preserve">独立重构 </w:t>
+      </w:r>
+      <w:r>
+        <w:rPr>
+          <w:rFonts w:hint="eastAsia" w:ascii="Times New Roman" w:hAnsi="Times New Roman" w:eastAsia="楷体" w:cs="Times New Roman"/>
+          <w:b/>
+          <w:bCs/>
+          <w:color w:val="auto"/>
+          <w:spacing w:val="-3"/>
+          <w:kern w:val="4"/>
+          <w:sz w:val="21"/>
+          <w:szCs w:val="21"/>
+          <w:lang w:val="en-US" w:eastAsia="zh-CN"/>
+        </w:rPr>
+        <w:t>Recon</w:t>
+      </w:r>
+      <w:r>
+        <w:rPr>
+          <w:rFonts w:hint="eastAsia" w:ascii="楷体" w:hAnsi="楷体" w:eastAsia="楷体" w:cs="楷体"/>
+          <w:b/>
+          <w:bCs/>
+          <w:color w:val="auto"/>
+          <w:spacing w:val="-3"/>
+          <w:kern w:val="4"/>
+          <w:sz w:val="21"/>
+          <w:szCs w:val="21"/>
+          <w:lang w:val="en-US" w:eastAsia="zh-CN"/>
+        </w:rPr>
+        <w:t xml:space="preserve"> 项目推理方案</w:t>
+      </w:r>
+      <w:r>
+        <w:rPr>
+          <w:rFonts w:hint="eastAsia" w:ascii="楷体" w:hAnsi="楷体" w:eastAsia="楷体" w:cs="楷体"/>
+          <w:color w:val="auto"/>
+          <w:spacing w:val="-3"/>
+          <w:kern w:val="4"/>
+          <w:sz w:val="21"/>
+          <w:szCs w:val="21"/>
+          <w:lang w:val="en-US" w:eastAsia="zh-CN"/>
+        </w:rPr>
+        <w:t xml:space="preserve">，编写一键部署、量化、自动化评测完整脚本；同时，我也针对 </w:t>
+      </w:r>
+      <w:r>
+        <w:rPr>
+          <w:rFonts w:hint="eastAsia" w:ascii="Times New Roman" w:hAnsi="Times New Roman" w:eastAsia="楷体" w:cs="Times New Roman"/>
+          <w:b w:val="0"/>
+          <w:bCs w:val="0"/>
+          <w:color w:val="auto"/>
+          <w:w w:val="105"/>
+          <w:sz w:val="21"/>
+          <w:szCs w:val="21"/>
+          <w:lang w:val="en-US" w:eastAsia="zh-CN" w:bidi="ar-SA"/>
+        </w:rPr>
+        <w:t>ViT</w:t>
+      </w:r>
+      <w:r>
+        <w:rPr>
+          <w:rFonts w:hint="eastAsia" w:ascii="楷体" w:hAnsi="楷体" w:eastAsia="楷体" w:cs="楷体"/>
+          <w:color w:val="auto"/>
+          <w:spacing w:val="-3"/>
+          <w:kern w:val="4"/>
+          <w:sz w:val="21"/>
+          <w:szCs w:val="21"/>
+          <w:lang w:val="en-US" w:eastAsia="zh-CN"/>
+        </w:rPr>
+        <w:t xml:space="preserve"> 与 </w:t>
+      </w:r>
+      <w:r>
+        <w:rPr>
+          <w:rFonts w:hint="eastAsia" w:ascii="Times New Roman" w:hAnsi="Times New Roman" w:eastAsia="楷体" w:cs="Times New Roman"/>
+          <w:b w:val="0"/>
+          <w:bCs w:val="0"/>
+          <w:color w:val="auto"/>
+          <w:w w:val="105"/>
+          <w:sz w:val="21"/>
+          <w:szCs w:val="21"/>
+          <w:lang w:val="en-US" w:eastAsia="zh-CN" w:bidi="ar-SA"/>
+        </w:rPr>
+        <w:t>Recon</w:t>
+      </w:r>
+      <w:r>
+        <w:rPr>
+          <w:rFonts w:hint="eastAsia" w:ascii="楷体" w:hAnsi="楷体" w:eastAsia="楷体" w:cs="楷体"/>
+          <w:color w:val="auto"/>
+          <w:spacing w:val="-3"/>
+          <w:kern w:val="4"/>
+          <w:sz w:val="21"/>
+          <w:szCs w:val="21"/>
+          <w:lang w:val="en-US" w:eastAsia="zh-CN"/>
+        </w:rPr>
+        <w:t xml:space="preserve"> 模型开展多规格 </w:t>
+      </w:r>
+      <w:r>
+        <w:rPr>
+          <w:rFonts w:hint="eastAsia" w:ascii="Times New Roman" w:hAnsi="Times New Roman" w:eastAsia="楷体" w:cs="Times New Roman"/>
+          <w:b w:val="0"/>
+          <w:bCs w:val="0"/>
+          <w:color w:val="auto"/>
+          <w:w w:val="105"/>
+          <w:sz w:val="21"/>
+          <w:szCs w:val="21"/>
+          <w:lang w:val="en-US" w:eastAsia="zh-CN" w:bidi="ar-SA"/>
+        </w:rPr>
+        <w:t>TRT INT8</w:t>
+      </w:r>
+      <w:r>
+        <w:rPr>
+          <w:rFonts w:hint="eastAsia" w:ascii="楷体" w:hAnsi="楷体" w:eastAsia="楷体" w:cs="楷体"/>
+          <w:color w:val="auto"/>
+          <w:spacing w:val="-3"/>
+          <w:kern w:val="4"/>
+          <w:sz w:val="21"/>
+          <w:szCs w:val="21"/>
+          <w:lang w:val="en-US" w:eastAsia="zh-CN"/>
+        </w:rPr>
+        <w:t xml:space="preserve"> 量化</w:t>
       </w:r>
       <w:r>
         <w:rPr>
@@ -1443,6 +2036,20 @@
       </w:pPr>
       <w:r>
         <w:rPr>
+          <w:rFonts w:hint="eastAsia" w:ascii="Times New Roman" w:hAnsi="Times New Roman" w:eastAsia="楷体" w:cs="Times New Roman"/>
+          <w:b/>
+          <w:bCs/>
+          <w:color w:val="auto"/>
+          <w:spacing w:val="-3"/>
+          <w:kern w:val="4"/>
+          <w:sz w:val="21"/>
+          <w:szCs w:val="21"/>
+          <w:lang w:val="en-US" w:eastAsia="zh-CN"/>
+        </w:rPr>
+        <w:t>2026.02-2026.04</w:t>
+      </w:r>
+      <w:r>
+        <w:rPr>
           <w:rFonts w:hint="eastAsia" w:ascii="Times New Roman" w:hAnsi="Times New Roman" w:eastAsia="楷体"/>
           <w:b/>
           <w:bCs/>
@@ -1452,7 +2059,7 @@
           <w:szCs w:val="21"/>
           <w:lang w:val="en-US" w:eastAsia="zh-CN"/>
         </w:rPr>
-        <w:t>2026.02-2026.04 </w:t>
+        <w:t> </w:t>
       </w:r>
       <w:r>
         <w:rPr>
@@ -1479,7 +2086,35 @@
           <w:szCs w:val="21"/>
           <w:lang w:val="en-US" w:eastAsia="zh-CN"/>
         </w:rPr>
-        <w:t>基于 Transformer 的语言模型复现与生成推理研究 </w:t>
+        <w:t xml:space="preserve">基于 </w:t>
+      </w:r>
+      <w:r>
+        <w:rPr>
+          <w:rFonts w:hint="eastAsia" w:ascii="Times New Roman" w:hAnsi="Times New Roman" w:eastAsia="楷体" w:cs="Times New Roman"/>
+          <w:b/>
+          <w:bCs/>
+          <w:color w:val="auto"/>
+          <w:spacing w:val="-3"/>
+          <w:kern w:val="4"/>
+          <w:sz w:val="21"/>
+          <w:szCs w:val="21"/>
+          <w:lang w:val="en-US" w:eastAsia="zh-CN"/>
+        </w:rPr>
+        <w:t>Transformer</w:t>
+      </w:r>
+      <w:r>
+        <w:rPr>
+          <w:rFonts w:hint="eastAsia" w:ascii="楷体" w:hAnsi="楷体" w:eastAsia="楷体" w:cs="楷体"/>
+          <w:b/>
+          <w:bCs/>
+          <w:color w:val="auto"/>
+          <w:spacing w:val="-3"/>
+          <w:kern w:val="4"/>
+          <w:sz w:val="21"/>
+          <w:szCs w:val="21"/>
+          <w:lang w:val="en-US" w:eastAsia="zh-CN"/>
+        </w:rPr>
+        <w:t xml:space="preserve"> 的语言模型复现与生成推理研究 </w:t>
       </w:r>
       <w:r>
         <w:rPr>
@@ -1632,33 +2267,264 @@
           <w:szCs w:val="21"/>
           <w:lang w:val="en-US" w:eastAsia="zh-CN"/>
         </w:rPr>
-        <w:t>学习 Stanford CS224N、CS336 课程后，</w:t>
-      </w:r>
-      <w:r>
-        <w:rPr>
-          <w:rFonts w:hint="eastAsia" w:ascii="楷体" w:hAnsi="楷体" w:eastAsia="楷体" w:cs="楷体"/>
-          <w:b/>
-          <w:bCs/>
-          <w:color w:val="auto"/>
-          <w:spacing w:val="-3"/>
-          <w:kern w:val="4"/>
-          <w:sz w:val="21"/>
-          <w:szCs w:val="21"/>
-          <w:lang w:val="en-US" w:eastAsia="zh-CN"/>
-        </w:rPr>
-        <w:t>从零实现小型 Transformer 语言模型 (decoder-only架构）训练与推理框架</w:t>
-      </w:r>
-      <w:r>
-        <w:rPr>
-          <w:rFonts w:hint="eastAsia" w:ascii="楷体" w:hAnsi="楷体" w:eastAsia="楷体" w:cs="楷体"/>
-          <w:color w:val="auto"/>
-          <w:spacing w:val="-3"/>
-          <w:kern w:val="4"/>
-          <w:sz w:val="21"/>
-          <w:szCs w:val="21"/>
-          <w:lang w:val="en-US" w:eastAsia="zh-CN"/>
-        </w:rPr>
-        <w:t>，完成 BPE 分词、数据预处理、因果自注意力、RoPE 位置编码、RMSNorm、AdamW 优化器、学习率预热与余弦退火等核心模块搭建；基于 TinyStories 数据集完成模型训练、断点续训与显卡推理部署，解决词表对齐、混合精度训练、显存优化与推理解码等问题，</w:t>
+        <w:t xml:space="preserve">学习 </w:t>
+      </w:r>
+      <w:r>
+        <w:rPr>
+          <w:rFonts w:hint="eastAsia" w:ascii="Times New Roman" w:hAnsi="Times New Roman" w:eastAsia="楷体" w:cs="Times New Roman"/>
+          <w:b w:val="0"/>
+          <w:bCs w:val="0"/>
+          <w:color w:val="auto"/>
+          <w:w w:val="105"/>
+          <w:sz w:val="21"/>
+          <w:szCs w:val="21"/>
+          <w:lang w:val="en-US" w:eastAsia="zh-CN" w:bidi="ar-SA"/>
+        </w:rPr>
+        <w:t>Stanford CS224N</w:t>
+      </w:r>
+      <w:r>
+        <w:rPr>
+          <w:rFonts w:hint="eastAsia" w:ascii="楷体" w:hAnsi="楷体" w:eastAsia="楷体" w:cs="楷体"/>
+          <w:color w:val="auto"/>
+          <w:spacing w:val="-3"/>
+          <w:kern w:val="4"/>
+          <w:sz w:val="21"/>
+          <w:szCs w:val="21"/>
+          <w:lang w:val="en-US" w:eastAsia="zh-CN"/>
+        </w:rPr>
+        <w:t>、</w:t>
+      </w:r>
+      <w:r>
+        <w:rPr>
+          <w:rFonts w:hint="eastAsia" w:ascii="Times New Roman" w:hAnsi="Times New Roman" w:eastAsia="楷体" w:cs="Times New Roman"/>
+          <w:b w:val="0"/>
+          <w:bCs w:val="0"/>
+          <w:color w:val="auto"/>
+          <w:w w:val="105"/>
+          <w:sz w:val="21"/>
+          <w:szCs w:val="21"/>
+          <w:lang w:val="en-US" w:eastAsia="zh-CN" w:bidi="ar-SA"/>
+        </w:rPr>
+        <w:t>CS336</w:t>
+      </w:r>
+      <w:r>
+        <w:rPr>
+          <w:rFonts w:hint="eastAsia" w:ascii="楷体" w:hAnsi="楷体" w:eastAsia="楷体" w:cs="楷体"/>
+          <w:color w:val="auto"/>
+          <w:spacing w:val="-3"/>
+          <w:kern w:val="4"/>
+          <w:sz w:val="21"/>
+          <w:szCs w:val="21"/>
+          <w:lang w:val="en-US" w:eastAsia="zh-CN"/>
+        </w:rPr>
+        <w:t xml:space="preserve"> 课程后，</w:t>
+      </w:r>
+      <w:r>
+        <w:rPr>
+          <w:rFonts w:hint="eastAsia" w:ascii="楷体" w:hAnsi="楷体" w:eastAsia="楷体" w:cs="楷体"/>
+          <w:b/>
+          <w:bCs/>
+          <w:color w:val="auto"/>
+          <w:spacing w:val="-3"/>
+          <w:kern w:val="4"/>
+          <w:sz w:val="21"/>
+          <w:szCs w:val="21"/>
+          <w:lang w:val="en-US" w:eastAsia="zh-CN"/>
+        </w:rPr>
+        <w:t xml:space="preserve">从零实现小型 </w:t>
+      </w:r>
+      <w:r>
+        <w:rPr>
+          <w:rFonts w:hint="eastAsia" w:ascii="Times New Roman" w:hAnsi="Times New Roman" w:eastAsia="楷体" w:cs="Times New Roman"/>
+          <w:b/>
+          <w:bCs/>
+          <w:color w:val="auto"/>
+          <w:spacing w:val="-3"/>
+          <w:kern w:val="4"/>
+          <w:sz w:val="21"/>
+          <w:szCs w:val="21"/>
+          <w:lang w:val="en-US" w:eastAsia="zh-CN"/>
+        </w:rPr>
+        <w:t>Transformer</w:t>
+      </w:r>
+      <w:r>
+        <w:rPr>
+          <w:rFonts w:hint="eastAsia" w:ascii="楷体" w:hAnsi="楷体" w:eastAsia="楷体" w:cs="楷体"/>
+          <w:b/>
+          <w:bCs/>
+          <w:color w:val="auto"/>
+          <w:spacing w:val="-3"/>
+          <w:kern w:val="4"/>
+          <w:sz w:val="21"/>
+          <w:szCs w:val="21"/>
+          <w:lang w:val="en-US" w:eastAsia="zh-CN"/>
+        </w:rPr>
+        <w:t xml:space="preserve"> 语言模型 (</w:t>
+      </w:r>
+      <w:r>
+        <w:rPr>
+          <w:rFonts w:hint="eastAsia" w:ascii="Times New Roman" w:hAnsi="Times New Roman" w:eastAsia="楷体" w:cs="Times New Roman"/>
+          <w:b/>
+          <w:bCs/>
+          <w:color w:val="auto"/>
+          <w:spacing w:val="-3"/>
+          <w:kern w:val="4"/>
+          <w:sz w:val="21"/>
+          <w:szCs w:val="21"/>
+          <w:lang w:val="en-US" w:eastAsia="zh-CN"/>
+        </w:rPr>
+        <w:t>decoder-only</w:t>
+      </w:r>
+      <w:r>
+        <w:rPr>
+          <w:rFonts w:hint="eastAsia" w:ascii="楷体" w:hAnsi="楷体" w:eastAsia="楷体" w:cs="楷体"/>
+          <w:b/>
+          <w:bCs/>
+          <w:color w:val="auto"/>
+          <w:spacing w:val="-3"/>
+          <w:kern w:val="4"/>
+          <w:sz w:val="21"/>
+          <w:szCs w:val="21"/>
+          <w:lang w:val="en-US" w:eastAsia="zh-CN"/>
+        </w:rPr>
+        <w:t>架构）训练与推理框架</w:t>
+      </w:r>
+      <w:r>
+        <w:rPr>
+          <w:rFonts w:hint="eastAsia" w:ascii="楷体" w:hAnsi="楷体" w:eastAsia="楷体" w:cs="楷体"/>
+          <w:color w:val="auto"/>
+          <w:spacing w:val="-3"/>
+          <w:kern w:val="4"/>
+          <w:sz w:val="21"/>
+          <w:szCs w:val="21"/>
+          <w:lang w:val="en-US" w:eastAsia="zh-CN"/>
+        </w:rPr>
+        <w:t xml:space="preserve">，完成 </w:t>
+      </w:r>
+      <w:r>
+        <w:rPr>
+          <w:rFonts w:hint="eastAsia" w:ascii="Times New Roman" w:hAnsi="Times New Roman" w:eastAsia="楷体" w:cs="Times New Roman"/>
+          <w:b w:val="0"/>
+          <w:bCs w:val="0"/>
+          <w:color w:val="auto"/>
+          <w:w w:val="105"/>
+          <w:sz w:val="21"/>
+          <w:szCs w:val="21"/>
+          <w:lang w:val="en-US" w:eastAsia="zh-CN" w:bidi="ar-SA"/>
+        </w:rPr>
+        <w:t>BPE</w:t>
+      </w:r>
+      <w:r>
+        <w:rPr>
+          <w:rFonts w:hint="eastAsia" w:ascii="楷体" w:hAnsi="楷体" w:eastAsia="楷体" w:cs="楷体"/>
+          <w:color w:val="auto"/>
+          <w:spacing w:val="-3"/>
+          <w:kern w:val="4"/>
+          <w:sz w:val="21"/>
+          <w:szCs w:val="21"/>
+          <w:lang w:val="en-US" w:eastAsia="zh-CN"/>
+        </w:rPr>
+        <w:t xml:space="preserve"> 分词、数据预处理、因果自注意力、</w:t>
+      </w:r>
+      <w:r>
+        <w:rPr>
+          <w:rFonts w:hint="eastAsia" w:ascii="Times New Roman" w:hAnsi="Times New Roman" w:eastAsia="楷体" w:cs="Times New Roman"/>
+          <w:b w:val="0"/>
+          <w:bCs w:val="0"/>
+          <w:color w:val="auto"/>
+          <w:w w:val="105"/>
+          <w:sz w:val="21"/>
+          <w:szCs w:val="21"/>
+          <w:lang w:val="en-US" w:eastAsia="zh-CN" w:bidi="ar-SA"/>
+        </w:rPr>
+        <w:t>RoPE</w:t>
+      </w:r>
+      <w:r>
+        <w:rPr>
+          <w:rFonts w:hint="eastAsia" w:ascii="楷体" w:hAnsi="楷体" w:eastAsia="楷体" w:cs="楷体"/>
+          <w:color w:val="auto"/>
+          <w:spacing w:val="-3"/>
+          <w:kern w:val="4"/>
+          <w:sz w:val="21"/>
+          <w:szCs w:val="21"/>
+          <w:lang w:val="en-US" w:eastAsia="zh-CN"/>
+        </w:rPr>
+        <w:t xml:space="preserve"> 位置编码、</w:t>
+      </w:r>
+      <w:r>
+        <w:rPr>
+          <w:rFonts w:hint="eastAsia" w:ascii="Times New Roman" w:hAnsi="Times New Roman" w:eastAsia="楷体" w:cs="Times New Roman"/>
+          <w:b w:val="0"/>
+          <w:bCs w:val="0"/>
+          <w:color w:val="auto"/>
+          <w:w w:val="105"/>
+          <w:sz w:val="21"/>
+          <w:szCs w:val="21"/>
+          <w:lang w:val="en-US" w:eastAsia="zh-CN" w:bidi="ar-SA"/>
+        </w:rPr>
+        <w:t>RMSNorm</w:t>
+      </w:r>
+      <w:r>
+        <w:rPr>
+          <w:rFonts w:hint="eastAsia" w:ascii="楷体" w:hAnsi="楷体" w:eastAsia="楷体" w:cs="楷体"/>
+          <w:color w:val="auto"/>
+          <w:spacing w:val="-3"/>
+          <w:kern w:val="4"/>
+          <w:sz w:val="21"/>
+          <w:szCs w:val="21"/>
+          <w:lang w:val="en-US" w:eastAsia="zh-CN"/>
+        </w:rPr>
+        <w:t>、</w:t>
+      </w:r>
+      <w:r>
+        <w:rPr>
+          <w:rFonts w:hint="eastAsia" w:ascii="Times New Roman" w:hAnsi="Times New Roman" w:eastAsia="楷体" w:cs="Times New Roman"/>
+          <w:b w:val="0"/>
+          <w:bCs w:val="0"/>
+          <w:color w:val="auto"/>
+          <w:w w:val="105"/>
+          <w:sz w:val="21"/>
+          <w:szCs w:val="21"/>
+          <w:lang w:val="en-US" w:eastAsia="zh-CN" w:bidi="ar-SA"/>
+        </w:rPr>
+        <w:t>AdamW</w:t>
+      </w:r>
+      <w:r>
+        <w:rPr>
+          <w:rFonts w:hint="eastAsia" w:ascii="楷体" w:hAnsi="楷体" w:eastAsia="楷体" w:cs="楷体"/>
+          <w:color w:val="auto"/>
+          <w:spacing w:val="-3"/>
+          <w:kern w:val="4"/>
+          <w:sz w:val="21"/>
+          <w:szCs w:val="21"/>
+          <w:lang w:val="en-US" w:eastAsia="zh-CN"/>
+        </w:rPr>
+        <w:t xml:space="preserve"> 优化器、学习率预热与余弦退火等核心模块搭建；基于</w:t>
+      </w:r>
+      <w:r>
+        <w:rPr>
+          <w:rFonts w:hint="eastAsia" w:ascii="Times New Roman" w:hAnsi="Times New Roman" w:eastAsia="楷体" w:cs="Times New Roman"/>
+          <w:b w:val="0"/>
+          <w:bCs w:val="0"/>
+          <w:color w:val="auto"/>
+          <w:w w:val="105"/>
+          <w:sz w:val="21"/>
+          <w:szCs w:val="21"/>
+          <w:lang w:val="en-US" w:eastAsia="zh-CN" w:bidi="ar-SA"/>
+        </w:rPr>
+        <w:t xml:space="preserve"> TinyStories </w:t>
+      </w:r>
+      <w:r>
+        <w:rPr>
+          <w:rFonts w:hint="eastAsia" w:ascii="楷体" w:hAnsi="楷体" w:eastAsia="楷体" w:cs="楷体"/>
+          <w:color w:val="auto"/>
+          <w:spacing w:val="-3"/>
+          <w:kern w:val="4"/>
+          <w:sz w:val="21"/>
+          <w:szCs w:val="21"/>
+          <w:lang w:val="en-US" w:eastAsia="zh-CN"/>
+        </w:rPr>
+        <w:t>数据集完成模型训练、断点续训与显卡推理部署，解决词表对齐、混合精度训练、显存优化与推理解码等问题，</w:t>
       </w:r>
       <w:r>
         <w:rPr>
@@ -1694,6 +2560,7 @@
           <w:kern w:val="4"/>
           <w:sz w:val="21"/>
           <w:szCs w:val="21"/>
+          <w:u w:val="none"/>
           <w:lang w:val="en-US" w:eastAsia="zh-CN"/>
         </w:rPr>
         <w:fldChar w:fldCharType="begin"/>
@@ -1706,6 +2573,7 @@
           <w:kern w:val="4"/>
           <w:sz w:val="21"/>
           <w:szCs w:val="21"/>
+          <w:u w:val="none"/>
           <w:lang w:val="en-US" w:eastAsia="zh-CN"/>
         </w:rPr>
         <w:instrText xml:space="preserve"> HYPERLINK "https://github.com/Tassel51/TasselLM" </w:instrText>
@@ -1718,6 +2586,7 @@
           <w:kern w:val="4"/>
           <w:sz w:val="21"/>
           <w:szCs w:val="21"/>
+          <w:u w:val="none"/>
           <w:lang w:val="en-US" w:eastAsia="zh-CN"/>
         </w:rPr>
         <w:fldChar w:fldCharType="separate"/>
@@ -1732,16 +2601,42 @@
           <w:szCs w:val="21"/>
           <w:lang w:val="en-US" w:eastAsia="zh-CN"/>
         </w:rPr>
-        <w:t>【项目github链接】</w:t>
-      </w:r>
-      <w:r>
-        <w:rPr>
-          <w:rFonts w:hint="eastAsia" w:ascii="楷体" w:hAnsi="楷体" w:eastAsia="楷体" w:cs="楷体"/>
-          <w:color w:val="auto"/>
-          <w:spacing w:val="-3"/>
-          <w:kern w:val="4"/>
-          <w:sz w:val="21"/>
-          <w:szCs w:val="21"/>
+        <w:t>【项目</w:t>
+      </w:r>
+      <w:r>
+        <w:rPr>
+          <w:rStyle w:val="12"/>
+          <w:rFonts w:hint="eastAsia" w:ascii="Times New Roman" w:hAnsi="Times New Roman" w:eastAsia="楷体" w:cs="Times New Roman"/>
+          <w:b w:val="0"/>
+          <w:bCs w:val="0"/>
+          <w:w w:val="105"/>
+          <w:sz w:val="21"/>
+          <w:szCs w:val="21"/>
+          <w:lang w:val="en-US" w:eastAsia="zh-CN" w:bidi="ar-SA"/>
+        </w:rPr>
+        <w:t>github</w:t>
+      </w:r>
+      <w:r>
+        <w:rPr>
+          <w:rStyle w:val="12"/>
+          <w:rFonts w:hint="eastAsia" w:ascii="楷体" w:hAnsi="楷体" w:eastAsia="楷体" w:cs="楷体"/>
+          <w:spacing w:val="-3"/>
+          <w:kern w:val="4"/>
+          <w:sz w:val="21"/>
+          <w:szCs w:val="21"/>
+          <w:lang w:val="en-US" w:eastAsia="zh-CN"/>
+        </w:rPr>
+        <w:t>链接】</w:t>
+      </w:r>
+      <w:r>
+        <w:rPr>
+          <w:rFonts w:hint="eastAsia" w:ascii="楷体" w:hAnsi="楷体" w:eastAsia="楷体" w:cs="楷体"/>
+          <w:color w:val="auto"/>
+          <w:spacing w:val="-3"/>
+          <w:kern w:val="4"/>
+          <w:sz w:val="21"/>
+          <w:szCs w:val="21"/>
+          <w:u w:val="none"/>
           <w:lang w:val="en-US" w:eastAsia="zh-CN"/>
         </w:rPr>
         <w:fldChar w:fldCharType="end"/>
@@ -1832,128 +2727,82 @@
       </w:pPr>
       <w:r>
         <w:rPr>
-          <w:rFonts w:ascii="Times New Roman" w:hAnsi="Times New Roman" w:eastAsia="楷体"/>
-          <w:b/>
-          <w:bCs/>
-          <w:color w:val="auto"/>
-          <w:w w:val="105"/>
-          <w:sz w:val="21"/>
-          <w:szCs w:val="21"/>
-          <w:lang w:eastAsia="zh-CN"/>
+          <w:rFonts w:hint="default" w:ascii="Times New Roman" w:hAnsi="Times New Roman" w:eastAsia="楷体" w:cs="Times New Roman"/>
+          <w:b/>
+          <w:bCs/>
+          <w:color w:val="auto"/>
+          <w:spacing w:val="-3"/>
+          <w:kern w:val="4"/>
+          <w:sz w:val="21"/>
+          <w:szCs w:val="21"/>
+          <w:lang w:val="en-US" w:eastAsia="zh-CN"/>
         </w:rPr>
         <w:t>20</w:t>
       </w:r>
       <w:r>
         <w:rPr>
-          <w:rFonts w:hint="eastAsia" w:ascii="Times New Roman" w:hAnsi="Times New Roman" w:eastAsia="楷体"/>
-          <w:b/>
-          <w:bCs/>
-          <w:color w:val="auto"/>
-          <w:w w:val="105"/>
-          <w:sz w:val="21"/>
-          <w:szCs w:val="21"/>
-          <w:lang w:val="en-US" w:eastAsia="zh-CN"/>
-        </w:rPr>
-        <w:t>24</w:t>
-      </w:r>
-      <w:r>
-        <w:rPr>
-          <w:rFonts w:hint="eastAsia" w:ascii="Times New Roman" w:hAnsi="Times New Roman" w:eastAsia="楷体"/>
-          <w:b/>
-          <w:bCs/>
-          <w:color w:val="auto"/>
-          <w:w w:val="105"/>
-          <w:sz w:val="21"/>
-          <w:szCs w:val="21"/>
-          <w:lang w:eastAsia="zh-CN"/>
-        </w:rPr>
-        <w:t>.</w:t>
-      </w:r>
-      <w:r>
-        <w:rPr>
-          <w:rFonts w:hint="eastAsia" w:ascii="Times New Roman" w:hAnsi="Times New Roman" w:eastAsia="楷体"/>
-          <w:b/>
-          <w:bCs/>
-          <w:color w:val="auto"/>
-          <w:w w:val="105"/>
-          <w:sz w:val="21"/>
-          <w:szCs w:val="21"/>
-          <w:lang w:val="en-US" w:eastAsia="zh-CN"/>
-        </w:rPr>
-        <w:t>11</w:t>
-      </w:r>
-      <w:r>
-        <w:rPr>
-          <w:rFonts w:hint="eastAsia" w:ascii="Times New Roman" w:hAnsi="Times New Roman" w:eastAsia="楷体"/>
-          <w:b/>
-          <w:bCs/>
-          <w:color w:val="auto"/>
-          <w:w w:val="105"/>
-          <w:sz w:val="21"/>
-          <w:szCs w:val="21"/>
-          <w:lang w:eastAsia="zh-CN"/>
-        </w:rPr>
-        <w:t>-</w:t>
-      </w:r>
-      <w:r>
-        <w:rPr>
-          <w:rFonts w:ascii="Times New Roman" w:hAnsi="Times New Roman" w:eastAsia="楷体"/>
-          <w:b/>
-          <w:bCs/>
-          <w:color w:val="auto"/>
-          <w:w w:val="105"/>
-          <w:sz w:val="21"/>
-          <w:szCs w:val="21"/>
-          <w:lang w:eastAsia="zh-CN"/>
+          <w:rFonts w:hint="eastAsia" w:ascii="Times New Roman" w:hAnsi="Times New Roman" w:eastAsia="楷体" w:cs="Times New Roman"/>
+          <w:b/>
+          <w:bCs/>
+          <w:color w:val="auto"/>
+          <w:spacing w:val="-3"/>
+          <w:kern w:val="4"/>
+          <w:sz w:val="21"/>
+          <w:szCs w:val="21"/>
+          <w:lang w:val="en-US" w:eastAsia="zh-CN"/>
+        </w:rPr>
+        <w:t>24.11-</w:t>
+      </w:r>
+      <w:r>
+        <w:rPr>
+          <w:rFonts w:hint="default" w:ascii="Times New Roman" w:hAnsi="Times New Roman" w:eastAsia="楷体" w:cs="Times New Roman"/>
+          <w:b/>
+          <w:bCs/>
+          <w:color w:val="auto"/>
+          <w:spacing w:val="-3"/>
+          <w:kern w:val="4"/>
+          <w:sz w:val="21"/>
+          <w:szCs w:val="21"/>
+          <w:lang w:val="en-US" w:eastAsia="zh-CN"/>
         </w:rPr>
         <w:t>202</w:t>
       </w:r>
       <w:r>
         <w:rPr>
-          <w:rFonts w:hint="eastAsia" w:ascii="Times New Roman" w:hAnsi="Times New Roman" w:eastAsia="楷体"/>
-          <w:b/>
-          <w:bCs/>
-          <w:color w:val="auto"/>
-          <w:w w:val="105"/>
-          <w:sz w:val="21"/>
-          <w:szCs w:val="21"/>
-          <w:lang w:val="en-US" w:eastAsia="zh-CN"/>
-        </w:rPr>
-        <w:t>6</w:t>
-      </w:r>
-      <w:r>
-        <w:rPr>
-          <w:rFonts w:hint="eastAsia" w:ascii="Times New Roman" w:hAnsi="Times New Roman" w:eastAsia="楷体"/>
-          <w:b/>
-          <w:bCs/>
-          <w:color w:val="auto"/>
-          <w:w w:val="105"/>
-          <w:sz w:val="21"/>
-          <w:szCs w:val="21"/>
-          <w:lang w:eastAsia="zh-CN"/>
-        </w:rPr>
-        <w:t>.</w:t>
-      </w:r>
-      <w:r>
-        <w:rPr>
-          <w:rFonts w:ascii="Times New Roman" w:hAnsi="Times New Roman" w:eastAsia="楷体"/>
-          <w:b/>
-          <w:bCs/>
-          <w:color w:val="auto"/>
-          <w:w w:val="105"/>
-          <w:sz w:val="21"/>
-          <w:szCs w:val="21"/>
-          <w:lang w:eastAsia="zh-CN"/>
+          <w:rFonts w:hint="eastAsia" w:ascii="Times New Roman" w:hAnsi="Times New Roman" w:eastAsia="楷体" w:cs="Times New Roman"/>
+          <w:b/>
+          <w:bCs/>
+          <w:color w:val="auto"/>
+          <w:spacing w:val="-3"/>
+          <w:kern w:val="4"/>
+          <w:sz w:val="21"/>
+          <w:szCs w:val="21"/>
+          <w:lang w:val="en-US" w:eastAsia="zh-CN"/>
+        </w:rPr>
+        <w:t>6.</w:t>
+      </w:r>
+      <w:r>
+        <w:rPr>
+          <w:rFonts w:hint="default" w:ascii="Times New Roman" w:hAnsi="Times New Roman" w:eastAsia="楷体" w:cs="Times New Roman"/>
+          <w:b/>
+          <w:bCs/>
+          <w:color w:val="auto"/>
+          <w:spacing w:val="-3"/>
+          <w:kern w:val="4"/>
+          <w:sz w:val="21"/>
+          <w:szCs w:val="21"/>
+          <w:lang w:val="en-US" w:eastAsia="zh-CN"/>
         </w:rPr>
         <w:t>0</w:t>
       </w:r>
       <w:r>
         <w:rPr>
-          <w:rFonts w:hint="eastAsia" w:ascii="Times New Roman" w:hAnsi="Times New Roman" w:eastAsia="楷体"/>
-          <w:b/>
-          <w:bCs/>
-          <w:color w:val="auto"/>
-          <w:w w:val="105"/>
+          <w:rFonts w:hint="eastAsia" w:ascii="Times New Roman" w:hAnsi="Times New Roman" w:eastAsia="楷体" w:cs="Times New Roman"/>
+          <w:b/>
+          <w:bCs/>
+          <w:color w:val="auto"/>
+          <w:spacing w:val="-3"/>
+          <w:kern w:val="4"/>
           <w:sz w:val="21"/>
           <w:szCs w:val="21"/>
           <w:lang w:val="en-US" w:eastAsia="zh-CN"/>
@@ -2104,19 +2953,19 @@
           <w:szCs w:val="21"/>
           <w:lang w:val="en-US" w:eastAsia="zh-CN"/>
         </w:rPr>
-        <w:t>：</w:t>
-      </w:r>
-      <w:r>
-        <w:rPr>
-          <w:rFonts w:hint="eastAsia" w:ascii="楷体" w:hAnsi="楷体" w:eastAsia="楷体" w:cs="楷体"/>
-          <w:color w:val="auto"/>
-          <w:spacing w:val="-3"/>
-          <w:kern w:val="4"/>
-          <w:sz w:val="21"/>
-          <w:szCs w:val="21"/>
-          <w:lang w:val="en-US" w:eastAsia="zh-CN"/>
-        </w:rPr>
-        <w:t>设计多模态智能双臂机器人系统，实现机器人自主移动与避障、基于</w:t>
+        <w:t>：自主</w:t>
+      </w:r>
+      <w:r>
+        <w:rPr>
+          <w:rFonts w:hint="eastAsia" w:ascii="楷体" w:hAnsi="楷体" w:eastAsia="楷体" w:cs="楷体"/>
+          <w:color w:val="auto"/>
+          <w:spacing w:val="-3"/>
+          <w:kern w:val="4"/>
+          <w:sz w:val="21"/>
+          <w:szCs w:val="21"/>
+          <w:lang w:val="en-US" w:eastAsia="zh-CN"/>
+        </w:rPr>
+        <w:t>设计多模态智能双臂机器人系统架构，实现机器人自主移动与避障、基于</w:t>
       </w:r>
       <w:r>
         <w:rPr>
@@ -2140,7 +2989,32 @@
           <w:szCs w:val="21"/>
           <w:lang w:val="en-US" w:eastAsia="zh-CN"/>
         </w:rPr>
-        <w:t>自主训练的视觉模型与RealSense深度摄像头的物体和场景识别、双机械臂的自主抓取等；</w:t>
+        <w:t>自主训练的视觉模型与</w:t>
+      </w:r>
+      <w:r>
+        <w:rPr>
+          <w:rFonts w:hint="eastAsia" w:ascii="Times New Roman" w:hAnsi="Times New Roman" w:eastAsia="楷体" w:cs="Times New Roman"/>
+          <w:b w:val="0"/>
+          <w:bCs w:val="0"/>
+          <w:color w:val="auto"/>
+          <w:w w:val="105"/>
+          <w:sz w:val="21"/>
+          <w:szCs w:val="21"/>
+          <w:lang w:val="en-US" w:eastAsia="zh-CN" w:bidi="ar-SA"/>
+        </w:rPr>
+        <w:t>RealSense</w:t>
+      </w:r>
+      <w:r>
+        <w:rPr>
+          <w:rFonts w:hint="eastAsia" w:ascii="楷体" w:hAnsi="楷体" w:eastAsia="楷体" w:cs="楷体"/>
+          <w:color w:val="auto"/>
+          <w:spacing w:val="-3"/>
+          <w:kern w:val="4"/>
+          <w:sz w:val="21"/>
+          <w:szCs w:val="21"/>
+          <w:lang w:val="en-US" w:eastAsia="zh-CN"/>
+        </w:rPr>
+        <w:t>深度摄像头的物体和场景识别、双机械臂的自主抓取等；</w:t>
       </w:r>
       <w:r>
         <w:rPr>
@@ -2210,7 +3084,35 @@
           <w:szCs w:val="21"/>
           <w:lang w:val="en-US" w:eastAsia="zh-CN"/>
         </w:rPr>
-        <w:t>的成绩</w:t>
+        <w:t>的成绩，同时我们团队不断改进该项目并借此</w:t>
+      </w:r>
+      <w:r>
+        <w:rPr>
+          <w:rFonts w:hint="eastAsia" w:ascii="楷体" w:hAnsi="楷体" w:eastAsia="楷体" w:cs="楷体"/>
+          <w:b/>
+          <w:bCs/>
+          <w:color w:val="auto"/>
+          <w:spacing w:val="-3"/>
+          <w:kern w:val="4"/>
+          <w:sz w:val="21"/>
+          <w:szCs w:val="21"/>
+          <w:lang w:val="en-US" w:eastAsia="zh-CN"/>
+        </w:rPr>
+        <w:t>获得了多项国家级奖项</w:t>
+      </w:r>
+      <w:r>
+        <w:rPr>
+          <w:rFonts w:hint="eastAsia" w:ascii="楷体" w:hAnsi="楷体" w:eastAsia="楷体" w:cs="楷体"/>
+          <w:b w:val="0"/>
+          <w:bCs w:val="0"/>
+          <w:color w:val="auto"/>
+          <w:spacing w:val="-3"/>
+          <w:kern w:val="4"/>
+          <w:sz w:val="21"/>
+          <w:szCs w:val="21"/>
+          <w:lang w:val="en-US" w:eastAsia="zh-CN"/>
+        </w:rPr>
+        <w:t>。</w:t>
       </w:r>
       <w:r>
         <w:rPr>
@@ -2236,6 +3138,7 @@
           <w:kern w:val="4"/>
           <w:sz w:val="21"/>
           <w:szCs w:val="21"/>
+          <w:u w:val="none"/>
           <w:lang w:val="en-US" w:eastAsia="zh-CN"/>
         </w:rPr>
         <w:fldChar w:fldCharType="begin"/>
@@ -2250,6 +3153,7 @@
           <w:kern w:val="4"/>
           <w:sz w:val="21"/>
           <w:szCs w:val="21"/>
+          <w:u w:val="none"/>
           <w:lang w:val="en-US" w:eastAsia="zh-CN"/>
         </w:rPr>
         <w:instrText xml:space="preserve"> HYPERLINK "https://github.com/Tassel51/LingXi-MultiModal_DualArm_MobileBot" </w:instrText>
@@ -2264,6 +3168,7 @@
           <w:kern w:val="4"/>
           <w:sz w:val="21"/>
           <w:szCs w:val="21"/>
+          <w:u w:val="none"/>
           <w:lang w:val="en-US" w:eastAsia="zh-CN"/>
         </w:rPr>
         <w:fldChar w:fldCharType="separate"/>
@@ -2280,18 +3185,46 @@
           <w:szCs w:val="21"/>
           <w:lang w:val="en-US" w:eastAsia="zh-CN"/>
         </w:rPr>
-        <w:t>【项目github链接】</w:t>
-      </w:r>
-      <w:r>
-        <w:rPr>
-          <w:rFonts w:hint="eastAsia" w:ascii="楷体" w:hAnsi="楷体" w:eastAsia="楷体" w:cs="楷体"/>
-          <w:b w:val="0"/>
-          <w:bCs w:val="0"/>
-          <w:color w:val="auto"/>
-          <w:spacing w:val="-3"/>
-          <w:kern w:val="4"/>
-          <w:sz w:val="21"/>
-          <w:szCs w:val="21"/>
+        <w:t>【项目</w:t>
+      </w:r>
+      <w:r>
+        <w:rPr>
+          <w:rStyle w:val="12"/>
+          <w:rFonts w:hint="eastAsia" w:ascii="Times New Roman" w:hAnsi="Times New Roman" w:eastAsia="楷体" w:cs="Times New Roman"/>
+          <w:b w:val="0"/>
+          <w:bCs w:val="0"/>
+          <w:w w:val="105"/>
+          <w:sz w:val="21"/>
+          <w:szCs w:val="21"/>
+          <w:lang w:val="en-US" w:eastAsia="zh-CN" w:bidi="ar-SA"/>
+        </w:rPr>
+        <w:t>github</w:t>
+      </w:r>
+      <w:r>
+        <w:rPr>
+          <w:rStyle w:val="12"/>
+          <w:rFonts w:hint="eastAsia" w:ascii="楷体" w:hAnsi="楷体" w:eastAsia="楷体" w:cs="楷体"/>
+          <w:b w:val="0"/>
+          <w:bCs w:val="0"/>
+          <w:spacing w:val="-3"/>
+          <w:kern w:val="4"/>
+          <w:sz w:val="21"/>
+          <w:szCs w:val="21"/>
+          <w:lang w:val="en-US" w:eastAsia="zh-CN"/>
+        </w:rPr>
+        <w:t>链接】</w:t>
+      </w:r>
+      <w:r>
+        <w:rPr>
+          <w:rFonts w:hint="eastAsia" w:ascii="楷体" w:hAnsi="楷体" w:eastAsia="楷体" w:cs="楷体"/>
+          <w:b w:val="0"/>
+          <w:bCs w:val="0"/>
+          <w:color w:val="auto"/>
+          <w:spacing w:val="-3"/>
+          <w:kern w:val="4"/>
+          <w:sz w:val="21"/>
+          <w:szCs w:val="21"/>
+          <w:u w:val="none"/>
           <w:lang w:val="en-US" w:eastAsia="zh-CN"/>
         </w:rPr>
         <w:fldChar w:fldCharType="end"/>
@@ -2377,7 +3310,107 @@
           <w:szCs w:val="21"/>
           <w:lang w:val="en-US" w:eastAsia="zh-CN" w:bidi="ar-SA"/>
         </w:rPr>
-        <w:t>负责基于 LangChain 架构部署 DeepSeek 大模型，构建机器人的“大脑”；通过 Prompt Engineering 与 RAG技术，实现了</w:t>
+        <w:t>负责基于</w:t>
+      </w:r>
+      <w:r>
+        <w:rPr>
+          <w:rFonts w:hint="eastAsia" w:ascii="Times New Roman" w:hAnsi="Times New Roman" w:eastAsia="楷体" w:cs="Times New Roman"/>
+          <w:b w:val="0"/>
+          <w:bCs w:val="0"/>
+          <w:color w:val="auto"/>
+          <w:w w:val="105"/>
+          <w:sz w:val="21"/>
+          <w:szCs w:val="21"/>
+          <w:lang w:val="en-US" w:eastAsia="zh-CN" w:bidi="ar-SA"/>
+        </w:rPr>
+        <w:t xml:space="preserve"> LangChain </w:t>
+      </w:r>
+      <w:r>
+        <w:rPr>
+          <w:rFonts w:hint="eastAsia" w:ascii="楷体" w:hAnsi="楷体" w:eastAsia="楷体" w:cs="楷体"/>
+          <w:color w:val="auto"/>
+          <w:spacing w:val="-3"/>
+          <w:kern w:val="4"/>
+          <w:sz w:val="21"/>
+          <w:szCs w:val="21"/>
+          <w:lang w:val="en-US" w:eastAsia="zh-CN" w:bidi="ar-SA"/>
+        </w:rPr>
+        <w:t>架构部署</w:t>
+      </w:r>
+      <w:r>
+        <w:rPr>
+          <w:rFonts w:hint="eastAsia" w:ascii="Times New Roman" w:hAnsi="Times New Roman" w:eastAsia="楷体" w:cs="Times New Roman"/>
+          <w:b w:val="0"/>
+          <w:bCs w:val="0"/>
+          <w:color w:val="auto"/>
+          <w:w w:val="105"/>
+          <w:sz w:val="21"/>
+          <w:szCs w:val="21"/>
+          <w:lang w:val="en-US" w:eastAsia="zh-CN" w:bidi="ar-SA"/>
+        </w:rPr>
+        <w:t xml:space="preserve"> DeepSeek </w:t>
+      </w:r>
+      <w:r>
+        <w:rPr>
+          <w:rFonts w:hint="eastAsia" w:ascii="楷体" w:hAnsi="楷体" w:eastAsia="楷体" w:cs="楷体"/>
+          <w:color w:val="auto"/>
+          <w:spacing w:val="-3"/>
+          <w:kern w:val="4"/>
+          <w:sz w:val="21"/>
+          <w:szCs w:val="21"/>
+          <w:lang w:val="en-US" w:eastAsia="zh-CN" w:bidi="ar-SA"/>
+        </w:rPr>
+        <w:t>大模型，构建机器人的“大脑”；通过</w:t>
+      </w:r>
+      <w:r>
+        <w:rPr>
+          <w:rFonts w:hint="eastAsia" w:ascii="Times New Roman" w:hAnsi="Times New Roman" w:eastAsia="楷体" w:cs="Times New Roman"/>
+          <w:b w:val="0"/>
+          <w:bCs w:val="0"/>
+          <w:color w:val="auto"/>
+          <w:w w:val="105"/>
+          <w:sz w:val="21"/>
+          <w:szCs w:val="21"/>
+          <w:lang w:val="en-US" w:eastAsia="zh-CN" w:bidi="ar-SA"/>
+        </w:rPr>
+        <w:t xml:space="preserve"> Prompt Engineering </w:t>
+      </w:r>
+      <w:r>
+        <w:rPr>
+          <w:rFonts w:hint="eastAsia" w:ascii="楷体" w:hAnsi="楷体" w:eastAsia="楷体" w:cs="楷体"/>
+          <w:color w:val="auto"/>
+          <w:spacing w:val="-3"/>
+          <w:kern w:val="4"/>
+          <w:sz w:val="21"/>
+          <w:szCs w:val="21"/>
+          <w:lang w:val="en-US" w:eastAsia="zh-CN" w:bidi="ar-SA"/>
+        </w:rPr>
+        <w:t xml:space="preserve">与 </w:t>
+      </w:r>
+      <w:r>
+        <w:rPr>
+          <w:rFonts w:hint="eastAsia" w:ascii="Times New Roman" w:hAnsi="Times New Roman" w:eastAsia="楷体" w:cs="Times New Roman"/>
+          <w:b w:val="0"/>
+          <w:bCs w:val="0"/>
+          <w:color w:val="auto"/>
+          <w:w w:val="105"/>
+          <w:sz w:val="21"/>
+          <w:szCs w:val="21"/>
+          <w:lang w:val="en-US" w:eastAsia="zh-CN" w:bidi="ar-SA"/>
+        </w:rPr>
+        <w:t>RAG</w:t>
+      </w:r>
+      <w:r>
+        <w:rPr>
+          <w:rFonts w:hint="eastAsia" w:ascii="楷体" w:hAnsi="楷体" w:eastAsia="楷体" w:cs="楷体"/>
+          <w:color w:val="auto"/>
+          <w:spacing w:val="-3"/>
+          <w:kern w:val="4"/>
+          <w:sz w:val="21"/>
+          <w:szCs w:val="21"/>
+          <w:lang w:val="en-US" w:eastAsia="zh-CN" w:bidi="ar-SA"/>
+        </w:rPr>
+        <w:t>技术，实现了</w:t>
       </w:r>
       <w:r>
         <w:rPr>
@@ -2429,7 +3462,107 @@
           <w:szCs w:val="21"/>
           <w:lang w:val="en-US" w:eastAsia="zh-CN" w:bidi="ar-SA"/>
         </w:rPr>
-        <w:t>，显著提升了机器人的智能化交互水平；同时利用 YOLOv8 训练定制化视觉模型，结合 Intel RealSense 深度相机实现多目标识别与 3D 空间定位；所有工作均部署在Intel开发板上。</w:t>
+        <w:t xml:space="preserve">，显著提升了机器人的智能化交互水平；同时利用 </w:t>
+      </w:r>
+      <w:r>
+        <w:rPr>
+          <w:rFonts w:hint="eastAsia" w:ascii="Times New Roman" w:hAnsi="Times New Roman" w:eastAsia="楷体" w:cs="Times New Roman"/>
+          <w:b w:val="0"/>
+          <w:bCs w:val="0"/>
+          <w:color w:val="auto"/>
+          <w:w w:val="105"/>
+          <w:sz w:val="21"/>
+          <w:szCs w:val="21"/>
+          <w:lang w:val="en-US" w:eastAsia="zh-CN" w:bidi="ar-SA"/>
+        </w:rPr>
+        <w:t>YOLOv8</w:t>
+      </w:r>
+      <w:r>
+        <w:rPr>
+          <w:rFonts w:hint="eastAsia" w:ascii="楷体" w:hAnsi="楷体" w:eastAsia="楷体" w:cs="楷体"/>
+          <w:color w:val="auto"/>
+          <w:spacing w:val="-3"/>
+          <w:kern w:val="4"/>
+          <w:sz w:val="21"/>
+          <w:szCs w:val="21"/>
+          <w:lang w:val="en-US" w:eastAsia="zh-CN" w:bidi="ar-SA"/>
+        </w:rPr>
+        <w:t xml:space="preserve"> 训练定制化视觉模型，结合</w:t>
+      </w:r>
+      <w:r>
+        <w:rPr>
+          <w:rFonts w:hint="eastAsia" w:ascii="Times New Roman" w:hAnsi="Times New Roman" w:eastAsia="楷体" w:cs="Times New Roman"/>
+          <w:b w:val="0"/>
+          <w:bCs w:val="0"/>
+          <w:color w:val="auto"/>
+          <w:w w:val="105"/>
+          <w:sz w:val="21"/>
+          <w:szCs w:val="21"/>
+          <w:lang w:val="en-US" w:eastAsia="zh-CN" w:bidi="ar-SA"/>
+        </w:rPr>
+        <w:t xml:space="preserve"> Intel RealSense </w:t>
+      </w:r>
+      <w:r>
+        <w:rPr>
+          <w:rFonts w:hint="eastAsia" w:ascii="楷体" w:hAnsi="楷体" w:eastAsia="楷体" w:cs="楷体"/>
+          <w:color w:val="auto"/>
+          <w:spacing w:val="-3"/>
+          <w:kern w:val="4"/>
+          <w:sz w:val="21"/>
+          <w:szCs w:val="21"/>
+          <w:lang w:val="en-US" w:eastAsia="zh-CN" w:bidi="ar-SA"/>
+        </w:rPr>
+        <w:t>深度相机实现多目标识别与</w:t>
+      </w:r>
+      <w:r>
+        <w:rPr>
+          <w:rFonts w:hint="eastAsia" w:ascii="Times New Roman" w:hAnsi="Times New Roman" w:eastAsia="楷体" w:cs="Times New Roman"/>
+          <w:b w:val="0"/>
+          <w:bCs w:val="0"/>
+          <w:color w:val="auto"/>
+          <w:w w:val="105"/>
+          <w:sz w:val="21"/>
+          <w:szCs w:val="21"/>
+          <w:lang w:val="en-US" w:eastAsia="zh-CN" w:bidi="ar-SA"/>
+        </w:rPr>
+        <w:t xml:space="preserve"> 3D </w:t>
+      </w:r>
+      <w:r>
+        <w:rPr>
+          <w:rFonts w:hint="eastAsia" w:ascii="楷体" w:hAnsi="楷体" w:eastAsia="楷体" w:cs="楷体"/>
+          <w:color w:val="auto"/>
+          <w:spacing w:val="-3"/>
+          <w:kern w:val="4"/>
+          <w:sz w:val="21"/>
+          <w:szCs w:val="21"/>
+          <w:lang w:val="en-US" w:eastAsia="zh-CN" w:bidi="ar-SA"/>
+        </w:rPr>
+        <w:t xml:space="preserve">空间定位；所有工作均部署在 </w:t>
+      </w:r>
+      <w:r>
+        <w:rPr>
+          <w:rFonts w:hint="eastAsia" w:ascii="Times New Roman" w:hAnsi="Times New Roman" w:eastAsia="楷体" w:cs="Times New Roman"/>
+          <w:b w:val="0"/>
+          <w:bCs w:val="0"/>
+          <w:color w:val="auto"/>
+          <w:w w:val="105"/>
+          <w:sz w:val="21"/>
+          <w:szCs w:val="21"/>
+          <w:lang w:val="en-US" w:eastAsia="zh-CN" w:bidi="ar-SA"/>
+        </w:rPr>
+        <w:t xml:space="preserve">Intel </w:t>
+      </w:r>
+      <w:r>
+        <w:rPr>
+          <w:rFonts w:hint="eastAsia" w:ascii="楷体" w:hAnsi="楷体" w:eastAsia="楷体" w:cs="楷体"/>
+          <w:color w:val="auto"/>
+          <w:spacing w:val="-3"/>
+          <w:kern w:val="4"/>
+          <w:sz w:val="21"/>
+          <w:szCs w:val="21"/>
+          <w:lang w:val="en-US" w:eastAsia="zh-CN" w:bidi="ar-SA"/>
+        </w:rPr>
+        <w:t>开发板上。</w:t>
       </w:r>
     </w:p>
     <w:p>
@@ -2537,7 +3670,119 @@
           <w:szCs w:val="21"/>
           <w:lang w:val="en-US" w:eastAsia="zh-CN"/>
         </w:rPr>
-        <w:t>《仪捷通实验室管理平台 V1.0》          登记号：2026SR0226376        第一发明人             2026年2月授权</w:t>
+        <w:t xml:space="preserve">《仪捷通实验室管理平台 </w:t>
+      </w:r>
+      <w:r>
+        <w:rPr>
+          <w:rFonts w:hint="eastAsia" w:ascii="Times New Roman" w:hAnsi="Times New Roman" w:eastAsia="楷体" w:cs="Times New Roman"/>
+          <w:b/>
+          <w:bCs/>
+          <w:color w:val="auto"/>
+          <w:spacing w:val="-3"/>
+          <w:kern w:val="4"/>
+          <w:sz w:val="21"/>
+          <w:szCs w:val="21"/>
+          <w:lang w:val="en-US" w:eastAsia="zh-CN"/>
+        </w:rPr>
+        <w:t xml:space="preserve">V1.0 </w:t>
+      </w:r>
+      <w:r>
+        <w:rPr>
+          <w:rFonts w:hint="eastAsia" w:ascii="楷体" w:hAnsi="楷体" w:eastAsia="楷体" w:cs="楷体"/>
+          <w:b/>
+          <w:bCs/>
+          <w:color w:val="auto"/>
+          <w:spacing w:val="-3"/>
+          <w:kern w:val="4"/>
+          <w:sz w:val="21"/>
+          <w:szCs w:val="21"/>
+          <w:lang w:val="en-US" w:eastAsia="zh-CN"/>
+        </w:rPr>
+        <w:t>》          登记号：</w:t>
+      </w:r>
+      <w:r>
+        <w:rPr>
+          <w:rFonts w:hint="eastAsia" w:ascii="Times New Roman" w:hAnsi="Times New Roman" w:eastAsia="楷体" w:cs="Times New Roman"/>
+          <w:b/>
+          <w:bCs/>
+          <w:color w:val="auto"/>
+          <w:spacing w:val="-3"/>
+          <w:kern w:val="4"/>
+          <w:sz w:val="21"/>
+          <w:szCs w:val="21"/>
+          <w:lang w:val="en-US" w:eastAsia="zh-CN"/>
+        </w:rPr>
+        <w:t>2026SR0226376</w:t>
+      </w:r>
+      <w:r>
+        <w:rPr>
+          <w:rFonts w:hint="eastAsia" w:ascii="楷体" w:hAnsi="楷体" w:eastAsia="楷体" w:cs="楷体"/>
+          <w:b/>
+          <w:bCs/>
+          <w:color w:val="auto"/>
+          <w:spacing w:val="-3"/>
+          <w:kern w:val="4"/>
+          <w:sz w:val="21"/>
+          <w:szCs w:val="21"/>
+          <w:lang w:val="en-US" w:eastAsia="zh-CN"/>
+        </w:rPr>
+        <w:t xml:space="preserve">        第一发明人            </w:t>
+      </w:r>
+      <w:r>
+        <w:rPr>
+          <w:rFonts w:hint="eastAsia" w:ascii="Times New Roman" w:hAnsi="Times New Roman" w:eastAsia="楷体" w:cs="Times New Roman"/>
+          <w:b/>
+          <w:bCs/>
+          <w:color w:val="auto"/>
+          <w:spacing w:val="-3"/>
+          <w:kern w:val="4"/>
+          <w:sz w:val="21"/>
+          <w:szCs w:val="21"/>
+          <w:lang w:val="en-US" w:eastAsia="zh-CN"/>
+        </w:rPr>
+        <w:t xml:space="preserve"> 2026</w:t>
+      </w:r>
+      <w:r>
+        <w:rPr>
+          <w:rFonts w:hint="eastAsia" w:ascii="楷体" w:hAnsi="楷体" w:eastAsia="楷体" w:cs="楷体"/>
+          <w:b/>
+          <w:bCs/>
+          <w:color w:val="auto"/>
+          <w:spacing w:val="-3"/>
+          <w:kern w:val="4"/>
+          <w:sz w:val="21"/>
+          <w:szCs w:val="21"/>
+          <w:lang w:val="en-US" w:eastAsia="zh-CN"/>
+        </w:rPr>
+        <w:t>年</w:t>
+      </w:r>
+      <w:r>
+        <w:rPr>
+          <w:rFonts w:hint="eastAsia" w:ascii="Times New Roman" w:hAnsi="Times New Roman" w:eastAsia="楷体" w:cs="Times New Roman"/>
+          <w:b/>
+          <w:bCs/>
+          <w:color w:val="auto"/>
+          <w:spacing w:val="-3"/>
+          <w:kern w:val="4"/>
+          <w:sz w:val="21"/>
+          <w:szCs w:val="21"/>
+          <w:lang w:val="en-US" w:eastAsia="zh-CN"/>
+        </w:rPr>
+        <w:t>2</w:t>
+      </w:r>
+      <w:r>
+        <w:rPr>
+          <w:rFonts w:hint="eastAsia" w:ascii="楷体" w:hAnsi="楷体" w:eastAsia="楷体" w:cs="楷体"/>
+          <w:b/>
+          <w:bCs/>
+          <w:color w:val="auto"/>
+          <w:spacing w:val="-3"/>
+          <w:kern w:val="4"/>
+          <w:sz w:val="21"/>
+          <w:szCs w:val="21"/>
+          <w:lang w:val="en-US" w:eastAsia="zh-CN"/>
+        </w:rPr>
+        <w:t>月授权</w:t>
       </w:r>
     </w:p>
     <w:p>
@@ -2748,6 +3993,20 @@
       </w:pPr>
       <w:r>
         <w:rPr>
+          <w:rFonts w:hint="eastAsia" w:ascii="Times New Roman" w:hAnsi="Times New Roman" w:eastAsia="楷体" w:cs="Times New Roman"/>
+          <w:b/>
+          <w:bCs/>
+          <w:color w:val="auto"/>
+          <w:spacing w:val="-3"/>
+          <w:kern w:val="4"/>
+          <w:sz w:val="21"/>
+          <w:szCs w:val="21"/>
+          <w:lang w:val="en-US" w:eastAsia="zh-CN"/>
+        </w:rPr>
+        <w:t>2025.01</w:t>
+      </w:r>
+      <w:r>
+        <w:rPr>
           <w:rFonts w:hint="eastAsia" w:ascii="Times New Roman" w:hAnsi="Times New Roman" w:eastAsia="楷体"/>
           <w:b/>
           <w:bCs/>
@@ -2757,7 +4016,21 @@
           <w:szCs w:val="21"/>
           <w:lang w:val="en-US" w:eastAsia="zh-CN"/>
         </w:rPr>
-        <w:t>2025.01</w:t>
+        <w:tab/>
+      </w:r>
+      <w:r>
+        <w:rPr>
+          <w:rFonts w:hint="eastAsia" w:ascii="楷体" w:hAnsi="楷体" w:eastAsia="楷体" w:cs="楷体"/>
+          <w:b/>
+          <w:bCs/>
+          <w:color w:val="auto"/>
+          <w:spacing w:val="-3"/>
+          <w:kern w:val="4"/>
+          <w:sz w:val="21"/>
+          <w:szCs w:val="21"/>
+          <w:lang w:val="en-US" w:eastAsia="zh-CN"/>
+        </w:rPr>
+        <w:t>美国（国际）大学生数学建模竞赛</w:t>
       </w:r>
       <w:r>
         <w:rPr>
@@ -2774,20 +4047,6 @@
       </w:r>
       <w:r>
         <w:rPr>
-          <w:rFonts w:hint="eastAsia" w:ascii="楷体" w:hAnsi="楷体" w:eastAsia="楷体" w:cs="楷体"/>
-          <w:b/>
-          <w:bCs/>
-          <w:color w:val="auto"/>
-          <w:spacing w:val="-3"/>
-          <w:kern w:val="4"/>
-          <w:sz w:val="21"/>
-          <w:szCs w:val="21"/>
-          <w:lang w:val="en-US" w:eastAsia="zh-CN"/>
-        </w:rPr>
-        <w:t>美国（国际）大学生数学建模竞赛</w:t>
-      </w:r>
-      <w:r>
-        <w:rPr>
           <w:rFonts w:hint="eastAsia" w:ascii="Times New Roman" w:hAnsi="Times New Roman" w:eastAsia="楷体"/>
           <w:b/>
           <w:bCs/>
@@ -2801,30 +4060,30 @@
       </w:r>
       <w:r>
         <w:rPr>
-          <w:rFonts w:hint="eastAsia" w:ascii="Times New Roman" w:hAnsi="Times New Roman" w:eastAsia="楷体"/>
-          <w:b/>
-          <w:bCs/>
-          <w:color w:val="auto"/>
-          <w:w w:val="105"/>
-          <w:sz w:val="21"/>
-          <w:szCs w:val="21"/>
-          <w:lang w:val="en-US" w:eastAsia="zh-CN"/>
-        </w:rPr>
-        <w:tab/>
-      </w:r>
-      <w:r>
-        <w:rPr>
-          <w:rFonts w:hint="eastAsia" w:ascii="楷体" w:hAnsi="楷体" w:eastAsia="楷体" w:cs="楷体"/>
-          <w:b/>
-          <w:bCs/>
-          <w:color w:val="auto"/>
-          <w:spacing w:val="-3"/>
-          <w:kern w:val="4"/>
-          <w:sz w:val="21"/>
-          <w:szCs w:val="21"/>
-          <w:lang w:val="en-US" w:eastAsia="zh-CN"/>
-        </w:rPr>
-        <w:t>O奖(特等奖，前0.16%)</w:t>
+          <w:rFonts w:hint="eastAsia" w:ascii="Times New Roman" w:hAnsi="Times New Roman" w:eastAsia="楷体" w:cs="Times New Roman"/>
+          <w:b/>
+          <w:bCs/>
+          <w:color w:val="auto"/>
+          <w:w w:val="105"/>
+          <w:sz w:val="21"/>
+          <w:szCs w:val="21"/>
+          <w:lang w:val="en-US" w:eastAsia="zh-CN"/>
+        </w:rPr>
+        <w:t>O</w:t>
+      </w:r>
+      <w:r>
+        <w:rPr>
+          <w:rFonts w:hint="eastAsia" w:ascii="楷体" w:hAnsi="楷体" w:eastAsia="楷体" w:cs="楷体"/>
+          <w:b/>
+          <w:bCs/>
+          <w:color w:val="auto"/>
+          <w:spacing w:val="-3"/>
+          <w:kern w:val="4"/>
+          <w:sz w:val="21"/>
+          <w:szCs w:val="21"/>
+          <w:lang w:val="en-US" w:eastAsia="zh-CN"/>
+        </w:rPr>
+        <w:t>奖(特等奖，前0.16%)</w:t>
       </w:r>
       <w:r>
         <w:rPr>
@@ -2932,124 +4191,202 @@
           <w:szCs w:val="21"/>
           <w:lang w:val="en-US" w:eastAsia="zh-CN" w:bidi="ar-SA"/>
         </w:rPr>
-        <w:t>负责竞赛主要模型构建与部分代码实现。针对奖牌榜“零奖牌”截断数据及异方差问题，构建了TMH-OMP 模型（结合</w:t>
-      </w:r>
-      <w:r>
-        <w:rPr>
-          <w:rFonts w:hint="eastAsia" w:ascii="楷体" w:hAnsi="楷体" w:eastAsia="楷体" w:cs="楷体"/>
-          <w:b/>
-          <w:bCs/>
+        <w:t>负责竞赛主要模型构建与部分代码实现。针对奖牌榜“零奖牌”截断数据及异方差问题，构建了</w:t>
+      </w:r>
+      <w:r>
+        <w:rPr>
+          <w:rFonts w:hint="eastAsia" w:ascii="Times New Roman" w:hAnsi="Times New Roman" w:eastAsia="楷体" w:cs="Times New Roman"/>
+          <w:b/>
+          <w:bCs/>
+          <w:color w:val="auto"/>
+          <w:w w:val="105"/>
+          <w:sz w:val="21"/>
+          <w:szCs w:val="21"/>
+          <w:lang w:val="en-US" w:eastAsia="zh-CN" w:bidi="ar-SA"/>
+        </w:rPr>
+        <w:t>TMH-OMP</w:t>
+      </w:r>
+      <w:r>
+        <w:rPr>
+          <w:rFonts w:hint="eastAsia" w:ascii="楷体" w:hAnsi="楷体" w:eastAsia="楷体" w:cs="楷体"/>
+          <w:b w:val="0"/>
+          <w:bCs w:val="0"/>
           <w:spacing w:val="-6"/>
           <w:kern w:val="2"/>
           <w:sz w:val="21"/>
           <w:szCs w:val="21"/>
           <w:lang w:val="en-US" w:eastAsia="zh-CN" w:bidi="ar-SA"/>
         </w:rPr>
-        <w:t>Mundlak 修正</w:t>
-      </w:r>
-      <w:r>
-        <w:rPr>
-          <w:rFonts w:hint="eastAsia" w:ascii="楷体" w:hAnsi="楷体" w:eastAsia="楷体" w:cs="楷体"/>
-          <w:b w:val="0"/>
-          <w:bCs w:val="0"/>
+        <w:t xml:space="preserve"> 模型（结合</w:t>
+      </w:r>
+      <w:r>
+        <w:rPr>
+          <w:rFonts w:hint="eastAsia" w:ascii="Times New Roman" w:hAnsi="Times New Roman" w:eastAsia="楷体" w:cs="Times New Roman"/>
+          <w:b/>
+          <w:bCs/>
+          <w:color w:val="auto"/>
+          <w:w w:val="105"/>
+          <w:sz w:val="21"/>
+          <w:szCs w:val="21"/>
+          <w:lang w:val="en-US" w:eastAsia="zh-CN" w:bidi="ar-SA"/>
+        </w:rPr>
+        <w:t>Mundlak</w:t>
+      </w:r>
+      <w:r>
+        <w:rPr>
+          <w:rFonts w:hint="eastAsia" w:ascii="楷体" w:hAnsi="楷体" w:eastAsia="楷体" w:cs="楷体"/>
+          <w:b/>
+          <w:bCs/>
           <w:spacing w:val="-6"/>
           <w:kern w:val="2"/>
           <w:sz w:val="21"/>
           <w:szCs w:val="21"/>
           <w:lang w:val="en-US" w:eastAsia="zh-CN" w:bidi="ar-SA"/>
         </w:rPr>
-        <w:t>、</w:t>
-      </w:r>
-      <w:r>
-        <w:rPr>
-          <w:rFonts w:hint="eastAsia" w:ascii="楷体" w:hAnsi="楷体" w:eastAsia="楷体" w:cs="楷体"/>
-          <w:b/>
-          <w:bCs/>
+        <w:t xml:space="preserve"> 修正</w:t>
+      </w:r>
+      <w:r>
+        <w:rPr>
+          <w:rFonts w:hint="eastAsia" w:ascii="楷体" w:hAnsi="楷体" w:eastAsia="楷体" w:cs="楷体"/>
+          <w:b w:val="0"/>
+          <w:bCs w:val="0"/>
           <w:spacing w:val="-6"/>
           <w:kern w:val="2"/>
           <w:sz w:val="21"/>
           <w:szCs w:val="21"/>
           <w:lang w:val="en-US" w:eastAsia="zh-CN" w:bidi="ar-SA"/>
         </w:rPr>
-        <w:t>Tobit 回归</w:t>
-      </w:r>
-      <w:r>
-        <w:rPr>
-          <w:rFonts w:hint="eastAsia" w:ascii="楷体" w:hAnsi="楷体" w:eastAsia="楷体" w:cs="楷体"/>
-          <w:b w:val="0"/>
-          <w:bCs w:val="0"/>
+        <w:t>、</w:t>
+      </w:r>
+      <w:r>
+        <w:rPr>
+          <w:rFonts w:hint="eastAsia" w:ascii="Times New Roman" w:hAnsi="Times New Roman" w:eastAsia="楷体" w:cs="Times New Roman"/>
+          <w:b/>
+          <w:bCs/>
+          <w:color w:val="auto"/>
+          <w:w w:val="105"/>
+          <w:sz w:val="21"/>
+          <w:szCs w:val="21"/>
+          <w:lang w:val="en-US" w:eastAsia="zh-CN" w:bidi="ar-SA"/>
+        </w:rPr>
+        <w:t>Tobit</w:t>
+      </w:r>
+      <w:r>
+        <w:rPr>
+          <w:rFonts w:hint="eastAsia" w:ascii="楷体" w:hAnsi="楷体" w:eastAsia="楷体" w:cs="楷体"/>
+          <w:b/>
+          <w:bCs/>
           <w:spacing w:val="-6"/>
           <w:kern w:val="2"/>
           <w:sz w:val="21"/>
           <w:szCs w:val="21"/>
           <w:lang w:val="en-US" w:eastAsia="zh-CN" w:bidi="ar-SA"/>
         </w:rPr>
-        <w:t xml:space="preserve">与 </w:t>
-      </w:r>
-      <w:r>
-        <w:rPr>
-          <w:rFonts w:hint="eastAsia" w:ascii="楷体" w:hAnsi="楷体" w:eastAsia="楷体" w:cs="楷体"/>
-          <w:b/>
-          <w:bCs/>
+        <w:t xml:space="preserve"> 回归</w:t>
+      </w:r>
+      <w:r>
+        <w:rPr>
+          <w:rFonts w:hint="eastAsia" w:ascii="楷体" w:hAnsi="楷体" w:eastAsia="楷体" w:cs="楷体"/>
+          <w:b w:val="0"/>
+          <w:bCs w:val="0"/>
           <w:spacing w:val="-6"/>
           <w:kern w:val="2"/>
           <w:sz w:val="21"/>
           <w:szCs w:val="21"/>
           <w:lang w:val="en-US" w:eastAsia="zh-CN" w:bidi="ar-SA"/>
         </w:rPr>
-        <w:t>Hurdle 模型</w:t>
-      </w:r>
-      <w:r>
-        <w:rPr>
-          <w:rFonts w:hint="eastAsia" w:ascii="楷体" w:hAnsi="楷体" w:eastAsia="楷体" w:cs="楷体"/>
-          <w:b w:val="0"/>
-          <w:bCs w:val="0"/>
+        <w:t xml:space="preserve">与 </w:t>
+      </w:r>
+      <w:r>
+        <w:rPr>
+          <w:rFonts w:hint="eastAsia" w:ascii="Times New Roman" w:hAnsi="Times New Roman" w:eastAsia="楷体" w:cs="Times New Roman"/>
+          <w:b/>
+          <w:bCs/>
+          <w:color w:val="auto"/>
+          <w:w w:val="105"/>
+          <w:sz w:val="21"/>
+          <w:szCs w:val="21"/>
+          <w:lang w:val="en-US" w:eastAsia="zh-CN" w:bidi="ar-SA"/>
+        </w:rPr>
+        <w:t>Hurdle</w:t>
+      </w:r>
+      <w:r>
+        <w:rPr>
+          <w:rFonts w:hint="eastAsia" w:ascii="楷体" w:hAnsi="楷体" w:eastAsia="楷体" w:cs="楷体"/>
+          <w:b/>
+          <w:bCs/>
           <w:spacing w:val="-6"/>
           <w:kern w:val="2"/>
           <w:sz w:val="21"/>
           <w:szCs w:val="21"/>
           <w:lang w:val="en-US" w:eastAsia="zh-CN" w:bidi="ar-SA"/>
         </w:rPr>
-        <w:t>），预测精度突破 79%；针对“名帅效应”评估，独立构建基于</w:t>
-      </w:r>
-      <w:r>
-        <w:rPr>
-          <w:rFonts w:hint="eastAsia" w:ascii="楷体" w:hAnsi="楷体" w:eastAsia="楷体" w:cs="楷体"/>
-          <w:b/>
-          <w:bCs/>
+        <w:t xml:space="preserve"> 模型</w:t>
+      </w:r>
+      <w:r>
+        <w:rPr>
+          <w:rFonts w:hint="eastAsia" w:ascii="楷体" w:hAnsi="楷体" w:eastAsia="楷体" w:cs="楷体"/>
+          <w:b w:val="0"/>
+          <w:bCs w:val="0"/>
           <w:spacing w:val="-6"/>
           <w:kern w:val="2"/>
           <w:sz w:val="21"/>
           <w:szCs w:val="21"/>
           <w:lang w:val="en-US" w:eastAsia="zh-CN" w:bidi="ar-SA"/>
         </w:rPr>
-        <w:t>双重稳健估计器(</w:t>
-      </w:r>
-      <w:r>
-        <w:rPr>
-          <w:rFonts w:hint="eastAsia" w:ascii="楷体" w:hAnsi="楷体" w:eastAsia="楷体" w:cs="楷体"/>
-          <w:b w:val="0"/>
-          <w:bCs w:val="0"/>
+        <w:t>），预测精度突破 79%；针对“名帅效应”评估，独立构建基于</w:t>
+      </w:r>
+      <w:r>
+        <w:rPr>
+          <w:rFonts w:hint="eastAsia" w:ascii="楷体" w:hAnsi="楷体" w:eastAsia="楷体" w:cs="楷体"/>
+          <w:b/>
+          <w:bCs/>
           <w:spacing w:val="-6"/>
           <w:kern w:val="2"/>
           <w:sz w:val="21"/>
           <w:szCs w:val="21"/>
           <w:lang w:val="en-US" w:eastAsia="zh-CN" w:bidi="ar-SA"/>
         </w:rPr>
-        <w:t>Double Robust Estimator)框架的DRD-CE模型 ，创新性融合</w:t>
-      </w:r>
-      <w:r>
-        <w:rPr>
-          <w:rFonts w:hint="eastAsia" w:ascii="楷体" w:hAnsi="楷体" w:eastAsia="楷体" w:cs="楷体"/>
-          <w:b/>
-          <w:bCs/>
+        <w:t>双重稳健估计器(</w:t>
+      </w:r>
+      <w:r>
+        <w:rPr>
+          <w:rFonts w:hint="eastAsia" w:ascii="Times New Roman" w:hAnsi="Times New Roman" w:eastAsia="楷体" w:cs="Times New Roman"/>
+          <w:b/>
+          <w:bCs/>
+          <w:color w:val="auto"/>
+          <w:w w:val="105"/>
+          <w:sz w:val="21"/>
+          <w:szCs w:val="21"/>
+          <w:lang w:val="en-US" w:eastAsia="zh-CN" w:bidi="ar-SA"/>
+        </w:rPr>
+        <w:t>Double Robust Estimator</w:t>
+      </w:r>
+      <w:r>
+        <w:rPr>
+          <w:rFonts w:hint="eastAsia" w:ascii="楷体" w:hAnsi="楷体" w:eastAsia="楷体" w:cs="楷体"/>
+          <w:b w:val="0"/>
+          <w:bCs w:val="0"/>
           <w:spacing w:val="-6"/>
           <w:kern w:val="2"/>
           <w:sz w:val="21"/>
           <w:szCs w:val="21"/>
           <w:lang w:val="en-US" w:eastAsia="zh-CN" w:bidi="ar-SA"/>
         </w:rPr>
-        <w:t>动态双重差分法</w:t>
+        <w:t>)框架的</w:t>
+      </w:r>
+      <w:r>
+        <w:rPr>
+          <w:rFonts w:hint="eastAsia" w:ascii="Times New Roman" w:hAnsi="Times New Roman" w:eastAsia="楷体" w:cs="Times New Roman"/>
+          <w:b/>
+          <w:bCs/>
+          <w:color w:val="auto"/>
+          <w:w w:val="105"/>
+          <w:sz w:val="21"/>
+          <w:szCs w:val="21"/>
+          <w:lang w:val="en-US" w:eastAsia="zh-CN" w:bidi="ar-SA"/>
+        </w:rPr>
+        <w:t>DRD-CE</w:t>
       </w:r>
       <w:r>
         <w:rPr>
@@ -3062,7 +4399,7 @@
           <w:szCs w:val="21"/>
           <w:lang w:val="en-US" w:eastAsia="zh-CN" w:bidi="ar-SA"/>
         </w:rPr>
-        <w:t>(Dynamic DID)与</w:t>
+        <w:t>模型 ，创新性融合</w:t>
       </w:r>
       <w:r>
         <w:rPr>
@@ -3075,7 +4412,7 @@
           <w:szCs w:val="21"/>
           <w:lang w:val="en-US" w:eastAsia="zh-CN" w:bidi="ar-SA"/>
         </w:rPr>
-        <w:t>逆概率加权</w:t>
+        <w:t>动态双重差分法</w:t>
       </w:r>
       <w:r>
         <w:rPr>
@@ -3088,7 +4425,85 @@
           <w:szCs w:val="21"/>
           <w:lang w:val="en-US" w:eastAsia="zh-CN" w:bidi="ar-SA"/>
         </w:rPr>
-        <w:t>(IPW) ，精准量化名帅对奖牌分布的贡献度</w:t>
+        <w:t>(</w:t>
+      </w:r>
+      <w:r>
+        <w:rPr>
+          <w:rFonts w:hint="eastAsia" w:ascii="Times New Roman" w:hAnsi="Times New Roman" w:eastAsia="楷体" w:cs="Times New Roman"/>
+          <w:b/>
+          <w:bCs/>
+          <w:color w:val="auto"/>
+          <w:w w:val="105"/>
+          <w:sz w:val="21"/>
+          <w:szCs w:val="21"/>
+          <w:lang w:val="en-US" w:eastAsia="zh-CN" w:bidi="ar-SA"/>
+        </w:rPr>
+        <w:t>Dynamic DID</w:t>
+      </w:r>
+      <w:r>
+        <w:rPr>
+          <w:rFonts w:hint="eastAsia" w:ascii="楷体" w:hAnsi="楷体" w:eastAsia="楷体" w:cs="楷体"/>
+          <w:b w:val="0"/>
+          <w:bCs w:val="0"/>
+          <w:spacing w:val="-6"/>
+          <w:kern w:val="2"/>
+          <w:sz w:val="21"/>
+          <w:szCs w:val="21"/>
+          <w:lang w:val="en-US" w:eastAsia="zh-CN" w:bidi="ar-SA"/>
+        </w:rPr>
+        <w:t>)与</w:t>
+      </w:r>
+      <w:r>
+        <w:rPr>
+          <w:rFonts w:hint="eastAsia" w:ascii="楷体" w:hAnsi="楷体" w:eastAsia="楷体" w:cs="楷体"/>
+          <w:b/>
+          <w:bCs/>
+          <w:spacing w:val="-6"/>
+          <w:kern w:val="2"/>
+          <w:sz w:val="21"/>
+          <w:szCs w:val="21"/>
+          <w:lang w:val="en-US" w:eastAsia="zh-CN" w:bidi="ar-SA"/>
+        </w:rPr>
+        <w:t>逆概率加权</w:t>
+      </w:r>
+      <w:r>
+        <w:rPr>
+          <w:rFonts w:hint="eastAsia" w:ascii="楷体" w:hAnsi="楷体" w:eastAsia="楷体" w:cs="楷体"/>
+          <w:b w:val="0"/>
+          <w:bCs w:val="0"/>
+          <w:spacing w:val="-6"/>
+          <w:kern w:val="2"/>
+          <w:sz w:val="21"/>
+          <w:szCs w:val="21"/>
+          <w:lang w:val="en-US" w:eastAsia="zh-CN" w:bidi="ar-SA"/>
+        </w:rPr>
+        <w:t>(</w:t>
+      </w:r>
+      <w:r>
+        <w:rPr>
+          <w:rFonts w:hint="eastAsia" w:ascii="Times New Roman" w:hAnsi="Times New Roman" w:eastAsia="楷体" w:cs="Times New Roman"/>
+          <w:b/>
+          <w:bCs/>
+          <w:color w:val="auto"/>
+          <w:w w:val="105"/>
+          <w:sz w:val="21"/>
+          <w:szCs w:val="21"/>
+          <w:lang w:val="en-US" w:eastAsia="zh-CN" w:bidi="ar-SA"/>
+        </w:rPr>
+        <w:t>IPW</w:t>
+      </w:r>
+      <w:r>
+        <w:rPr>
+          <w:rFonts w:hint="eastAsia" w:ascii="楷体" w:hAnsi="楷体" w:eastAsia="楷体" w:cs="楷体"/>
+          <w:b w:val="0"/>
+          <w:bCs w:val="0"/>
+          <w:spacing w:val="-6"/>
+          <w:kern w:val="2"/>
+          <w:sz w:val="21"/>
+          <w:szCs w:val="21"/>
+          <w:lang w:val="en-US" w:eastAsia="zh-CN" w:bidi="ar-SA"/>
+        </w:rPr>
+        <w:t>) ，精准量化名帅对奖牌分布的贡献度</w:t>
       </w:r>
       <w:r>
         <w:rPr>
@@ -3177,56 +4592,6 @@
           <w:lang w:val="en-US" w:eastAsia="zh-CN" w:bidi="ar-SA"/>
         </w:rPr>
         <w:fldChar w:fldCharType="end"/>
-      </w:r>
-    </w:p>
-    <w:p>
-      <w:pPr>
-        <w:pStyle w:val="3"/>
-        <w:keepNext w:val="0"/>
-        <w:keepLines w:val="0"/>
-        <w:pageBreakBefore w:val="0"/>
-        <w:widowControl w:val="0"/>
-        <w:tabs>
-          <w:tab w:val="left" w:pos="3544"/>
-          <w:tab w:val="left" w:pos="10722"/>
-        </w:tabs>
-        <w:kinsoku/>
-        <w:wordWrap/>
-        <w:overflowPunct/>
-        <w:topLinePunct w:val="0"/>
-        <w:autoSpaceDE w:val="0"/>
-        <w:autoSpaceDN w:val="0"/>
-        <w:bidi w:val="0"/>
-        <w:adjustRightInd/>
-        <w:snapToGrid/>
-        <w:spacing w:before="120" w:line="240" w:lineRule="auto"/>
-        <w:ind w:left="102"/>
-        <w:textAlignment w:val="auto"/>
-        <w:rPr>
-          <w:rFonts w:hint="eastAsia" w:ascii="楷体" w:hAnsi="楷体" w:eastAsia="楷体" w:cs="楷体"/>
-          <w:b/>
-          <w:bCs/>
-          <w:color w:val="auto"/>
-          <w:spacing w:val="-3"/>
-          <w:kern w:val="4"/>
-          <w:sz w:val="21"/>
-          <w:szCs w:val="21"/>
-          <w:lang w:val="en-US" w:eastAsia="zh-CN" w:bidi="ar-SA"/>
-        </w:rPr>
-      </w:pPr>
-      <w:r>
-        <w:rPr>
-          <w:rFonts w:hint="eastAsia" w:ascii="楷体" w:hAnsi="楷体" w:eastAsia="楷体" w:cs="楷体"/>
-          <w:b/>
-          <w:bCs/>
-          <w:color w:val="auto"/>
-          <w:spacing w:val="-3"/>
-          <w:kern w:val="4"/>
-          <w:sz w:val="21"/>
-          <w:szCs w:val="21"/>
-          <w:lang w:val="en-US" w:eastAsia="zh-CN" w:bidi="ar-SA"/>
-        </w:rPr>
-        <w:t>区域级/省级获奖</w:t>
       </w:r>
     </w:p>
     <w:p>
@@ -3262,203 +4627,179 @@
         <w:textAlignment w:val="auto"/>
         <w:rPr>
           <w:rFonts w:hint="eastAsia" w:ascii="楷体" w:hAnsi="楷体" w:eastAsia="楷体" w:cs="楷体"/>
-          <w:b/>
-          <w:bCs/>
-          <w:color w:val="auto"/>
-          <w:spacing w:val="-3"/>
-          <w:kern w:val="4"/>
-          <w:sz w:val="21"/>
-          <w:szCs w:val="21"/>
-          <w:lang w:val="en-US" w:eastAsia="zh-CN"/>
-        </w:rPr>
-      </w:pPr>
-      <w:r>
-        <w:rPr>
-          <w:rFonts w:hint="eastAsia" w:ascii="Times New Roman" w:hAnsi="Times New Roman" w:eastAsia="楷体"/>
-          <w:b/>
-          <w:bCs/>
-          <w:color w:val="auto"/>
-          <w:w w:val="105"/>
-          <w:sz w:val="21"/>
-          <w:szCs w:val="21"/>
-          <w:lang w:val="en-US" w:eastAsia="zh-CN"/>
-        </w:rPr>
-        <w:t>2025.07</w:t>
-      </w:r>
-      <w:r>
-        <w:rPr>
-          <w:rFonts w:hint="eastAsia" w:ascii="Times New Roman" w:hAnsi="Times New Roman" w:eastAsia="楷体"/>
-          <w:b/>
-          <w:bCs/>
-          <w:color w:val="auto"/>
-          <w:w w:val="105"/>
-          <w:sz w:val="21"/>
-          <w:szCs w:val="21"/>
-          <w:lang w:val="en-US" w:eastAsia="zh-CN"/>
-        </w:rPr>
-        <w:tab/>
-      </w:r>
-      <w:r>
-        <w:rPr>
-          <w:rFonts w:hint="eastAsia" w:ascii="楷体" w:hAnsi="楷体" w:eastAsia="楷体" w:cs="楷体"/>
-          <w:b/>
-          <w:bCs/>
-          <w:color w:val="auto"/>
-          <w:spacing w:val="-3"/>
-          <w:kern w:val="4"/>
-          <w:sz w:val="21"/>
-          <w:szCs w:val="21"/>
-          <w:lang w:val="en-US" w:eastAsia="zh-CN"/>
-        </w:rPr>
-        <w:t>第九届全国大学生集成电路创新创业大赛</w:t>
-      </w:r>
-      <w:r>
-        <w:rPr>
-          <w:rFonts w:hint="eastAsia" w:ascii="楷体" w:hAnsi="楷体" w:eastAsia="楷体" w:cs="楷体"/>
-          <w:b/>
-          <w:bCs/>
-          <w:color w:val="auto"/>
-          <w:spacing w:val="-3"/>
-          <w:kern w:val="4"/>
-          <w:sz w:val="21"/>
-          <w:szCs w:val="21"/>
-          <w:lang w:val="en-US" w:eastAsia="zh-CN"/>
-        </w:rPr>
-        <w:tab/>
-      </w:r>
-      <w:r>
-        <w:rPr>
-          <w:rFonts w:hint="eastAsia" w:ascii="楷体" w:hAnsi="楷体" w:eastAsia="楷体" w:cs="楷体"/>
-          <w:b/>
-          <w:bCs/>
-          <w:color w:val="auto"/>
-          <w:spacing w:val="-3"/>
-          <w:kern w:val="4"/>
-          <w:sz w:val="21"/>
-          <w:szCs w:val="21"/>
-          <w:lang w:val="en-US" w:eastAsia="zh-CN"/>
-        </w:rPr>
-        <w:t>东北分赛区决赛二等奖</w:t>
-      </w:r>
-      <w:r>
-        <w:rPr>
-          <w:rFonts w:hint="eastAsia" w:ascii="楷体" w:hAnsi="楷体" w:eastAsia="楷体" w:cs="楷体"/>
-          <w:b/>
-          <w:bCs/>
-          <w:color w:val="auto"/>
-          <w:spacing w:val="-3"/>
-          <w:kern w:val="4"/>
-          <w:sz w:val="21"/>
-          <w:szCs w:val="21"/>
-          <w:lang w:val="en-US" w:eastAsia="zh-CN"/>
-        </w:rPr>
-        <w:tab/>
-      </w:r>
-      <w:r>
-        <w:rPr>
-          <w:rFonts w:hint="eastAsia" w:ascii="楷体" w:hAnsi="楷体" w:eastAsia="楷体" w:cs="楷体"/>
-          <w:b/>
-          <w:bCs/>
-          <w:color w:val="auto"/>
-          <w:spacing w:val="-3"/>
-          <w:kern w:val="4"/>
-          <w:sz w:val="21"/>
-          <w:szCs w:val="21"/>
-          <w:lang w:val="en-US" w:eastAsia="zh-CN"/>
-        </w:rPr>
-        <w:t>核心队员</w:t>
-      </w:r>
-    </w:p>
-    <w:p>
-      <w:pPr>
-        <w:keepNext w:val="0"/>
-        <w:keepLines w:val="0"/>
-        <w:widowControl/>
-        <w:suppressLineNumbers w:val="0"/>
-        <w:ind w:left="209" w:leftChars="95" w:firstLine="0" w:firstLineChars="0"/>
-        <w:jc w:val="left"/>
-        <w:rPr>
-          <w:rFonts w:ascii="Times New Roman" w:hAnsi="Times New Roman" w:eastAsia="楷体"/>
-          <w:color w:val="auto"/>
-          <w:w w:val="105"/>
-          <w:sz w:val="21"/>
-          <w:szCs w:val="21"/>
-          <w:lang w:eastAsia="zh-CN"/>
-        </w:rPr>
-      </w:pPr>
-      <w:r>
-        <w:rPr>
-          <w:rFonts w:hint="eastAsia" w:ascii="楷体" w:hAnsi="楷体" w:eastAsia="楷体" w:cs="楷体"/>
-          <w:b/>
-          <w:bCs/>
+          <w:b w:val="0"/>
+          <w:bCs w:val="0"/>
           <w:spacing w:val="-6"/>
           <w:kern w:val="2"/>
           <w:sz w:val="21"/>
           <w:szCs w:val="21"/>
-          <w:u w:val="single"/>
-          <w:lang w:val="en-US" w:eastAsia="zh-CN" w:bidi="ar-SA"/>
-        </w:rPr>
-        <w:t>负责工作</w:t>
-      </w:r>
-      <w:r>
-        <w:rPr>
-          <w:rFonts w:hint="eastAsia" w:ascii="楷体" w:hAnsi="楷体" w:eastAsia="楷体" w:cs="楷体"/>
-          <w:b/>
-          <w:bCs/>
-          <w:spacing w:val="-6"/>
-          <w:kern w:val="2"/>
-          <w:sz w:val="21"/>
-          <w:szCs w:val="21"/>
-          <w:u w:val="none"/>
-          <w:lang w:val="en-US" w:eastAsia="zh-CN" w:bidi="ar-SA"/>
-        </w:rPr>
-        <w:t>：</w:t>
-      </w:r>
-      <w:r>
-        <w:rPr>
-          <w:rFonts w:ascii="楷体" w:hAnsi="楷体" w:eastAsia="楷体" w:cs="楷体"/>
-          <w:color w:val="000000"/>
-          <w:kern w:val="0"/>
-          <w:sz w:val="20"/>
-          <w:szCs w:val="20"/>
-          <w:lang w:val="en-US" w:eastAsia="zh-CN" w:bidi="ar"/>
-        </w:rPr>
-        <w:t>负责机器人在以 linux 系统为核心的飞腾派开发板上的部署，在 Ubuntu 20.04 下进行构建以下</w:t>
-      </w:r>
-      <w:r>
-        <w:rPr>
-          <w:rFonts w:hint="eastAsia" w:ascii="楷体" w:hAnsi="楷体" w:eastAsia="楷体" w:cs="楷体"/>
-          <w:color w:val="000000"/>
-          <w:kern w:val="0"/>
-          <w:sz w:val="20"/>
-          <w:szCs w:val="20"/>
-          <w:lang w:val="en-US" w:eastAsia="zh-CN" w:bidi="ar"/>
-        </w:rPr>
-        <w:t>部分：1）负责机器人在国产飞腾芯片平台上的嵌入式</w:t>
-      </w:r>
-      <w:r>
-        <w:rPr>
-          <w:rFonts w:hint="eastAsia" w:ascii="楷体" w:hAnsi="楷体" w:eastAsia="楷体" w:cs="楷体"/>
-          <w:b/>
-          <w:bCs/>
-          <w:color w:val="000000"/>
-          <w:kern w:val="0"/>
-          <w:sz w:val="20"/>
-          <w:szCs w:val="20"/>
-          <w:lang w:val="en-US" w:eastAsia="zh-CN" w:bidi="ar"/>
-        </w:rPr>
-        <w:t>系统构建与算法部署</w:t>
-      </w:r>
-      <w:r>
-        <w:rPr>
-          <w:rFonts w:hint="eastAsia" w:ascii="楷体" w:hAnsi="楷体" w:eastAsia="楷体" w:cs="楷体"/>
-          <w:color w:val="000000"/>
-          <w:kern w:val="0"/>
-          <w:sz w:val="20"/>
-          <w:szCs w:val="20"/>
-          <w:lang w:val="en-US" w:eastAsia="zh-CN" w:bidi="ar"/>
-        </w:rPr>
-        <w:t>。2）开发基于 ROS 的多传感器融合通信系统，实现深度相机、机械臂与上位机的协同控制。3）应用激光雷达 SLAM 技术实现机器人的自主定位、环境地图构建与动态路径规划。</w:t>
+          <w:lang w:val="en-US" w:eastAsia="zh-CN" w:bidi="ar-SA"/>
+        </w:rPr>
+      </w:pPr>
+      <w:r>
+        <w:rPr>
+          <w:rFonts w:hint="eastAsia" w:ascii="Times New Roman" w:hAnsi="Times New Roman" w:eastAsia="楷体" w:cs="Times New Roman"/>
+          <w:b/>
+          <w:bCs/>
+          <w:color w:val="auto"/>
+          <w:spacing w:val="-3"/>
+          <w:kern w:val="4"/>
+          <w:sz w:val="21"/>
+          <w:szCs w:val="21"/>
+          <w:lang w:val="en-US" w:eastAsia="zh-CN"/>
+        </w:rPr>
+        <w:t>2026.07</w:t>
+      </w:r>
+      <w:r>
+        <w:rPr>
+          <w:rFonts w:hint="eastAsia" w:ascii="Times New Roman" w:hAnsi="Times New Roman" w:eastAsia="楷体"/>
+          <w:b/>
+          <w:bCs/>
+          <w:color w:val="auto"/>
+          <w:w w:val="105"/>
+          <w:sz w:val="21"/>
+          <w:szCs w:val="21"/>
+          <w:lang w:val="en-US" w:eastAsia="zh-CN"/>
+        </w:rPr>
+        <w:tab/>
+      </w:r>
+      <w:r>
+        <w:rPr>
+          <w:rFonts w:hint="eastAsia" w:ascii="楷体" w:hAnsi="楷体" w:eastAsia="楷体" w:cs="楷体"/>
+          <w:b/>
+          <w:bCs/>
+          <w:color w:val="auto"/>
+          <w:spacing w:val="-3"/>
+          <w:kern w:val="4"/>
+          <w:sz w:val="21"/>
+          <w:szCs w:val="21"/>
+          <w:lang w:val="en-US" w:eastAsia="zh-CN"/>
+        </w:rPr>
+        <w:t>大学生电子设计竞赛嵌入式</w:t>
+      </w:r>
+      <w:r>
+        <w:rPr>
+          <w:rFonts w:hint="eastAsia" w:ascii="Times New Roman" w:hAnsi="Times New Roman" w:eastAsia="楷体" w:cs="Times New Roman"/>
+          <w:b/>
+          <w:bCs/>
+          <w:color w:val="auto"/>
+          <w:spacing w:val="-3"/>
+          <w:kern w:val="4"/>
+          <w:sz w:val="21"/>
+          <w:szCs w:val="21"/>
+          <w:lang w:val="en-US" w:eastAsia="zh-CN"/>
+        </w:rPr>
+        <w:t>AI</w:t>
+      </w:r>
+      <w:r>
+        <w:rPr>
+          <w:rFonts w:hint="eastAsia" w:ascii="楷体" w:hAnsi="楷体" w:eastAsia="楷体" w:cs="楷体"/>
+          <w:b/>
+          <w:bCs/>
+          <w:color w:val="auto"/>
+          <w:spacing w:val="-3"/>
+          <w:kern w:val="4"/>
+          <w:sz w:val="21"/>
+          <w:szCs w:val="21"/>
+          <w:lang w:val="en-US" w:eastAsia="zh-CN"/>
+        </w:rPr>
+        <w:t>专题赛（</w:t>
+      </w:r>
+      <w:r>
+        <w:rPr>
+          <w:rFonts w:hint="default" w:ascii="Times New Roman" w:hAnsi="Times New Roman" w:eastAsia="楷体" w:cs="Times New Roman"/>
+          <w:b/>
+          <w:bCs/>
+          <w:color w:val="auto"/>
+          <w:w w:val="105"/>
+          <w:sz w:val="21"/>
+          <w:szCs w:val="21"/>
+          <w:lang w:val="en-US" w:eastAsia="zh-CN"/>
+        </w:rPr>
+        <w:t>I</w:t>
+      </w:r>
+      <w:r>
+        <w:rPr>
+          <w:rFonts w:hint="default" w:ascii="Times New Roman" w:hAnsi="Times New Roman" w:eastAsia="楷体" w:cs="Times New Roman"/>
+          <w:b/>
+          <w:bCs/>
+          <w:color w:val="auto"/>
+          <w:spacing w:val="-3"/>
+          <w:kern w:val="4"/>
+          <w:sz w:val="21"/>
+          <w:szCs w:val="21"/>
+          <w:lang w:val="en-US" w:eastAsia="zh-CN"/>
+        </w:rPr>
+        <w:t>ntel</w:t>
+      </w:r>
+      <w:r>
+        <w:rPr>
+          <w:rFonts w:hint="eastAsia" w:ascii="楷体" w:hAnsi="楷体" w:eastAsia="楷体" w:cs="楷体"/>
+          <w:b/>
+          <w:bCs/>
+          <w:color w:val="auto"/>
+          <w:spacing w:val="-3"/>
+          <w:kern w:val="4"/>
+          <w:sz w:val="21"/>
+          <w:szCs w:val="21"/>
+          <w:lang w:val="en-US" w:eastAsia="zh-CN"/>
+        </w:rPr>
+        <w:t>杯）</w:t>
+      </w:r>
+      <w:r>
+        <w:rPr>
+          <w:rFonts w:hint="eastAsia" w:ascii="Times New Roman" w:hAnsi="Times New Roman" w:eastAsia="楷体"/>
+          <w:b/>
+          <w:bCs/>
+          <w:color w:val="auto"/>
+          <w:w w:val="105"/>
+          <w:sz w:val="21"/>
+          <w:szCs w:val="21"/>
+          <w:lang w:val="en-US" w:eastAsia="zh-CN"/>
+        </w:rPr>
+        <w:tab/>
+      </w:r>
+      <w:r>
+        <w:rPr>
+          <w:rFonts w:hint="eastAsia" w:ascii="楷体" w:hAnsi="楷体" w:eastAsia="楷体" w:cs="楷体"/>
+          <w:b/>
+          <w:bCs/>
+          <w:color w:val="auto"/>
+          <w:spacing w:val="-3"/>
+          <w:kern w:val="4"/>
+          <w:sz w:val="21"/>
+          <w:szCs w:val="21"/>
+          <w:lang w:val="en-US" w:eastAsia="zh-CN"/>
+        </w:rPr>
+        <w:t>国家级二等奖</w:t>
+      </w:r>
+      <w:r>
+        <w:rPr>
+          <w:rFonts w:hint="eastAsia" w:ascii="楷体" w:hAnsi="楷体" w:eastAsia="楷体" w:cs="楷体"/>
+          <w:b/>
+          <w:bCs/>
+          <w:color w:val="auto"/>
+          <w:spacing w:val="-3"/>
+          <w:kern w:val="4"/>
+          <w:sz w:val="21"/>
+          <w:szCs w:val="21"/>
+          <w:lang w:val="en-US" w:eastAsia="zh-CN"/>
+        </w:rPr>
+        <w:tab/>
+      </w:r>
+      <w:r>
+        <w:rPr>
+          <w:rFonts w:hint="eastAsia" w:ascii="楷体" w:hAnsi="楷体" w:eastAsia="楷体" w:cs="楷体"/>
+          <w:b/>
+          <w:bCs/>
+          <w:color w:val="auto"/>
+          <w:spacing w:val="-3"/>
+          <w:kern w:val="4"/>
+          <w:sz w:val="21"/>
+          <w:szCs w:val="21"/>
+          <w:lang w:val="en-US" w:eastAsia="zh-CN"/>
+        </w:rPr>
+        <w:t>队长</w:t>
       </w:r>
     </w:p>
     <w:p>
@@ -3494,18 +4835,31 @@
         <w:textAlignment w:val="auto"/>
         <w:rPr>
           <w:rFonts w:hint="eastAsia" w:ascii="楷体" w:hAnsi="楷体" w:eastAsia="楷体" w:cs="楷体"/>
-          <w:b/>
-          <w:bCs/>
-          <w:color w:val="auto"/>
-          <w:spacing w:val="-3"/>
-          <w:kern w:val="4"/>
-          <w:sz w:val="21"/>
-          <w:szCs w:val="21"/>
-          <w:lang w:val="en-US" w:eastAsia="zh-CN"/>
+          <w:b w:val="0"/>
+          <w:bCs w:val="0"/>
+          <w:spacing w:val="-6"/>
+          <w:kern w:val="2"/>
+          <w:sz w:val="21"/>
+          <w:szCs w:val="21"/>
+          <w:lang w:val="en-US" w:eastAsia="zh-CN" w:bidi="ar-SA"/>
         </w:rPr>
       </w:pPr>
       <w:r>
         <w:rPr>
+          <w:rFonts w:hint="eastAsia" w:ascii="Times New Roman" w:hAnsi="Times New Roman" w:eastAsia="楷体" w:cs="Times New Roman"/>
+          <w:b/>
+          <w:bCs/>
+          <w:color w:val="auto"/>
+          <w:spacing w:val="-3"/>
+          <w:kern w:val="4"/>
+          <w:sz w:val="21"/>
+          <w:szCs w:val="21"/>
+          <w:lang w:val="en-US" w:eastAsia="zh-CN"/>
+        </w:rPr>
+        <w:t>2026.07</w:t>
+      </w:r>
+      <w:r>
+        <w:rPr>
           <w:rFonts w:hint="eastAsia" w:ascii="Times New Roman" w:hAnsi="Times New Roman" w:eastAsia="楷体"/>
           <w:b/>
           <w:bCs/>
@@ -3515,19 +4869,6 @@
           <w:szCs w:val="21"/>
           <w:lang w:val="en-US" w:eastAsia="zh-CN"/>
         </w:rPr>
-        <w:t>2025.04</w:t>
-      </w:r>
-      <w:r>
-        <w:rPr>
-          <w:rFonts w:hint="eastAsia" w:ascii="Times New Roman" w:hAnsi="Times New Roman" w:eastAsia="楷体"/>
-          <w:b/>
-          <w:bCs/>
-          <w:color w:val="auto"/>
-          <w:w w:val="105"/>
-          <w:sz w:val="21"/>
-          <w:szCs w:val="21"/>
-          <w:lang w:val="en-US" w:eastAsia="zh-CN"/>
-        </w:rPr>
         <w:tab/>
       </w:r>
       <w:r>
@@ -3542,7 +4883,35 @@
           <w:szCs w:val="21"/>
           <w:lang w:val="en-US" w:eastAsia="zh-CN"/>
         </w:rPr>
-        <w:t>第十五届蓝桥杯全国软件和信息技术大赛</w:t>
+        <w:t>‌</w:t>
+      </w:r>
+      <w:r>
+        <w:rPr>
+          <w:rFonts w:hint="default" w:ascii="楷体" w:hAnsi="楷体" w:eastAsia="楷体" w:cs="楷体"/>
+          <w:b/>
+          <w:bCs/>
+          <w:color w:val="auto"/>
+          <w:spacing w:val="-3"/>
+          <w:kern w:val="4"/>
+          <w:sz w:val="21"/>
+          <w:szCs w:val="21"/>
+          <w:lang w:val="en-US" w:eastAsia="zh-CN"/>
+        </w:rPr>
+        <w:t>中国机器人及人工智能大赛</w:t>
+      </w:r>
+      <w:r>
+        <w:rPr>
+          <w:rFonts w:hint="eastAsia" w:ascii="楷体" w:hAnsi="楷体" w:eastAsia="楷体" w:cs="楷体"/>
+          <w:b/>
+          <w:bCs/>
+          <w:color w:val="auto"/>
+          <w:spacing w:val="-3"/>
+          <w:kern w:val="4"/>
+          <w:sz w:val="21"/>
+          <w:szCs w:val="21"/>
+          <w:lang w:val="en-US" w:eastAsia="zh-CN"/>
+        </w:rPr>
+        <w:t>（机器人创新赛）</w:t>
       </w:r>
       <w:r>
         <w:rPr>
@@ -3570,8 +4939,10 @@
           <w:szCs w:val="21"/>
           <w:lang w:val="en-US" w:eastAsia="zh-CN"/>
         </w:rPr>
-        <w:t>省二等奖</w:t>
-      </w:r>
+        <w:t>国家级二等奖</w:t>
+      </w:r>
+      <w:bookmarkStart w:id="2" w:name="_GoBack"/>
+      <w:bookmarkEnd w:id="2"/>
       <w:r>
         <w:rPr>
           <w:rFonts w:hint="eastAsia" w:ascii="楷体" w:hAnsi="楷体" w:eastAsia="楷体" w:cs="楷体"/>
@@ -3598,7 +4969,57 @@
           <w:szCs w:val="21"/>
           <w:lang w:val="en-US" w:eastAsia="zh-CN"/>
         </w:rPr>
-        <w:t>个人赛</w:t>
+        <w:t>队长</w:t>
+      </w:r>
+    </w:p>
+    <w:p>
+      <w:pPr>
+        <w:pStyle w:val="3"/>
+        <w:keepNext w:val="0"/>
+        <w:keepLines w:val="0"/>
+        <w:pageBreakBefore w:val="0"/>
+        <w:widowControl w:val="0"/>
+        <w:tabs>
+          <w:tab w:val="left" w:pos="3544"/>
+          <w:tab w:val="left" w:pos="10722"/>
+        </w:tabs>
+        <w:kinsoku/>
+        <w:wordWrap/>
+        <w:overflowPunct/>
+        <w:topLinePunct w:val="0"/>
+        <w:autoSpaceDE w:val="0"/>
+        <w:autoSpaceDN w:val="0"/>
+        <w:bidi w:val="0"/>
+        <w:adjustRightInd/>
+        <w:snapToGrid/>
+        <w:spacing w:before="120" w:line="240" w:lineRule="auto"/>
+        <w:ind w:left="102"/>
+        <w:textAlignment w:val="auto"/>
+        <w:rPr>
+          <w:rFonts w:hint="eastAsia" w:ascii="楷体" w:hAnsi="楷体" w:eastAsia="楷体" w:cs="楷体"/>
+          <w:b/>
+          <w:bCs/>
+          <w:color w:val="auto"/>
+          <w:spacing w:val="-3"/>
+          <w:kern w:val="4"/>
+          <w:sz w:val="21"/>
+          <w:szCs w:val="21"/>
+          <w:lang w:val="en-US" w:eastAsia="zh-CN" w:bidi="ar-SA"/>
+        </w:rPr>
+      </w:pPr>
+      <w:r>
+        <w:rPr>
+          <w:rFonts w:hint="eastAsia" w:ascii="楷体" w:hAnsi="楷体" w:eastAsia="楷体" w:cs="楷体"/>
+          <w:b/>
+          <w:bCs/>
+          <w:color w:val="auto"/>
+          <w:spacing w:val="-3"/>
+          <w:kern w:val="4"/>
+          <w:sz w:val="21"/>
+          <w:szCs w:val="21"/>
+          <w:lang w:val="en-US" w:eastAsia="zh-CN" w:bidi="ar-SA"/>
+        </w:rPr>
+        <w:t>区域级/省级获奖</w:t>
       </w:r>
     </w:p>
     <w:p>
@@ -3646,6 +5067,20 @@
       </w:pPr>
       <w:r>
         <w:rPr>
+          <w:rFonts w:hint="eastAsia" w:ascii="Times New Roman" w:hAnsi="Times New Roman" w:eastAsia="楷体" w:cs="Times New Roman"/>
+          <w:b/>
+          <w:bCs/>
+          <w:color w:val="auto"/>
+          <w:spacing w:val="-3"/>
+          <w:kern w:val="4"/>
+          <w:sz w:val="21"/>
+          <w:szCs w:val="21"/>
+          <w:lang w:val="en-US" w:eastAsia="zh-CN"/>
+        </w:rPr>
+        <w:t>2025.07</w:t>
+      </w:r>
+      <w:r>
+        <w:rPr>
           <w:rFonts w:hint="eastAsia" w:ascii="Times New Roman" w:hAnsi="Times New Roman" w:eastAsia="楷体"/>
           <w:b/>
           <w:bCs/>
@@ -3655,19 +5090,6 @@
           <w:szCs w:val="21"/>
           <w:lang w:val="en-US" w:eastAsia="zh-CN"/>
         </w:rPr>
-        <w:t>2025.05</w:t>
-      </w:r>
-      <w:r>
-        <w:rPr>
-          <w:rFonts w:hint="eastAsia" w:ascii="Times New Roman" w:hAnsi="Times New Roman" w:eastAsia="楷体"/>
-          <w:b/>
-          <w:bCs/>
-          <w:color w:val="auto"/>
-          <w:w w:val="105"/>
-          <w:sz w:val="21"/>
-          <w:szCs w:val="21"/>
-          <w:lang w:val="en-US" w:eastAsia="zh-CN"/>
-        </w:rPr>
         <w:tab/>
       </w:r>
       <w:r>
@@ -3682,7 +5104,7 @@
           <w:szCs w:val="21"/>
           <w:lang w:val="en-US" w:eastAsia="zh-CN"/>
         </w:rPr>
-        <w:t>第十八届中国大学生计算机设计竞赛</w:t>
+        <w:t>第九届全国大学生集成电路创新创业大赛</w:t>
       </w:r>
       <w:r>
         <w:rPr>
@@ -3710,21 +5132,7 @@
           <w:szCs w:val="21"/>
           <w:lang w:val="en-US" w:eastAsia="zh-CN"/>
         </w:rPr>
-        <w:tab/>
-      </w:r>
-      <w:r>
-        <w:rPr>
-          <w:rFonts w:hint="eastAsia" w:ascii="楷体" w:hAnsi="楷体" w:eastAsia="楷体" w:cs="楷体"/>
-          <w:b/>
-          <w:bCs/>
-          <w:color w:val="auto"/>
-          <w:spacing w:val="-3"/>
-          <w:kern w:val="4"/>
-          <w:sz w:val="21"/>
-          <w:szCs w:val="21"/>
-          <w:lang w:val="en-US" w:eastAsia="zh-CN"/>
-        </w:rPr>
-        <w:t>省三等奖</w:t>
+        <w:t>东北分赛区决赛二等奖</w:t>
       </w:r>
       <w:r>
         <w:rPr>
@@ -3800,6 +5208,20 @@
       </w:pPr>
       <w:r>
         <w:rPr>
+          <w:rFonts w:hint="eastAsia" w:ascii="Times New Roman" w:hAnsi="Times New Roman" w:eastAsia="楷体" w:cs="Times New Roman"/>
+          <w:b/>
+          <w:bCs/>
+          <w:color w:val="auto"/>
+          <w:spacing w:val="-3"/>
+          <w:kern w:val="4"/>
+          <w:sz w:val="21"/>
+          <w:szCs w:val="21"/>
+          <w:lang w:val="en-US" w:eastAsia="zh-CN"/>
+        </w:rPr>
+        <w:t>2025.04</w:t>
+      </w:r>
+      <w:r>
+        <w:rPr>
           <w:rFonts w:hint="eastAsia" w:ascii="Times New Roman" w:hAnsi="Times New Roman" w:eastAsia="楷体"/>
           <w:b/>
           <w:bCs/>
@@ -3809,19 +5231,6 @@
           <w:szCs w:val="21"/>
           <w:lang w:val="en-US" w:eastAsia="zh-CN"/>
         </w:rPr>
-        <w:t>2025.05</w:t>
-      </w:r>
-      <w:r>
-        <w:rPr>
-          <w:rFonts w:hint="eastAsia" w:ascii="Times New Roman" w:hAnsi="Times New Roman" w:eastAsia="楷体"/>
-          <w:b/>
-          <w:bCs/>
-          <w:color w:val="auto"/>
-          <w:w w:val="105"/>
-          <w:sz w:val="21"/>
-          <w:szCs w:val="21"/>
-          <w:lang w:val="en-US" w:eastAsia="zh-CN"/>
-        </w:rPr>
         <w:tab/>
       </w:r>
       <w:r>
@@ -3836,7 +5245,7 @@
           <w:szCs w:val="21"/>
           <w:lang w:val="en-US" w:eastAsia="zh-CN"/>
         </w:rPr>
-        <w:t>第十二届“大唐杯”大学生信息通信技术竞赛</w:t>
+        <w:t>第十五届蓝桥杯全国软件和信息技术大赛</w:t>
       </w:r>
       <w:r>
         <w:rPr>
@@ -3892,7 +5301,7 @@
           <w:szCs w:val="21"/>
           <w:lang w:val="en-US" w:eastAsia="zh-CN"/>
         </w:rPr>
-        <w:t>核心队员</w:t>
+        <w:t>个人赛</w:t>
       </w:r>
     </w:p>
     <w:p>
@@ -3940,11 +5349,167 @@
       </w:pPr>
       <w:r>
         <w:rPr>
+          <w:rFonts w:hint="eastAsia" w:ascii="Times New Roman" w:hAnsi="Times New Roman" w:eastAsia="楷体" w:cs="Times New Roman"/>
+          <w:b/>
+          <w:bCs/>
+          <w:color w:val="auto"/>
+          <w:spacing w:val="-3"/>
+          <w:kern w:val="4"/>
+          <w:sz w:val="21"/>
+          <w:szCs w:val="21"/>
+          <w:lang w:val="en-US" w:eastAsia="zh-CN"/>
+        </w:rPr>
+        <w:t>2025.05</w:t>
+      </w:r>
+      <w:r>
+        <w:rPr>
           <w:rFonts w:hint="eastAsia" w:ascii="Times New Roman" w:hAnsi="Times New Roman" w:eastAsia="楷体"/>
           <w:b/>
           <w:bCs/>
           <w:color w:val="auto"/>
           <w:w w:val="105"/>
+          <w:sz w:val="21"/>
+          <w:szCs w:val="21"/>
+          <w:lang w:val="en-US" w:eastAsia="zh-CN"/>
+        </w:rPr>
+        <w:tab/>
+      </w:r>
+      <w:r>
+        <w:rPr>
+          <w:rFonts w:hint="eastAsia" w:ascii="楷体" w:hAnsi="楷体" w:eastAsia="楷体" w:cs="楷体"/>
+          <w:b/>
+          <w:bCs/>
+          <w:color w:val="auto"/>
+          <w:spacing w:val="-3"/>
+          <w:kern w:val="4"/>
+          <w:sz w:val="21"/>
+          <w:szCs w:val="21"/>
+          <w:lang w:val="en-US" w:eastAsia="zh-CN"/>
+        </w:rPr>
+        <w:t>第十八届中国大学生计算机设计竞赛</w:t>
+      </w:r>
+      <w:r>
+        <w:rPr>
+          <w:rFonts w:hint="eastAsia" w:ascii="楷体" w:hAnsi="楷体" w:eastAsia="楷体" w:cs="楷体"/>
+          <w:b/>
+          <w:bCs/>
+          <w:color w:val="auto"/>
+          <w:spacing w:val="-3"/>
+          <w:kern w:val="4"/>
+          <w:sz w:val="21"/>
+          <w:szCs w:val="21"/>
+          <w:lang w:val="en-US" w:eastAsia="zh-CN"/>
+        </w:rPr>
+        <w:tab/>
+      </w:r>
+      <w:r>
+        <w:rPr>
+          <w:rFonts w:hint="eastAsia" w:ascii="楷体" w:hAnsi="楷体" w:eastAsia="楷体" w:cs="楷体"/>
+          <w:b/>
+          <w:bCs/>
+          <w:color w:val="auto"/>
+          <w:spacing w:val="-3"/>
+          <w:kern w:val="4"/>
+          <w:sz w:val="21"/>
+          <w:szCs w:val="21"/>
+          <w:lang w:val="en-US" w:eastAsia="zh-CN"/>
+        </w:rPr>
+        <w:tab/>
+      </w:r>
+      <w:r>
+        <w:rPr>
+          <w:rFonts w:hint="eastAsia" w:ascii="楷体" w:hAnsi="楷体" w:eastAsia="楷体" w:cs="楷体"/>
+          <w:b/>
+          <w:bCs/>
+          <w:color w:val="auto"/>
+          <w:spacing w:val="-3"/>
+          <w:kern w:val="4"/>
+          <w:sz w:val="21"/>
+          <w:szCs w:val="21"/>
+          <w:lang w:val="en-US" w:eastAsia="zh-CN"/>
+        </w:rPr>
+        <w:t>省三等奖</w:t>
+      </w:r>
+      <w:r>
+        <w:rPr>
+          <w:rFonts w:hint="eastAsia" w:ascii="楷体" w:hAnsi="楷体" w:eastAsia="楷体" w:cs="楷体"/>
+          <w:b/>
+          <w:bCs/>
+          <w:color w:val="auto"/>
+          <w:spacing w:val="-3"/>
+          <w:kern w:val="4"/>
+          <w:sz w:val="21"/>
+          <w:szCs w:val="21"/>
+          <w:lang w:val="en-US" w:eastAsia="zh-CN"/>
+        </w:rPr>
+        <w:tab/>
+      </w:r>
+      <w:r>
+        <w:rPr>
+          <w:rFonts w:hint="eastAsia" w:ascii="楷体" w:hAnsi="楷体" w:eastAsia="楷体" w:cs="楷体"/>
+          <w:b/>
+          <w:bCs/>
+          <w:color w:val="auto"/>
+          <w:spacing w:val="-3"/>
+          <w:kern w:val="4"/>
+          <w:sz w:val="21"/>
+          <w:szCs w:val="21"/>
+          <w:lang w:val="en-US" w:eastAsia="zh-CN"/>
+        </w:rPr>
+        <w:t>核心队员</w:t>
+      </w:r>
+    </w:p>
+    <w:p>
+      <w:pPr>
+        <w:pStyle w:val="14"/>
+        <w:keepNext w:val="0"/>
+        <w:keepLines w:val="0"/>
+        <w:pageBreakBefore w:val="0"/>
+        <w:widowControl w:val="0"/>
+        <w:numPr>
+          <w:ilvl w:val="0"/>
+          <w:numId w:val="1"/>
+        </w:numPr>
+        <w:tabs>
+          <w:tab w:val="left" w:pos="395"/>
+          <w:tab w:val="left" w:pos="2420"/>
+          <w:tab w:val="left" w:pos="2640"/>
+          <w:tab w:val="left" w:pos="5940"/>
+          <w:tab w:val="left" w:pos="7260"/>
+          <w:tab w:val="left" w:pos="10120"/>
+        </w:tabs>
+        <w:kinsoku/>
+        <w:wordWrap/>
+        <w:overflowPunct/>
+        <w:topLinePunct w:val="0"/>
+        <w:autoSpaceDE w:val="0"/>
+        <w:autoSpaceDN w:val="0"/>
+        <w:bidi w:val="0"/>
+        <w:adjustRightInd/>
+        <w:snapToGrid/>
+        <w:spacing w:line="240" w:lineRule="auto"/>
+        <w:ind w:left="391" w:hanging="193"/>
+        <w:textAlignment w:val="auto"/>
+        <w:rPr>
+          <w:rFonts w:hint="eastAsia" w:ascii="楷体" w:hAnsi="楷体" w:eastAsia="楷体" w:cs="楷体"/>
+          <w:b/>
+          <w:bCs/>
+          <w:color w:val="auto"/>
+          <w:spacing w:val="-3"/>
+          <w:kern w:val="4"/>
+          <w:sz w:val="21"/>
+          <w:szCs w:val="21"/>
+          <w:lang w:val="en-US" w:eastAsia="zh-CN"/>
+        </w:rPr>
+      </w:pPr>
+      <w:r>
+        <w:rPr>
+          <w:rFonts w:hint="eastAsia" w:ascii="Times New Roman" w:hAnsi="Times New Roman" w:eastAsia="楷体" w:cs="Times New Roman"/>
+          <w:b/>
+          <w:bCs/>
+          <w:color w:val="auto"/>
+          <w:spacing w:val="-3"/>
+          <w:kern w:val="4"/>
           <w:sz w:val="21"/>
           <w:szCs w:val="21"/>
           <w:lang w:val="en-US" w:eastAsia="zh-CN"/>
@@ -4210,6 +5775,20 @@
       </w:r>
       <w:r>
         <w:rPr>
+          <w:rFonts w:hint="eastAsia" w:ascii="Times New Roman" w:hAnsi="Times New Roman" w:eastAsia="楷体" w:cs="Times New Roman"/>
+          <w:b w:val="0"/>
+          <w:bCs w:val="0"/>
+          <w:color w:val="auto"/>
+          <w:spacing w:val="-3"/>
+          <w:kern w:val="4"/>
+          <w:sz w:val="21"/>
+          <w:szCs w:val="21"/>
+          <w:lang w:val="en-US" w:eastAsia="zh-CN" w:bidi="ar-SA"/>
+        </w:rPr>
+        <w:t>（2023-2024）</w:t>
+      </w:r>
+      <w:r>
+        <w:rPr>
           <w:rFonts w:hint="eastAsia" w:ascii="Times New Roman" w:hAnsi="Times New Roman" w:eastAsia="楷体"/>
           <w:color w:val="auto"/>
           <w:w w:val="105"/>
@@ -4217,7 +5796,85 @@
           <w:szCs w:val="21"/>
           <w:lang w:val="en-US" w:eastAsia="zh-CN"/>
         </w:rPr>
-        <w:t>（2023-2024）、华为奖学金（2024-2025）、东北大学校一等奖学金（2023-2024）、东北大学校二等奖学金（2024-2025）</w:t>
+        <w:t>、华为奖学金</w:t>
+      </w:r>
+      <w:r>
+        <w:rPr>
+          <w:rFonts w:hint="eastAsia" w:ascii="Times New Roman" w:hAnsi="Times New Roman" w:eastAsia="楷体" w:cs="Times New Roman"/>
+          <w:b w:val="0"/>
+          <w:bCs w:val="0"/>
+          <w:color w:val="auto"/>
+          <w:spacing w:val="-3"/>
+          <w:kern w:val="4"/>
+          <w:sz w:val="21"/>
+          <w:szCs w:val="21"/>
+          <w:lang w:val="en-US" w:eastAsia="zh-CN" w:bidi="ar-SA"/>
+        </w:rPr>
+        <w:t>（</w:t>
+      </w:r>
+      <w:r>
+        <w:rPr>
+          <w:rFonts w:hint="eastAsia" w:ascii="Times New Roman" w:hAnsi="Times New Roman" w:eastAsia="楷体" w:cs="Times New Roman"/>
+          <w:b w:val="0"/>
+          <w:bCs w:val="0"/>
+          <w:color w:val="auto"/>
+          <w:spacing w:val="-3"/>
+          <w:kern w:val="4"/>
+          <w:sz w:val="21"/>
+          <w:szCs w:val="21"/>
+          <w:lang w:val="en-US" w:eastAsia="zh-CN" w:bidi="ar-SA"/>
+        </w:rPr>
+        <w:t>2024-2025）</w:t>
+      </w:r>
+      <w:r>
+        <w:rPr>
+          <w:rFonts w:hint="eastAsia" w:ascii="Times New Roman" w:hAnsi="Times New Roman" w:eastAsia="楷体"/>
+          <w:color w:val="auto"/>
+          <w:w w:val="105"/>
+          <w:sz w:val="21"/>
+          <w:szCs w:val="21"/>
+          <w:lang w:val="en-US" w:eastAsia="zh-CN"/>
+        </w:rPr>
+        <w:t>、东北大学校一等奖学金</w:t>
+      </w:r>
+      <w:r>
+        <w:rPr>
+          <w:rFonts w:hint="eastAsia" w:ascii="Times New Roman" w:hAnsi="Times New Roman" w:eastAsia="楷体" w:cs="Times New Roman"/>
+          <w:b w:val="0"/>
+          <w:bCs w:val="0"/>
+          <w:color w:val="auto"/>
+          <w:spacing w:val="-3"/>
+          <w:kern w:val="4"/>
+          <w:sz w:val="21"/>
+          <w:szCs w:val="21"/>
+          <w:lang w:val="en-US" w:eastAsia="zh-CN" w:bidi="ar-SA"/>
+        </w:rPr>
+        <w:t>（2023-2024）</w:t>
+      </w:r>
+      <w:r>
+        <w:rPr>
+          <w:rFonts w:hint="eastAsia" w:ascii="Times New Roman" w:hAnsi="Times New Roman" w:eastAsia="楷体"/>
+          <w:color w:val="auto"/>
+          <w:w w:val="105"/>
+          <w:sz w:val="21"/>
+          <w:szCs w:val="21"/>
+          <w:lang w:val="en-US" w:eastAsia="zh-CN"/>
+        </w:rPr>
+        <w:t>、东北大学校二等奖学金</w:t>
+      </w:r>
+      <w:r>
+        <w:rPr>
+          <w:rFonts w:hint="eastAsia" w:ascii="Times New Roman" w:hAnsi="Times New Roman" w:eastAsia="楷体" w:cs="Times New Roman"/>
+          <w:b w:val="0"/>
+          <w:bCs w:val="0"/>
+          <w:color w:val="auto"/>
+          <w:spacing w:val="-3"/>
+          <w:kern w:val="4"/>
+          <w:sz w:val="21"/>
+          <w:szCs w:val="21"/>
+          <w:lang w:val="en-US" w:eastAsia="zh-CN" w:bidi="ar-SA"/>
+        </w:rPr>
+        <w:t>（2024-2025）</w:t>
       </w:r>
     </w:p>
     <w:p>
@@ -4290,7 +5947,32 @@
           <w:szCs w:val="21"/>
           <w:lang w:val="en-US" w:eastAsia="zh-CN"/>
         </w:rPr>
-        <w:t>东北大学优秀学生标兵（2023-2024）、</w:t>
+        <w:t>东北大学优秀学生标兵</w:t>
+      </w:r>
+      <w:r>
+        <w:rPr>
+          <w:rFonts w:hint="eastAsia" w:ascii="Times New Roman" w:hAnsi="Times New Roman" w:eastAsia="楷体" w:cs="Times New Roman"/>
+          <w:b w:val="0"/>
+          <w:bCs w:val="0"/>
+          <w:color w:val="auto"/>
+          <w:spacing w:val="-3"/>
+          <w:kern w:val="4"/>
+          <w:sz w:val="21"/>
+          <w:szCs w:val="21"/>
+          <w:lang w:val="en-US" w:eastAsia="zh-CN" w:bidi="ar-SA"/>
+        </w:rPr>
+        <w:t>（2023-2024）</w:t>
+      </w:r>
+      <w:r>
+        <w:rPr>
+          <w:rFonts w:hint="eastAsia" w:ascii="Times New Roman" w:hAnsi="Times New Roman" w:eastAsia="楷体"/>
+          <w:color w:val="auto"/>
+          <w:w w:val="105"/>
+          <w:sz w:val="21"/>
+          <w:szCs w:val="21"/>
+          <w:lang w:val="en-US" w:eastAsia="zh-CN"/>
+        </w:rPr>
+        <w:t>、</w:t>
       </w:r>
       <w:bookmarkStart w:id="1" w:name="OLE_LINK5"/>
       <w:r>
@@ -4302,19 +5984,70 @@
           <w:szCs w:val="21"/>
           <w:lang w:val="en-US" w:eastAsia="zh-CN"/>
         </w:rPr>
-        <w:t>东北大学优秀学生（2024-2025）；</w:t>
-      </w:r>
-      <w:r>
-        <w:rPr>
-          <w:rFonts w:hint="eastAsia" w:ascii="楷体" w:hAnsi="楷体" w:eastAsia="楷体" w:cs="楷体"/>
-          <w:color w:val="auto"/>
-          <w:spacing w:val="-3"/>
-          <w:kern w:val="4"/>
-          <w:sz w:val="21"/>
-          <w:szCs w:val="21"/>
-          <w:lang w:val="en-US" w:eastAsia="zh-CN"/>
-        </w:rPr>
-        <w:t>大学期间长期担任通信工程2301班班长，并带领班集体</w:t>
+        <w:t>东北大学优秀学生</w:t>
+      </w:r>
+      <w:r>
+        <w:rPr>
+          <w:rFonts w:hint="eastAsia" w:ascii="Times New Roman" w:hAnsi="Times New Roman" w:eastAsia="楷体" w:cs="Times New Roman"/>
+          <w:b w:val="0"/>
+          <w:bCs w:val="0"/>
+          <w:color w:val="auto"/>
+          <w:spacing w:val="-3"/>
+          <w:kern w:val="4"/>
+          <w:sz w:val="21"/>
+          <w:szCs w:val="21"/>
+          <w:lang w:val="en-US" w:eastAsia="zh-CN" w:bidi="ar-SA"/>
+        </w:rPr>
+        <w:t>（2024-2025）</w:t>
+      </w:r>
+      <w:r>
+        <w:rPr>
+          <w:rFonts w:hint="eastAsia" w:ascii="Times New Roman" w:hAnsi="Times New Roman" w:eastAsia="楷体"/>
+          <w:color w:val="auto"/>
+          <w:w w:val="105"/>
+          <w:sz w:val="21"/>
+          <w:szCs w:val="21"/>
+          <w:lang w:val="en-US" w:eastAsia="zh-CN"/>
+        </w:rPr>
+        <w:t>；</w:t>
+      </w:r>
+      <w:r>
+        <w:rPr>
+          <w:rFonts w:hint="eastAsia" w:ascii="楷体" w:hAnsi="楷体" w:eastAsia="楷体" w:cs="楷体"/>
+          <w:color w:val="auto"/>
+          <w:spacing w:val="-3"/>
+          <w:kern w:val="4"/>
+          <w:sz w:val="21"/>
+          <w:szCs w:val="21"/>
+          <w:lang w:val="en-US" w:eastAsia="zh-CN"/>
+        </w:rPr>
+        <w:t>大学期间长期担任通信工程</w:t>
+      </w:r>
+      <w:r>
+        <w:rPr>
+          <w:rFonts w:hint="eastAsia" w:ascii="Times New Roman" w:hAnsi="Times New Roman" w:eastAsia="楷体" w:cs="Times New Roman"/>
+          <w:b w:val="0"/>
+          <w:bCs w:val="0"/>
+          <w:color w:val="auto"/>
+          <w:spacing w:val="-3"/>
+          <w:kern w:val="4"/>
+          <w:sz w:val="21"/>
+          <w:szCs w:val="21"/>
+          <w:lang w:val="en-US" w:eastAsia="zh-CN" w:bidi="ar-SA"/>
+        </w:rPr>
+        <w:t>2301</w:t>
+      </w:r>
+      <w:r>
+        <w:rPr>
+          <w:rFonts w:hint="eastAsia" w:ascii="楷体" w:hAnsi="楷体" w:eastAsia="楷体" w:cs="楷体"/>
+          <w:color w:val="auto"/>
+          <w:spacing w:val="-3"/>
+          <w:kern w:val="4"/>
+          <w:sz w:val="21"/>
+          <w:szCs w:val="21"/>
+          <w:lang w:val="en-US" w:eastAsia="zh-CN"/>
+        </w:rPr>
+        <w:t>班班长，并带领班集体</w:t>
       </w:r>
       <w:r>
         <w:rPr>
@@ -4332,15 +6065,15 @@
       </w:r>
       <w:r>
         <w:rPr>
-          <w:rFonts w:hint="eastAsia" w:ascii="楷体" w:hAnsi="楷体" w:eastAsia="楷体" w:cs="楷体"/>
-          <w:b w:val="0"/>
-          <w:bCs w:val="0"/>
-          <w:color w:val="auto"/>
-          <w:spacing w:val="-3"/>
-          <w:kern w:val="4"/>
-          <w:sz w:val="21"/>
-          <w:szCs w:val="21"/>
-          <w:lang w:val="en-US" w:eastAsia="zh-CN"/>
+          <w:rFonts w:hint="eastAsia" w:ascii="Times New Roman" w:hAnsi="Times New Roman" w:eastAsia="楷体" w:cs="Times New Roman"/>
+          <w:b w:val="0"/>
+          <w:bCs w:val="0"/>
+          <w:color w:val="auto"/>
+          <w:spacing w:val="-3"/>
+          <w:kern w:val="4"/>
+          <w:sz w:val="21"/>
+          <w:szCs w:val="21"/>
+          <w:lang w:val="en-US" w:eastAsia="zh-CN" w:bidi="ar-SA"/>
         </w:rPr>
         <w:t>(23-24、24-25)</w:t>
       </w:r>
@@ -4380,7 +6113,33 @@
           <w:szCs w:val="21"/>
           <w:lang w:val="en-US" w:eastAsia="zh-CN"/>
         </w:rPr>
-        <w:t>等荣誉称号; 同时长期担任电子信息类2404班成长发展指导员，并获得</w:t>
+        <w:t>等荣誉称号; 同时长期担任电子信息类</w:t>
+      </w:r>
+      <w:r>
+        <w:rPr>
+          <w:rFonts w:hint="eastAsia" w:ascii="Times New Roman" w:hAnsi="Times New Roman" w:eastAsia="楷体" w:cs="Times New Roman"/>
+          <w:b w:val="0"/>
+          <w:bCs w:val="0"/>
+          <w:color w:val="auto"/>
+          <w:spacing w:val="-3"/>
+          <w:kern w:val="4"/>
+          <w:sz w:val="21"/>
+          <w:szCs w:val="21"/>
+          <w:lang w:val="en-US" w:eastAsia="zh-CN" w:bidi="ar-SA"/>
+        </w:rPr>
+        <w:t>2404</w:t>
+      </w:r>
+      <w:r>
+        <w:rPr>
+          <w:rFonts w:hint="eastAsia" w:ascii="楷体" w:hAnsi="楷体" w:eastAsia="楷体" w:cs="楷体"/>
+          <w:color w:val="auto"/>
+          <w:spacing w:val="-3"/>
+          <w:kern w:val="4"/>
+          <w:sz w:val="21"/>
+          <w:szCs w:val="21"/>
+          <w:lang w:val="en-US" w:eastAsia="zh-CN"/>
+        </w:rPr>
+        <w:t>班成长发展指导员，并获得</w:t>
       </w:r>
       <w:r>
         <w:rPr>

</xml_diff>

<commit_message>
Update Lingxi robot project link
</commit_message>
<xml_diff>
--- a/file/CV_CN_all.docx
+++ b/file/CV_CN_all.docx
@@ -4804,176 +4804,6 @@
     </w:p>
     <w:p>
       <w:pPr>
-        <w:pStyle w:val="14"/>
-        <w:keepNext w:val="0"/>
-        <w:keepLines w:val="0"/>
-        <w:pageBreakBefore w:val="0"/>
-        <w:widowControl w:val="0"/>
-        <w:numPr>
-          <w:ilvl w:val="0"/>
-          <w:numId w:val="1"/>
-        </w:numPr>
-        <w:tabs>
-          <w:tab w:val="left" w:pos="395"/>
-          <w:tab w:val="left" w:pos="2420"/>
-          <w:tab w:val="left" w:pos="2640"/>
-          <w:tab w:val="left" w:pos="5940"/>
-          <w:tab w:val="left" w:pos="7260"/>
-          <w:tab w:val="left" w:pos="10120"/>
-        </w:tabs>
-        <w:kinsoku/>
-        <w:wordWrap/>
-        <w:overflowPunct/>
-        <w:topLinePunct w:val="0"/>
-        <w:autoSpaceDE w:val="0"/>
-        <w:autoSpaceDN w:val="0"/>
-        <w:bidi w:val="0"/>
-        <w:adjustRightInd/>
-        <w:snapToGrid/>
-        <w:spacing w:line="240" w:lineRule="auto"/>
-        <w:ind w:left="391" w:hanging="193"/>
-        <w:textAlignment w:val="auto"/>
-        <w:rPr>
-          <w:rFonts w:hint="eastAsia" w:ascii="楷体" w:hAnsi="楷体" w:eastAsia="楷体" w:cs="楷体"/>
-          <w:b w:val="0"/>
-          <w:bCs w:val="0"/>
-          <w:spacing w:val="-6"/>
-          <w:kern w:val="2"/>
-          <w:sz w:val="21"/>
-          <w:szCs w:val="21"/>
-          <w:lang w:val="en-US" w:eastAsia="zh-CN" w:bidi="ar-SA"/>
-        </w:rPr>
-      </w:pPr>
-      <w:r>
-        <w:rPr>
-          <w:rFonts w:hint="eastAsia" w:ascii="Times New Roman" w:hAnsi="Times New Roman" w:eastAsia="楷体" w:cs="Times New Roman"/>
-          <w:b/>
-          <w:bCs/>
-          <w:color w:val="auto"/>
-          <w:spacing w:val="-3"/>
-          <w:kern w:val="4"/>
-          <w:sz w:val="21"/>
-          <w:szCs w:val="21"/>
-          <w:lang w:val="en-US" w:eastAsia="zh-CN"/>
-        </w:rPr>
-        <w:t>2026.07</w:t>
-      </w:r>
-      <w:r>
-        <w:rPr>
-          <w:rFonts w:hint="eastAsia" w:ascii="Times New Roman" w:hAnsi="Times New Roman" w:eastAsia="楷体"/>
-          <w:b/>
-          <w:bCs/>
-          <w:color w:val="auto"/>
-          <w:w w:val="105"/>
-          <w:sz w:val="21"/>
-          <w:szCs w:val="21"/>
-          <w:lang w:val="en-US" w:eastAsia="zh-CN"/>
-        </w:rPr>
-        <w:tab/>
-      </w:r>
-      <w:r>
-        <w:rPr>
-          <w:rFonts w:hint="eastAsia" w:ascii="楷体" w:hAnsi="楷体" w:eastAsia="楷体" w:cs="楷体"/>
-          <w:b/>
-          <w:bCs/>
-          <w:color w:val="auto"/>
-          <w:spacing w:val="-3"/>
-          <w:kern w:val="4"/>
-          <w:sz w:val="21"/>
-          <w:szCs w:val="21"/>
-          <w:lang w:val="en-US" w:eastAsia="zh-CN"/>
-        </w:rPr>
-        <w:t>‌</w:t>
-      </w:r>
-      <w:r>
-        <w:rPr>
-          <w:rFonts w:hint="default" w:ascii="楷体" w:hAnsi="楷体" w:eastAsia="楷体" w:cs="楷体"/>
-          <w:b/>
-          <w:bCs/>
-          <w:color w:val="auto"/>
-          <w:spacing w:val="-3"/>
-          <w:kern w:val="4"/>
-          <w:sz w:val="21"/>
-          <w:szCs w:val="21"/>
-          <w:lang w:val="en-US" w:eastAsia="zh-CN"/>
-        </w:rPr>
-        <w:t>中国机器人及人工智能大赛</w:t>
-      </w:r>
-      <w:r>
-        <w:rPr>
-          <w:rFonts w:hint="eastAsia" w:ascii="楷体" w:hAnsi="楷体" w:eastAsia="楷体" w:cs="楷体"/>
-          <w:b/>
-          <w:bCs/>
-          <w:color w:val="auto"/>
-          <w:spacing w:val="-3"/>
-          <w:kern w:val="4"/>
-          <w:sz w:val="21"/>
-          <w:szCs w:val="21"/>
-          <w:lang w:val="en-US" w:eastAsia="zh-CN"/>
-        </w:rPr>
-        <w:t>（机器人创新赛）</w:t>
-      </w:r>
-      <w:r>
-        <w:rPr>
-          <w:rFonts w:hint="eastAsia" w:ascii="楷体" w:hAnsi="楷体" w:eastAsia="楷体" w:cs="楷体"/>
-          <w:b/>
-          <w:bCs/>
-          <w:color w:val="auto"/>
-          <w:spacing w:val="-3"/>
-          <w:kern w:val="4"/>
-          <w:sz w:val="21"/>
-          <w:szCs w:val="21"/>
-          <w:lang w:val="en-US" w:eastAsia="zh-CN"/>
-        </w:rPr>
-        <w:tab/>
-      </w:r>
-      <w:r>
-        <w:rPr>
-          <w:rFonts w:hint="eastAsia" w:ascii="楷体" w:hAnsi="楷体" w:eastAsia="楷体" w:cs="楷体"/>
-          <w:b/>
-          <w:bCs/>
-          <w:color w:val="auto"/>
-          <w:spacing w:val="-3"/>
-          <w:kern w:val="4"/>
-          <w:sz w:val="21"/>
-          <w:szCs w:val="21"/>
-          <w:lang w:val="en-US" w:eastAsia="zh-CN"/>
-        </w:rPr>
-        <w:t>国家级二等奖</w:t>
-      </w:r>
-      <w:bookmarkStart w:id="2" w:name="_GoBack"/>
-      <w:bookmarkEnd w:id="2"/>
-      <w:r>
-        <w:rPr>
-          <w:rFonts w:hint="eastAsia" w:ascii="楷体" w:hAnsi="楷体" w:eastAsia="楷体" w:cs="楷体"/>
-          <w:b/>
-          <w:bCs/>
-          <w:color w:val="auto"/>
-          <w:spacing w:val="-3"/>
-          <w:kern w:val="4"/>
-          <w:sz w:val="21"/>
-          <w:szCs w:val="21"/>
-          <w:lang w:val="en-US" w:eastAsia="zh-CN"/>
-        </w:rPr>
-        <w:tab/>
-      </w:r>
-      <w:r>
-        <w:rPr>
-          <w:rFonts w:hint="eastAsia" w:ascii="楷体" w:hAnsi="楷体" w:eastAsia="楷体" w:cs="楷体"/>
-          <w:b/>
-          <w:bCs/>
-          <w:color w:val="auto"/>
-          <w:spacing w:val="-3"/>
-          <w:kern w:val="4"/>
-          <w:sz w:val="21"/>
-          <w:szCs w:val="21"/>
-          <w:lang w:val="en-US" w:eastAsia="zh-CN"/>
-        </w:rPr>
-        <w:t>队长</w:t>
-      </w:r>
-    </w:p>
-    <w:p>
-      <w:pPr>
         <w:pStyle w:val="3"/>
         <w:keepNext w:val="0"/>
         <w:keepLines w:val="0"/>
@@ -5007,6 +4837,8 @@
           <w:lang w:val="en-US" w:eastAsia="zh-CN" w:bidi="ar-SA"/>
         </w:rPr>
       </w:pPr>
+      <w:bookmarkStart w:id="2" w:name="_GoBack"/>
+      <w:bookmarkEnd w:id="2"/>
       <w:r>
         <w:rPr>
           <w:rFonts w:hint="eastAsia" w:ascii="楷体" w:hAnsi="楷体" w:eastAsia="楷体" w:cs="楷体"/>

</xml_diff>

<commit_message>
Add China Robotics & AI Competition, update news to include both awards
</commit_message>
<xml_diff>
--- a/file/CV_CN_all.docx
+++ b/file/CV_CN_all.docx
@@ -4804,6 +4804,159 @@
     </w:p>
     <w:p>
       <w:pPr>
+        <w:pStyle w:val="14"/>
+        <w:keepNext w:val="0"/>
+        <w:keepLines w:val="0"/>
+        <w:pageBreakBefore w:val="0"/>
+        <w:widowControl w:val="0"/>
+        <w:numPr>
+          <w:ilvl w:val="0"/>
+          <w:numId w:val="1"/>
+        </w:numPr>
+        <w:tabs>
+          <w:tab w:val="left" w:pos="395"/>
+          <w:tab w:val="left" w:pos="2420"/>
+          <w:tab w:val="left" w:pos="2640"/>
+          <w:tab w:val="left" w:pos="5940"/>
+          <w:tab w:val="left" w:pos="7260"/>
+          <w:tab w:val="left" w:pos="10120"/>
+        </w:tabs>
+        <w:kinsoku/>
+        <w:wordWrap/>
+        <w:overflowPunct/>
+        <w:topLinePunct w:val="0"/>
+        <w:autoSpaceDE w:val="0"/>
+        <w:autoSpaceDN w:val="0"/>
+        <w:bidi w:val="0"/>
+        <w:adjustRightInd/>
+        <w:snapToGrid/>
+        <w:spacing w:line="240" w:lineRule="auto"/>
+        <w:ind w:left="391" w:hanging="193"/>
+        <w:textAlignment w:val="auto"/>
+        <w:rPr>
+          <w:rFonts w:hint="eastAsia" w:ascii="楷体" w:hAnsi="楷体" w:eastAsia="楷体" w:cs="楷体"/>
+          <w:b w:val="0"/>
+          <w:bCs w:val="0"/>
+          <w:spacing w:val="-6"/>
+          <w:kern w:val="2"/>
+          <w:sz w:val="21"/>
+          <w:szCs w:val="21"/>
+          <w:lang w:val="en-US" w:eastAsia="zh-CN" w:bidi="ar-SA"/>
+        </w:rPr>
+      </w:pPr>
+      <w:r>
+        <w:rPr>
+          <w:rFonts w:hint="eastAsia" w:ascii="Times New Roman" w:hAnsi="Times New Roman" w:eastAsia="楷体" w:cs="Times New Roman"/>
+          <w:b/>
+          <w:bCs/>
+          <w:color w:val="auto"/>
+          <w:spacing w:val="-3"/>
+          <w:kern w:val="4"/>
+          <w:sz w:val="21"/>
+          <w:szCs w:val="21"/>
+          <w:lang w:val="en-US" w:eastAsia="zh-CN"/>
+        </w:rPr>
+        <w:t>2026.07</w:t>
+      </w:r>
+      <w:r>
+        <w:rPr>
+          <w:rFonts w:hint="eastAsia" w:ascii="Times New Roman" w:hAnsi="Times New Roman" w:eastAsia="楷体"/>
+          <w:b/>
+          <w:bCs/>
+          <w:color w:val="auto"/>
+          <w:w w:val="105"/>
+          <w:sz w:val="21"/>
+          <w:szCs w:val="21"/>
+          <w:lang w:val="en-US" w:eastAsia="zh-CN"/>
+        </w:rPr>
+        <w:tab/>
+      </w:r>
+      <w:r>
+        <w:rPr>
+          <w:rFonts w:hint="eastAsia" w:ascii="楷体" w:hAnsi="楷体" w:eastAsia="楷体" w:cs="楷体"/>
+          <w:b/>
+          <w:bCs/>
+          <w:color w:val="auto"/>
+          <w:spacing w:val="-3"/>
+          <w:kern w:val="4"/>
+          <w:sz w:val="21"/>
+          <w:szCs w:val="21"/>
+          <w:lang w:val="en-US" w:eastAsia="zh-CN"/>
+        </w:rPr>
+        <w:t>中国机器人及人工智能大赛</w:t>
+      </w:r>
+      <w:r>
+        <w:rPr>
+          <w:rFonts w:hint="eastAsia" w:ascii="楷体" w:hAnsi="楷体" w:eastAsia="楷体" w:cs="楷体"/>
+          <w:b/>
+          <w:bCs/>
+          <w:color w:val="auto"/>
+          <w:spacing w:val="-3"/>
+          <w:kern w:val="4"/>
+          <w:sz w:val="21"/>
+          <w:szCs w:val="21"/>
+          <w:lang w:val="en-US" w:eastAsia="zh-CN"/>
+        </w:rPr>
+        <w:tab/>
+      </w:r>
+      <w:r>
+        <w:rPr>
+          <w:rFonts w:hint="eastAsia" w:ascii="Times New Roman" w:hAnsi="Times New Roman" w:eastAsia="楷体"/>
+          <w:b/>
+          <w:bCs/>
+          <w:color w:val="auto"/>
+          <w:w w:val="105"/>
+          <w:sz w:val="21"/>
+          <w:szCs w:val="21"/>
+          <w:lang w:val="en-US" w:eastAsia="zh-CN"/>
+        </w:rPr>
+        <w:tab/>
+      </w:r>
+      <w:r>
+        <w:rPr>
+          <w:rFonts w:hint="eastAsia" w:ascii="楷体" w:hAnsi="楷体" w:eastAsia="楷体" w:cs="楷体"/>
+          <w:b/>
+          <w:bCs/>
+          <w:color w:val="auto"/>
+          <w:spacing w:val="-3"/>
+          <w:kern w:val="4"/>
+          <w:sz w:val="21"/>
+          <w:szCs w:val="21"/>
+          <w:lang w:val="en-US" w:eastAsia="zh-CN"/>
+        </w:rPr>
+        <w:t>国家级二等奖</w:t>
+      </w:r>
+      <w:r>
+        <w:rPr>
+          <w:rFonts w:hint="eastAsia" w:ascii="楷体" w:hAnsi="楷体" w:eastAsia="楷体" w:cs="楷体"/>
+          <w:b/>
+          <w:bCs/>
+          <w:color w:val="auto"/>
+          <w:spacing w:val="-3"/>
+          <w:kern w:val="4"/>
+          <w:sz w:val="21"/>
+          <w:szCs w:val="21"/>
+          <w:lang w:val="en-US" w:eastAsia="zh-CN"/>
+        </w:rPr>
+        <w:tab/>
+      </w:r>
+      <w:r>
+        <w:rPr>
+          <w:rFonts w:hint="eastAsia" w:ascii="楷体" w:hAnsi="楷体" w:eastAsia="楷体" w:cs="楷体"/>
+          <w:b/>
+          <w:bCs/>
+          <w:color w:val="auto"/>
+          <w:spacing w:val="-3"/>
+          <w:kern w:val="4"/>
+          <w:sz w:val="21"/>
+          <w:szCs w:val="21"/>
+          <w:lang w:val="en-US" w:eastAsia="zh-CN"/>
+        </w:rPr>
+        <w:t>队长</w:t>
+      </w:r>
+    </w:p>
+    <w:p>
+      <w:pPr>
         <w:pStyle w:val="3"/>
         <w:keepNext w:val="0"/>
         <w:keepLines w:val="0"/>
@@ -4837,22 +4990,22 @@
           <w:lang w:val="en-US" w:eastAsia="zh-CN" w:bidi="ar-SA"/>
         </w:rPr>
       </w:pPr>
+      <w:r>
+        <w:rPr>
+          <w:rFonts w:hint="eastAsia" w:ascii="楷体" w:hAnsi="楷体" w:eastAsia="楷体" w:cs="楷体"/>
+          <w:b/>
+          <w:bCs/>
+          <w:color w:val="auto"/>
+          <w:spacing w:val="-3"/>
+          <w:kern w:val="4"/>
+          <w:sz w:val="21"/>
+          <w:szCs w:val="21"/>
+          <w:lang w:val="en-US" w:eastAsia="zh-CN" w:bidi="ar-SA"/>
+        </w:rPr>
+        <w:t>区域级/省级获奖</w:t>
+      </w:r>
       <w:bookmarkStart w:id="2" w:name="_GoBack"/>
       <w:bookmarkEnd w:id="2"/>
-      <w:r>
-        <w:rPr>
-          <w:rFonts w:hint="eastAsia" w:ascii="楷体" w:hAnsi="楷体" w:eastAsia="楷体" w:cs="楷体"/>
-          <w:b/>
-          <w:bCs/>
-          <w:color w:val="auto"/>
-          <w:spacing w:val="-3"/>
-          <w:kern w:val="4"/>
-          <w:sz w:val="21"/>
-          <w:szCs w:val="21"/>
-          <w:lang w:val="en-US" w:eastAsia="zh-CN" w:bidi="ar-SA"/>
-        </w:rPr>
-        <w:t>区域级/省级获奖</w:t>
-      </w:r>
     </w:p>
     <w:p>
       <w:pPr>
@@ -5642,21 +5795,7 @@
           <w:szCs w:val="21"/>
           <w:lang w:val="en-US" w:eastAsia="zh-CN" w:bidi="ar-SA"/>
         </w:rPr>
-        <w:t>（</w:t>
-      </w:r>
-      <w:r>
-        <w:rPr>
-          <w:rFonts w:hint="eastAsia" w:ascii="Times New Roman" w:hAnsi="Times New Roman" w:eastAsia="楷体" w:cs="Times New Roman"/>
-          <w:b w:val="0"/>
-          <w:bCs w:val="0"/>
-          <w:color w:val="auto"/>
-          <w:spacing w:val="-3"/>
-          <w:kern w:val="4"/>
-          <w:sz w:val="21"/>
-          <w:szCs w:val="21"/>
-          <w:lang w:val="en-US" w:eastAsia="zh-CN" w:bidi="ar-SA"/>
-        </w:rPr>
-        <w:t>2024-2025）</w:t>
+        <w:t>（2024-2025）</w:t>
       </w:r>
       <w:r>
         <w:rPr>

</xml_diff>